<commit_message>
The handout, finished: nothing left to fill in, my hardware and what I've spent, and how to reach me
</commit_message>
<xml_diff>
--- a/handout/OpenBrain-Handout.docx
+++ b/handout/OpenBrain-Handout.docx
@@ -6055,7 +6055,7 @@
           <w:sz-cs w:val="25"/>
           <w:spacing w:val="0"/>
         </w:rPr>
-        <w:t xml:space="preserve">: a DevKit running a month in a home that is not the developer's. That is the test one person cannot run alone.</w:t>
+        <w:t xml:space="preserve">: a DevKit running a month in a home that isn't mine. That's the test I can't run alone.</w:t>
       </w:r>
       <w:r>
         <w:rPr>
@@ -6654,53 +6654,18 @@
       </w:r>
     </w:p>
     <w:p>
-      <w:pPr/>
-      <w:r>
-        <w:rPr>
-          <w:rFonts w:ascii="Helvetica Neue" w:hAnsi="Helvetica Neue" w:cs="Helvetica Neue"/>
-          <w:sz w:val="20"/>
-          <w:sz-cs w:val="20"/>
-          <w:b/>
-          <w:spacing w:val="0"/>
-          <w:color w:val="FFFFFF"/>
-        </w:rPr>
-        <w:t xml:space="preserve">OWNER TO COMPLETE</w:t>
-      </w:r>
-      <w:r>
-        <w:rPr>
-          <w:rFonts w:ascii="Helvetica Neue" w:hAnsi="Helvetica Neue" w:cs="Helvetica Neue"/>
-          <w:sz w:val="23"/>
-          <w:sz-cs w:val="23"/>
-          <w:spacing w:val="0"/>
-        </w:rPr>
-        <w:t xml:space="preserve"/>
-      </w:r>
-    </w:p>
-    <w:p>
       <w:pPr>
-        <w:spacing w:after="181"/>
+        <w:spacing w:after="158"/>
       </w:pPr>
       <w:r>
         <w:rPr>
           <w:rFonts w:ascii="Helvetica Neue" w:hAnsi="Helvetica Neue" w:cs="Helvetica Neue"/>
-          <w:sz w:val="23"/>
-          <w:sz-cs w:val="23"/>
-          <w:spacing w:val="0"/>
-        </w:rPr>
-        <w:t xml:space="preserve">When you started, and what pulled you into this. Your own history, one line.</w:t>
-      </w:r>
-      <w:r>
-        <w:rPr>
-          <w:rFonts w:ascii="Helvetica Neue" w:hAnsi="Helvetica Neue" w:cs="Helvetica Neue"/>
-          <w:sz w:val="23"/>
-          <w:sz-cs w:val="23"/>
-          <w:spacing w:val="0"/>
-        </w:rPr>
-        <w:t xml:space="preserve"/>
-      </w:r>
-    </w:p>
-    <w:p>
-      <w:pPr/>
+          <w:sz w:val="25"/>
+          <w:sz-cs w:val="25"/>
+          <w:spacing w:val="0"/>
+        </w:rPr>
+        <w:t xml:space="preserve">I have been building this on my own for about three years, and the Astral engine has been the centre of it since spring.</w:t>
+      </w:r>
       <w:r>
         <w:rPr>
           <w:rFonts w:ascii="Helvetica Neue" w:hAnsi="Helvetica Neue" w:cs="Helvetica Neue"/>
@@ -6885,36 +6850,13 @@
           <w:sz-cs w:val="25"/>
           <w:spacing w:val="0"/>
         </w:rPr>
-        <w:t xml:space="preserve">Adapters have been trained; a from-scratch pretrain is running for the component that may only propose, never answer.</w:t>
-      </w:r>
-      <w:r>
-        <w:rPr>
-          <w:rFonts w:ascii="Helvetica Neue" w:hAnsi="Helvetica Neue" w:cs="Helvetica Neue"/>
-          <w:sz w:val="25"/>
-          <w:sz-cs w:val="25"/>
-          <w:spacing w:val="0"/>
-        </w:rPr>
-        <w:t xml:space="preserve"/>
-      </w:r>
-    </w:p>
-    <w:p>
-      <w:pPr/>
-      <w:r>
-        <w:rPr>
-          <w:rFonts w:ascii="Helvetica Neue" w:hAnsi="Helvetica Neue" w:cs="Helvetica Neue"/>
-          <w:sz w:val="20"/>
-          <w:sz-cs w:val="20"/>
-          <w:b/>
-          <w:spacing w:val="0"/>
-          <w:color w:val="FFFFFF"/>
-        </w:rPr>
-        <w:t xml:space="preserve">OWNER TO COMPLETE</w:t>
-      </w:r>
-      <w:r>
-        <w:rPr>
-          <w:rFonts w:ascii="Helvetica Neue" w:hAnsi="Helvetica Neue" w:cs="Helvetica Neue"/>
-          <w:sz w:val="23"/>
-          <w:sz-cs w:val="23"/>
+        <w:t xml:space="preserve">Two of my fine-tuned models already run, a role-tuned 4B in July and a behaviour-tuned 0.8B in August. A from-scratch transformer I call the subconscious is 34,000 steps into pretraining on the Mac mini, and it is the component that may only propose, never answer.</w:t>
+      </w:r>
+      <w:r>
+        <w:rPr>
+          <w:rFonts w:ascii="Helvetica Neue" w:hAnsi="Helvetica Neue" w:cs="Helvetica Neue"/>
+          <w:sz w:val="25"/>
+          <w:sz-cs w:val="25"/>
           <w:spacing w:val="0"/>
         </w:rPr>
         <w:t xml:space="preserve"/>
@@ -6922,96 +6864,17 @@
     </w:p>
     <w:p>
       <w:pPr>
-        <w:spacing w:after="181"/>
+        <w:spacing w:after="158"/>
       </w:pPr>
       <w:r>
         <w:rPr>
           <w:rFonts w:ascii="Helvetica Neue" w:hAnsi="Helvetica Neue" w:cs="Helvetica Neue"/>
-          <w:sz w:val="23"/>
-          <w:sz-cs w:val="23"/>
-          <w:b/>
-          <w:spacing w:val="0"/>
-        </w:rPr>
-        <w:t xml:space="preserve">a.</w:t>
-      </w:r>
-      <w:r>
-        <w:rPr>
-          <w:rFonts w:ascii="Helvetica Neue" w:hAnsi="Helvetica Neue" w:cs="Helvetica Neue"/>
-          <w:sz w:val="23"/>
-          <w:sz-cs w:val="23"/>
-          <w:spacing w:val="0"/>
-        </w:rPr>
-        <w:t xml:space="preserve"> What the custom transformer and inference work does: architecture, objective, purpose. Two sentences.</w:t>
-      </w:r>
-      <w:r>
-        <w:rPr>
-          <w:rFonts w:ascii="Helvetica Neue" w:hAnsi="Helvetica Neue" w:cs="Helvetica Neue"/>
-          <w:sz w:val="23"/>
-          <w:sz-cs w:val="23"/>
-          <w:spacing w:val="0"/>
-        </w:rPr>
-        <w:t xml:space="preserve"/>
-      </w:r>
-    </w:p>
-    <w:p>
-      <w:pPr/>
-      <w:r>
-        <w:rPr>
-          <w:rFonts w:ascii="Helvetica Neue" w:hAnsi="Helvetica Neue" w:cs="Helvetica Neue"/>
-          <w:sz w:val="25"/>
-          <w:sz-cs w:val="25"/>
-          <w:spacing w:val="0"/>
-        </w:rPr>
-        <w:t xml:space="preserve"/>
-      </w:r>
-    </w:p>
-    <w:p>
-      <w:pPr/>
-      <w:r>
-        <w:rPr>
-          <w:rFonts w:ascii="Helvetica Neue" w:hAnsi="Helvetica Neue" w:cs="Helvetica Neue"/>
-          <w:sz w:val="25"/>
-          <w:sz-cs w:val="25"/>
-          <w:spacing w:val="0"/>
-        </w:rPr>
-        <w:t xml:space="preserve"/>
-      </w:r>
-    </w:p>
-    <w:p>
-      <w:pPr>
-        <w:spacing w:after="181"/>
-      </w:pPr>
-      <w:r>
-        <w:rPr>
-          <w:rFonts w:ascii="Helvetica Neue" w:hAnsi="Helvetica Neue" w:cs="Helvetica Neue"/>
-          <w:sz w:val="23"/>
-          <w:sz-cs w:val="23"/>
-          <w:b/>
-          <w:spacing w:val="0"/>
-        </w:rPr>
-        <w:t xml:space="preserve">b.</w:t>
-      </w:r>
-      <w:r>
-        <w:rPr>
-          <w:rFonts w:ascii="Helvetica Neue" w:hAnsi="Helvetica Neue" w:cs="Helvetica Neue"/>
-          <w:sz w:val="23"/>
-          <w:sz-cs w:val="23"/>
-          <w:spacing w:val="0"/>
-        </w:rPr>
-        <w:t xml:space="preserve"> The machines you own, what each is doing today, and which one is the bottleneck.</w:t>
-      </w:r>
-      <w:r>
-        <w:rPr>
-          <w:rFonts w:ascii="Helvetica Neue" w:hAnsi="Helvetica Neue" w:cs="Helvetica Neue"/>
-          <w:sz w:val="23"/>
-          <w:sz-cs w:val="23"/>
-          <w:spacing w:val="0"/>
-        </w:rPr>
-        <w:t xml:space="preserve"/>
-      </w:r>
-    </w:p>
-    <w:p>
-      <w:pPr/>
+          <w:sz w:val="25"/>
+          <w:sz-cs w:val="25"/>
+          <w:spacing w:val="0"/>
+        </w:rPr>
+        <w:t xml:space="preserve">I train on a 16 GB M4 Mac mini that panics when its swap fills, a Linux box with 23 GB of RAM, an RTX 2060 with 6 GB that cannot hold a training run, and an RX 580. The training lane is the bottleneck in all of it.</w:t>
+      </w:r>
       <w:r>
         <w:rPr>
           <w:rFonts w:ascii="Helvetica Neue" w:hAnsi="Helvetica Neue" w:cs="Helvetica Neue"/>
@@ -9663,7 +9526,7 @@
           <w:b/>
           <w:spacing w:val="0"/>
         </w:rPr>
-        <w:t xml:space="preserve">The machine</w:t>
+        <w:t xml:space="preserve">Where I'm building from today</w:t>
       </w:r>
       <w:r>
         <w:rPr>
@@ -9687,13 +9550,38 @@
           <w:sz-cs w:val="25"/>
           <w:spacing w:val="0"/>
         </w:rPr>
-        <w:t xml:space="preserve">The single purchase that changes what I can do is a Minisforum MS-S1 MAX in the 128 GB unified-memory edition: an AMD Ryzen AI Max+ 395, Radeon 8060S graphics, a 2 TB SSD and dual 10 GbE. It is $3,799 on the maker's store today and $4,749 at list, and a Mac Studio at the same level does the same job.</w:t>
-      </w:r>
-      <w:r>
-        <w:rPr>
-          <w:rFonts w:ascii="Helvetica Neue" w:hAnsi="Helvetica Neue" w:cs="Helvetica Neue"/>
-          <w:sz w:val="25"/>
-          <w:sz-cs w:val="25"/>
+        <w:t xml:space="preserve">I built everything here on hardware I already owned and paid for myself: a 16 GB M4 Mac mini that panics when its swap fills, a second Linux box with 23 GB of RAM, an RTX 2060 with 6 GB that cannot hold a training run, an RX 580, and the DevKit. Over the last one to three years I have spent about $10,000 on this work in total, all out of pocket, most of it renting compute I would rather own. Two fine-tuned models of mine already run, a role-tuned 4B in July and a behaviour-tuned 0.8B in August, and a from-scratch transformer I call the subconscious is 34,000 steps into pretraining on the Mac mini. I'm a student with no income. That is the ceiling the machine removes.</w:t>
+      </w:r>
+      <w:r>
+        <w:rPr>
+          <w:rFonts w:ascii="Helvetica Neue" w:hAnsi="Helvetica Neue" w:cs="Helvetica Neue"/>
+          <w:sz w:val="25"/>
+          <w:sz-cs w:val="25"/>
+          <w:spacing w:val="0"/>
+        </w:rPr>
+        <w:t xml:space="preserve"/>
+      </w:r>
+    </w:p>
+    <w:p>
+      <w:pPr>
+        <w:spacing w:after="60"/>
+      </w:pPr>
+      <w:r>
+        <w:rPr>
+          <w:rFonts w:ascii="Helvetica Neue" w:hAnsi="Helvetica Neue" w:cs="Helvetica Neue"/>
+          <w:sz w:val="26"/>
+          <w:sz-cs w:val="26"/>
+          <w:b/>
+          <w:spacing w:val="0"/>
+        </w:rPr>
+        <w:t xml:space="preserve">The machine</w:t>
+      </w:r>
+      <w:r>
+        <w:rPr>
+          <w:rFonts w:ascii="Helvetica Neue" w:hAnsi="Helvetica Neue" w:cs="Helvetica Neue"/>
+          <w:sz w:val="26"/>
+          <w:sz-cs w:val="26"/>
+          <w:b/>
           <w:spacing w:val="0"/>
         </w:rPr>
         <w:t xml:space="preserve"/>
@@ -9710,6 +9598,29 @@
           <w:sz-cs w:val="25"/>
           <w:spacing w:val="0"/>
         </w:rPr>
+        <w:t xml:space="preserve">The single purchase that changes what I can do is a Minisforum MS-S1 MAX in the 128 GB unified-memory edition: an AMD Ryzen AI Max+ 395, Radeon 8060S graphics, a 2 TB SSD and dual 10 GbE. It is $3,799 on the maker's store today and $4,749 at list, and a Mac Studio at the same level does the same job.</w:t>
+      </w:r>
+      <w:r>
+        <w:rPr>
+          <w:rFonts w:ascii="Helvetica Neue" w:hAnsi="Helvetica Neue" w:cs="Helvetica Neue"/>
+          <w:sz w:val="25"/>
+          <w:sz-cs w:val="25"/>
+          <w:spacing w:val="0"/>
+        </w:rPr>
+        <w:t xml:space="preserve"/>
+      </w:r>
+    </w:p>
+    <w:p>
+      <w:pPr>
+        <w:spacing w:after="158"/>
+      </w:pPr>
+      <w:r>
+        <w:rPr>
+          <w:rFonts w:ascii="Helvetica Neue" w:hAnsi="Helvetica Neue" w:cs="Helvetica Neue"/>
+          <w:sz w:val="25"/>
+          <w:sz-cs w:val="25"/>
+          <w:spacing w:val="0"/>
+        </w:rPr>
         <w:t xml:space="preserve">Memory the GPU can use is the point. 128 GB holds a 70-billion-parameter model quantised, so I can train and run the comprehension tier at home. The same machine builds the library index in minutes instead of hours on the Pi, and it serves as the LAN rung for milestone 2.</w:t>
       </w:r>
       <w:r>
@@ -9723,32 +9634,19 @@
       </w:r>
     </w:p>
     <w:p>
-      <w:pPr/>
-      <w:r>
-        <w:rPr>
-          <w:rFonts w:ascii="Helvetica Neue" w:hAnsi="Helvetica Neue" w:cs="Helvetica Neue"/>
-          <w:sz w:val="20"/>
-          <w:sz-cs w:val="20"/>
-          <w:b/>
-          <w:spacing w:val="0"/>
-          <w:color w:val="FFFFFF"/>
-        </w:rPr>
-        <w:t xml:space="preserve">OWNER TO COMPLETE</w:t>
-      </w:r>
+      <w:pPr>
+        <w:spacing w:after="158"/>
+      </w:pPr>
       <w:r>
         <w:rPr>
           <w:rFonts w:ascii="Helvetica Neue" w:hAnsi="Helvetica Neue" w:cs="Helvetica Neue"/>
           <w:sz w:val="23"/>
           <w:sz-cs w:val="23"/>
-          <w:spacing w:val="0"/>
-        </w:rPr>
-        <w:t xml:space="preserve"/>
-      </w:r>
-    </w:p>
-    <w:p>
-      <w:pPr>
-        <w:spacing w:after="181"/>
-      </w:pPr>
+          <w:b/>
+          <w:spacing w:val="0"/>
+        </w:rPr>
+        <w:t xml:space="preserve">How long this has taken.</w:t>
+      </w:r>
       <w:r>
         <w:rPr>
           <w:rFonts w:ascii="Helvetica Neue" w:hAnsi="Helvetica Neue" w:cs="Helvetica Neue"/>
@@ -9756,25 +9654,13 @@
           <w:sz-cs w:val="23"/>
           <w:spacing w:val="0"/>
         </w:rPr>
-        <w:t xml:space="preserve">How long this has taken, in one sentence.</w:t>
+        <w:t xml:space="preserve"> About three years of research on my own, the Astral engine since spring, and the OpenHome work over the last month.</w:t>
       </w:r>
       <w:r>
         <w:rPr>
           <w:rFonts w:ascii="Helvetica Neue" w:hAnsi="Helvetica Neue" w:cs="Helvetica Neue"/>
           <w:sz w:val="23"/>
           <w:sz-cs w:val="23"/>
-          <w:spacing w:val="0"/>
-        </w:rPr>
-        <w:t xml:space="preserve"/>
-      </w:r>
-    </w:p>
-    <w:p>
-      <w:pPr/>
-      <w:r>
-        <w:rPr>
-          <w:rFonts w:ascii="Helvetica Neue" w:hAnsi="Helvetica Neue" w:cs="Helvetica Neue"/>
-          <w:sz w:val="25"/>
-          <w:sz-cs w:val="25"/>
           <w:spacing w:val="0"/>
         </w:rPr>
         <w:t xml:space="preserve"/>
@@ -10597,53 +10483,43 @@
       </w:r>
     </w:p>
     <w:p>
-      <w:pPr/>
-      <w:r>
-        <w:rPr>
-          <w:rFonts w:ascii="Helvetica Neue" w:hAnsi="Helvetica Neue" w:cs="Helvetica Neue"/>
-          <w:sz w:val="20"/>
-          <w:sz-cs w:val="20"/>
-          <w:b/>
-          <w:spacing w:val="0"/>
-          <w:color w:val="FFFFFF"/>
-        </w:rPr>
-        <w:t xml:space="preserve">OWNER TO COMPLETE</w:t>
-      </w:r>
-      <w:r>
-        <w:rPr>
-          <w:rFonts w:ascii="Helvetica Neue" w:hAnsi="Helvetica Neue" w:cs="Helvetica Neue"/>
-          <w:sz w:val="23"/>
-          <w:sz-cs w:val="23"/>
-          <w:spacing w:val="0"/>
-        </w:rPr>
-        <w:t xml:space="preserve"/>
-      </w:r>
-    </w:p>
-    <w:p>
       <w:pPr>
-        <w:spacing w:after="181"/>
+        <w:spacing w:after="60"/>
       </w:pPr>
       <w:r>
         <w:rPr>
           <w:rFonts w:ascii="Helvetica Neue" w:hAnsi="Helvetica Neue" w:cs="Helvetica Neue"/>
-          <w:sz w:val="23"/>
-          <w:sz-cs w:val="23"/>
-          <w:spacing w:val="0"/>
-        </w:rPr>
-        <w:t xml:space="preserve">Who, if anyone, you would bring in on a funded scope.</w:t>
-      </w:r>
-      <w:r>
-        <w:rPr>
-          <w:rFonts w:ascii="Helvetica Neue" w:hAnsi="Helvetica Neue" w:cs="Helvetica Neue"/>
-          <w:sz w:val="23"/>
-          <w:sz-cs w:val="23"/>
-          <w:spacing w:val="0"/>
-        </w:rPr>
-        <w:t xml:space="preserve"/>
-      </w:r>
-    </w:p>
-    <w:p>
-      <w:pPr/>
+          <w:sz w:val="26"/>
+          <w:sz-cs w:val="26"/>
+          <w:b/>
+          <w:spacing w:val="0"/>
+        </w:rPr>
+        <w:t xml:space="preserve">Who is on it</w:t>
+      </w:r>
+      <w:r>
+        <w:rPr>
+          <w:rFonts w:ascii="Helvetica Neue" w:hAnsi="Helvetica Neue" w:cs="Helvetica Neue"/>
+          <w:sz w:val="26"/>
+          <w:sz-cs w:val="26"/>
+          <w:b/>
+          <w:spacing w:val="0"/>
+        </w:rPr>
+        <w:t xml:space="preserve"/>
+      </w:r>
+    </w:p>
+    <w:p>
+      <w:pPr>
+        <w:spacing w:after="158"/>
+      </w:pPr>
+      <w:r>
+        <w:rPr>
+          <w:rFonts w:ascii="Helvetica Neue" w:hAnsi="Helvetica Neue" w:cs="Helvetica Neue"/>
+          <w:sz w:val="25"/>
+          <w:sz-cs w:val="25"/>
+          <w:spacing w:val="0"/>
+        </w:rPr>
+        <w:t xml:space="preserve">Me. At the full amount I'd bring in part-time help for packaging and review so milestone 1 lands in weeks.</w:t>
+      </w:r>
       <w:r>
         <w:rPr>
           <w:rFonts w:ascii="Helvetica Neue" w:hAnsi="Helvetica Neue" w:cs="Helvetica Neue"/>
@@ -16249,7 +16125,7 @@
     </w:p>
     <w:p>
       <w:pPr>
-        <w:spacing w:after="188"/>
+        <w:spacing w:after="90"/>
       </w:pPr>
       <w:r>
         <w:rPr>
@@ -16268,19 +16144,17 @@
           <w:spacing w:val="0"/>
         </w:rPr>
         <w:t xml:space="preserve"/>
-      </w:r>
-    </w:p>
-    <w:p>
-      <w:pPr/>
+        <w:br/>
+        <w:t xml:space="preserve"/>
+      </w:r>
       <w:r>
         <w:rPr>
           <w:rFonts w:ascii="Helvetica Neue" w:hAnsi="Helvetica Neue" w:cs="Helvetica Neue"/>
           <w:sz w:val="23"/>
           <w:sz-cs w:val="23"/>
           <w:spacing w:val="0"/>
-          <w:color w:val="393939"/>
-        </w:rPr>
-        <w:t xml:space="preserve">Repository / project URL</w:t>
+        </w:rPr>
+        <w:t xml:space="preserve">+1 253 392 9204</w:t>
       </w:r>
       <w:r>
         <w:rPr>
@@ -16288,34 +16162,22 @@
           <w:sz w:val="23"/>
           <w:sz-cs w:val="23"/>
           <w:spacing w:val="0"/>
-          <w:color w:val="393939"/>
-        </w:rPr>
-        <w:t xml:space="preserve"/>
-      </w:r>
-    </w:p>
-    <w:p>
-      <w:pPr/>
-      <w:r>
-        <w:rPr>
-          <w:rFonts w:ascii="Helvetica Neue" w:hAnsi="Helvetica Neue" w:cs="Helvetica Neue"/>
-          <w:sz w:val="25"/>
-          <w:sz-cs w:val="25"/>
-          <w:spacing w:val="0"/>
-        </w:rPr>
-        <w:t xml:space="preserve"/>
-      </w:r>
-    </w:p>
-    <w:p>
-      <w:pPr/>
-      <w:r>
-        <w:rPr>
-          <w:rFonts w:ascii="Helvetica Neue" w:hAnsi="Helvetica Neue" w:cs="Helvetica Neue"/>
+        </w:rPr>
+        <w:t xml:space="preserve"/>
+      </w:r>
+    </w:p>
+    <w:p>
+      <w:pPr>
+        <w:spacing w:after="90"/>
+      </w:pPr>
+      <w:r>
+        <w:rPr>
+          <w:rFonts w:ascii="Menlo" w:hAnsi="Menlo" w:cs="Menlo"/>
           <w:sz w:val="23"/>
           <w:sz-cs w:val="23"/>
           <w:spacing w:val="0"/>
-          <w:color w:val="393939"/>
-        </w:rPr>
-        <w:t xml:space="preserve">Phone</w:t>
+        </w:rPr>
+        <w:t xml:space="preserve">https://github.com/Jmesmykil</w:t>
       </w:r>
       <w:r>
         <w:rPr>
@@ -16323,18 +16185,26 @@
           <w:sz w:val="23"/>
           <w:sz-cs w:val="23"/>
           <w:spacing w:val="0"/>
-          <w:color w:val="393939"/>
-        </w:rPr>
-        <w:t xml:space="preserve"/>
-      </w:r>
-    </w:p>
-    <w:p>
-      <w:pPr/>
-      <w:r>
-        <w:rPr>
-          <w:rFonts w:ascii="Helvetica Neue" w:hAnsi="Helvetica Neue" w:cs="Helvetica Neue"/>
-          <w:sz w:val="25"/>
-          <w:sz-cs w:val="25"/>
+        </w:rPr>
+        <w:t xml:space="preserve"/>
+      </w:r>
+    </w:p>
+    <w:p>
+      <w:pPr/>
+      <w:r>
+        <w:rPr>
+          <w:rFonts w:ascii="Helvetica Neue" w:hAnsi="Helvetica Neue" w:cs="Helvetica Neue"/>
+          <w:sz w:val="23"/>
+          <w:sz-cs w:val="23"/>
+          <w:spacing w:val="0"/>
+        </w:rPr>
+        <w:t xml:space="preserve">I'm in the OpenHome Discord and in touch with your developer relations team.</w:t>
+      </w:r>
+      <w:r>
+        <w:rPr>
+          <w:rFonts w:ascii="Helvetica Neue" w:hAnsi="Helvetica Neue" w:cs="Helvetica Neue"/>
+          <w:sz w:val="23"/>
+          <w:sz-cs w:val="23"/>
           <w:spacing w:val="0"/>
         </w:rPr>
         <w:t xml:space="preserve"/>
@@ -16389,7 +16259,7 @@
           <w:sz-cs w:val="23"/>
           <w:spacing w:val="0"/>
         </w:rPr>
-        <w:t xml:space="preserve">Name which conversation this is: grant, sponsored integration, or a role.</w:t>
+        <w:t xml:space="preserve">Decide which conversation this is: grant, sponsored integration, or both.</w:t>
       </w:r>
       <w:r>
         <w:rPr>
@@ -16425,7 +16295,7 @@
           <w:sz-cs w:val="23"/>
           <w:spacing w:val="0"/>
         </w:rPr>
-        <w:t xml:space="preserve">Confirm a paid, milestone-based integration and its first date.</w:t>
+        <w:t xml:space="preserve">Agree the award level and the milestones it buys.</w:t>
       </w:r>
       <w:r>
         <w:rPr>
@@ -16461,7 +16331,7 @@
           <w:sz-cs w:val="23"/>
           <w:spacing w:val="0"/>
         </w:rPr>
-        <w:t xml:space="preserve">Register the trigger words on agent 595324, and decide the wake phrase.</w:t>
+        <w:t xml:space="preserve">Register the trigger words on agent 595324, and agree where the kernel wheel lives, PyPI or a release asset.</w:t>
       </w:r>
       <w:r>
         <w:rPr>
@@ -16497,7 +16367,7 @@
           <w:sz-cs w:val="23"/>
           <w:spacing w:val="0"/>
         </w:rPr>
-        <w:t xml:space="preserve">Say where the kernel wheel should live, so milestone three can start, and send review feedback on the MIT shim.</w:t>
+        <w:t xml:space="preserve">A second call once milestone 1 is installable from the catalogue.</w:t>
       </w:r>
       <w:r>
         <w:rPr>
@@ -16535,64 +16405,6 @@
           <w:rFonts w:ascii="Helvetica Neue" w:hAnsi="Helvetica Neue" w:cs="Helvetica Neue"/>
           <w:sz w:val="23"/>
           <w:sz-cs w:val="23"/>
-          <w:spacing w:val="0"/>
-        </w:rPr>
-        <w:t xml:space="preserve"/>
-      </w:r>
-    </w:p>
-    <w:p>
-      <w:pPr/>
-      <w:r>
-        <w:rPr>
-          <w:rFonts w:ascii="Helvetica Neue" w:hAnsi="Helvetica Neue" w:cs="Helvetica Neue"/>
-          <w:sz w:val="20"/>
-          <w:sz-cs w:val="20"/>
-          <w:b/>
-          <w:spacing w:val="0"/>
-          <w:color w:val="FFFFFF"/>
-        </w:rPr>
-        <w:t xml:space="preserve">OWNER TO COMPLETE</w:t>
-      </w:r>
-      <w:r>
-        <w:rPr>
-          <w:rFonts w:ascii="Helvetica Neue" w:hAnsi="Helvetica Neue" w:cs="Helvetica Neue"/>
-          <w:sz w:val="23"/>
-          <w:sz-cs w:val="23"/>
-          <w:spacing w:val="0"/>
-        </w:rPr>
-        <w:t xml:space="preserve"/>
-      </w:r>
-    </w:p>
-    <w:p>
-      <w:pPr>
-        <w:spacing w:after="150"/>
-      </w:pPr>
-      <w:r>
-        <w:rPr>
-          <w:rFonts w:ascii="Helvetica Neue" w:hAnsi="Helvetica Neue" w:cs="Helvetica Neue"/>
-          <w:sz w:val="23"/>
-          <w:sz-cs w:val="23"/>
-          <w:spacing w:val="0"/>
-        </w:rPr>
-        <w:t xml:space="preserve">Agreed next step and the date it is due, written down before the call ends.</w:t>
-      </w:r>
-      <w:r>
-        <w:rPr>
-          <w:rFonts w:ascii="Helvetica Neue" w:hAnsi="Helvetica Neue" w:cs="Helvetica Neue"/>
-          <w:sz w:val="23"/>
-          <w:sz-cs w:val="23"/>
-          <w:spacing w:val="0"/>
-        </w:rPr>
-        <w:t xml:space="preserve"/>
-      </w:r>
-    </w:p>
-    <w:p>
-      <w:pPr/>
-      <w:r>
-        <w:rPr>
-          <w:rFonts w:ascii="Helvetica Neue" w:hAnsi="Helvetica Neue" w:cs="Helvetica Neue"/>
-          <w:sz w:val="25"/>
-          <w:sz-cs w:val="25"/>
           <w:spacing w:val="0"/>
         </w:rPr>
         <w:t xml:space="preserve"/>

</xml_diff>

<commit_message>
The handout, final: research areas and sources, hardware by level, fourteen pages
</commit_message>
<xml_diff>
--- a/handout/OpenBrain-Handout.docx
+++ b/handout/OpenBrain-Handout.docx
@@ -7047,7 +7047,7 @@
           <w:b/>
           <w:spacing w:val="0"/>
         </w:rPr>
-        <w:t xml:space="preserve"> Previous work</w:t>
+        <w:t xml:space="preserve"> Research areas, and where the information comes from</w:t>
       </w:r>
       <w:r>
         <w:rPr>
@@ -7071,6 +7071,889 @@
           <w:sz-cs w:val="27"/>
           <w:spacing w:val="0"/>
         </w:rPr>
+        <w:t xml:space="preserve">The route from this device to the larger systems is work and funding. Each row says what runs today, what it stands on, and what comes next.</w:t>
+      </w:r>
+      <w:r>
+        <w:rPr>
+          <w:rFonts w:ascii="Helvetica Neue" w:hAnsi="Helvetica Neue" w:cs="Helvetica Neue"/>
+          <w:sz w:val="27"/>
+          <w:sz-cs w:val="27"/>
+          <w:spacing w:val="0"/>
+        </w:rPr>
+        <w:t xml:space="preserve"/>
+      </w:r>
+    </w:p>
+    <w:p>
+      <w:pPr/>
+      <w:r>
+        <w:rPr>
+          <w:rFonts w:ascii="Helvetica Neue" w:hAnsi="Helvetica Neue" w:cs="Helvetica Neue"/>
+          <w:sz w:val="20"/>
+          <w:sz-cs w:val="20"/>
+          <w:b/>
+          <w:spacing w:val="0"/>
+        </w:rPr>
+        <w:t xml:space="preserve">AREA</w:t>
+      </w:r>
+      <w:r>
+        <w:rPr>
+          <w:rFonts w:ascii="Helvetica Neue" w:hAnsi="Helvetica Neue" w:cs="Helvetica Neue"/>
+          <w:sz w:val="20"/>
+          <w:sz-cs w:val="20"/>
+          <w:b/>
+          <w:spacing w:val="0"/>
+        </w:rPr>
+        <w:t xml:space="preserve"/>
+      </w:r>
+    </w:p>
+    <w:p>
+      <w:pPr/>
+      <w:r>
+        <w:rPr>
+          <w:rFonts w:ascii="Helvetica Neue" w:hAnsi="Helvetica Neue" w:cs="Helvetica Neue"/>
+          <w:sz w:val="20"/>
+          <w:sz-cs w:val="20"/>
+          <w:b/>
+          <w:spacing w:val="0"/>
+        </w:rPr>
+        <w:t xml:space="preserve">WHAT EXISTS TODAY</w:t>
+      </w:r>
+      <w:r>
+        <w:rPr>
+          <w:rFonts w:ascii="Helvetica Neue" w:hAnsi="Helvetica Neue" w:cs="Helvetica Neue"/>
+          <w:sz w:val="20"/>
+          <w:sz-cs w:val="20"/>
+          <w:b/>
+          <w:spacing w:val="0"/>
+        </w:rPr>
+        <w:t xml:space="preserve"/>
+      </w:r>
+    </w:p>
+    <w:p>
+      <w:pPr/>
+      <w:r>
+        <w:rPr>
+          <w:rFonts w:ascii="Helvetica Neue" w:hAnsi="Helvetica Neue" w:cs="Helvetica Neue"/>
+          <w:sz w:val="20"/>
+          <w:sz-cs w:val="20"/>
+          <w:b/>
+          <w:spacing w:val="0"/>
+        </w:rPr>
+        <w:t xml:space="preserve">WHAT IT DRAWS ON</w:t>
+      </w:r>
+      <w:r>
+        <w:rPr>
+          <w:rFonts w:ascii="Helvetica Neue" w:hAnsi="Helvetica Neue" w:cs="Helvetica Neue"/>
+          <w:sz w:val="20"/>
+          <w:sz-cs w:val="20"/>
+          <w:b/>
+          <w:spacing w:val="0"/>
+        </w:rPr>
+        <w:t xml:space="preserve"/>
+      </w:r>
+    </w:p>
+    <w:p>
+      <w:pPr/>
+      <w:r>
+        <w:rPr>
+          <w:rFonts w:ascii="Helvetica Neue" w:hAnsi="Helvetica Neue" w:cs="Helvetica Neue"/>
+          <w:sz w:val="20"/>
+          <w:sz-cs w:val="20"/>
+          <w:b/>
+          <w:spacing w:val="0"/>
+        </w:rPr>
+        <w:t xml:space="preserve">NEXT</w:t>
+      </w:r>
+      <w:r>
+        <w:rPr>
+          <w:rFonts w:ascii="Helvetica Neue" w:hAnsi="Helvetica Neue" w:cs="Helvetica Neue"/>
+          <w:sz w:val="20"/>
+          <w:sz-cs w:val="20"/>
+          <w:b/>
+          <w:spacing w:val="0"/>
+        </w:rPr>
+        <w:t xml:space="preserve"/>
+      </w:r>
+    </w:p>
+    <w:p>
+      <w:pPr/>
+      <w:r>
+        <w:rPr>
+          <w:rFonts w:ascii="Helvetica Neue" w:hAnsi="Helvetica Neue" w:cs="Helvetica Neue"/>
+          <w:sz w:val="20"/>
+          <w:sz-cs w:val="20"/>
+          <w:b/>
+          <w:spacing w:val="0"/>
+        </w:rPr>
+        <w:t xml:space="preserve">The mechanical assistant</w:t>
+      </w:r>
+      <w:r>
+        <w:rPr>
+          <w:rFonts w:ascii="Helvetica Neue" w:hAnsi="Helvetica Neue" w:cs="Helvetica Neue"/>
+          <w:sz w:val="20"/>
+          <w:sz-cs w:val="20"/>
+          <w:spacing w:val="0"/>
+        </w:rPr>
+        <w:t xml:space="preserve"/>
+      </w:r>
+    </w:p>
+    <w:p>
+      <w:pPr/>
+      <w:r>
+        <w:rPr>
+          <w:rFonts w:ascii="Helvetica Neue" w:hAnsi="Helvetica Neue" w:cs="Helvetica Neue"/>
+          <w:sz w:val="20"/>
+          <w:sz-cs w:val="20"/>
+          <w:spacing w:val="0"/>
+          <w:color w:val="393939"/>
+        </w:rPr>
+        <w:t xml:space="preserve">this device</w:t>
+      </w:r>
+      <w:r>
+        <w:rPr>
+          <w:rFonts w:ascii="Helvetica Neue" w:hAnsi="Helvetica Neue" w:cs="Helvetica Neue"/>
+          <w:sz w:val="20"/>
+          <w:sz-cs w:val="20"/>
+          <w:spacing w:val="0"/>
+        </w:rPr>
+        <w:t xml:space="preserve"/>
+      </w:r>
+    </w:p>
+    <w:p>
+      <w:pPr/>
+      <w:r>
+        <w:rPr>
+          <w:rFonts w:ascii="Helvetica Neue" w:hAnsi="Helvetica Neue" w:cs="Helvetica Neue"/>
+          <w:sz w:val="20"/>
+          <w:sz-cs w:val="20"/>
+          <w:spacing w:val="0"/>
+        </w:rPr>
+        <w:t xml:space="preserve">3,636 checks held on the DevKit across 26 suites and 3,630 on the Mac, 0 failed. Tier 0 answers between 28 µs and 3.9 ms. Twelve of twelve demo lines answered by voice.</w:t>
+      </w:r>
+      <w:r>
+        <w:rPr>
+          <w:rFonts w:ascii="Helvetica Neue" w:hAnsi="Helvetica Neue" w:cs="Helvetica Neue"/>
+          <w:sz w:val="20"/>
+          <w:sz-cs w:val="20"/>
+          <w:spacing w:val="0"/>
+        </w:rPr>
+        <w:t xml:space="preserve"/>
+      </w:r>
+    </w:p>
+    <w:p>
+      <w:pPr/>
+      <w:r>
+        <w:rPr>
+          <w:rFonts w:ascii="Helvetica Neue" w:hAnsi="Helvetica Neue" w:cs="Helvetica Neue"/>
+          <w:sz w:val="20"/>
+          <w:sz-cs w:val="20"/>
+          <w:spacing w:val="0"/>
+        </w:rPr>
+        <w:t xml:space="preserve">The library and the 682 facts on the card, and the open-source speech stack.</w:t>
+      </w:r>
+      <w:r>
+        <w:rPr>
+          <w:rFonts w:ascii="Helvetica Neue" w:hAnsi="Helvetica Neue" w:cs="Helvetica Neue"/>
+          <w:sz w:val="20"/>
+          <w:sz-cs w:val="20"/>
+          <w:spacing w:val="0"/>
+        </w:rPr>
+        <w:t xml:space="preserve"/>
+      </w:r>
+    </w:p>
+    <w:p>
+      <w:pPr/>
+      <w:r>
+        <w:rPr>
+          <w:rFonts w:ascii="Helvetica Neue" w:hAnsi="Helvetica Neue" w:cs="Helvetica Neue"/>
+          <w:sz w:val="20"/>
+          <w:sz-cs w:val="20"/>
+          <w:spacing w:val="0"/>
+        </w:rPr>
+        <w:t xml:space="preserve">Milestones 1 to 4.</w:t>
+      </w:r>
+      <w:r>
+        <w:rPr>
+          <w:rFonts w:ascii="Helvetica Neue" w:hAnsi="Helvetica Neue" w:cs="Helvetica Neue"/>
+          <w:sz w:val="20"/>
+          <w:sz-cs w:val="20"/>
+          <w:spacing w:val="0"/>
+        </w:rPr>
+        <w:t xml:space="preserve"/>
+      </w:r>
+    </w:p>
+    <w:p>
+      <w:pPr/>
+      <w:r>
+        <w:rPr>
+          <w:rFonts w:ascii="Helvetica Neue" w:hAnsi="Helvetica Neue" w:cs="Helvetica Neue"/>
+          <w:sz w:val="20"/>
+          <w:sz-cs w:val="20"/>
+          <w:b/>
+          <w:spacing w:val="0"/>
+        </w:rPr>
+        <w:t xml:space="preserve">Local inference</w:t>
+      </w:r>
+      <w:r>
+        <w:rPr>
+          <w:rFonts w:ascii="Helvetica Neue" w:hAnsi="Helvetica Neue" w:cs="Helvetica Neue"/>
+          <w:sz w:val="20"/>
+          <w:sz-cs w:val="20"/>
+          <w:spacing w:val="0"/>
+        </w:rPr>
+        <w:t xml:space="preserve"/>
+      </w:r>
+    </w:p>
+    <w:p>
+      <w:pPr/>
+      <w:r>
+        <w:rPr>
+          <w:rFonts w:ascii="Helvetica Neue" w:hAnsi="Helvetica Neue" w:cs="Helvetica Neue"/>
+          <w:sz w:val="20"/>
+          <w:sz-cs w:val="20"/>
+          <w:spacing w:val="0"/>
+        </w:rPr>
+        <w:t xml:space="preserve">Two lanes I run: a Rust server with candle serving GGUF on the CPU, and an MLX lane on the GPU running my own server rather than the stock one. Two fine-tuned models: a role-tuned 4B on 1 July, LoRA r8 over 300 iterations, and a behaviour-tuned 0.8B on 28 August. The from-scratch transformer I call the subconscious sits at step 34,300, validation 2.31.</w:t>
+      </w:r>
+      <w:r>
+        <w:rPr>
+          <w:rFonts w:ascii="Helvetica Neue" w:hAnsi="Helvetica Neue" w:cs="Helvetica Neue"/>
+          <w:sz w:val="20"/>
+          <w:sz-cs w:val="20"/>
+          <w:spacing w:val="0"/>
+        </w:rPr>
+        <w:t xml:space="preserve"/>
+      </w:r>
+    </w:p>
+    <w:p>
+      <w:pPr/>
+      <w:r>
+        <w:rPr>
+          <w:rFonts w:ascii="Helvetica Neue" w:hAnsi="Helvetica Neue" w:cs="Helvetica Neue"/>
+          <w:sz w:val="20"/>
+          <w:sz-cs w:val="20"/>
+          <w:spacing w:val="0"/>
+        </w:rPr>
+        <w:t xml:space="preserve">Open weights fetched once onto my own drives, my own training data, and the MLX and candle runtimes.</w:t>
+      </w:r>
+      <w:r>
+        <w:rPr>
+          <w:rFonts w:ascii="Helvetica Neue" w:hAnsi="Helvetica Neue" w:cs="Helvetica Neue"/>
+          <w:sz w:val="20"/>
+          <w:sz-cs w:val="20"/>
+          <w:spacing w:val="0"/>
+        </w:rPr>
+        <w:t xml:space="preserve"/>
+      </w:r>
+    </w:p>
+    <w:p>
+      <w:pPr/>
+      <w:r>
+        <w:rPr>
+          <w:rFonts w:ascii="Helvetica Neue" w:hAnsi="Helvetica Neue" w:cs="Helvetica Neue"/>
+          <w:sz w:val="20"/>
+          <w:sz-cs w:val="20"/>
+          <w:spacing w:val="0"/>
+        </w:rPr>
+        <w:t xml:space="preserve">The comprehension tier trained and evaluated on the machine.</w:t>
+      </w:r>
+      <w:r>
+        <w:rPr>
+          <w:rFonts w:ascii="Helvetica Neue" w:hAnsi="Helvetica Neue" w:cs="Helvetica Neue"/>
+          <w:sz w:val="20"/>
+          <w:sz-cs w:val="20"/>
+          <w:spacing w:val="0"/>
+        </w:rPr>
+        <w:t xml:space="preserve"/>
+      </w:r>
+    </w:p>
+    <w:p>
+      <w:pPr/>
+      <w:r>
+        <w:rPr>
+          <w:rFonts w:ascii="Helvetica Neue" w:hAnsi="Helvetica Neue" w:cs="Helvetica Neue"/>
+          <w:sz w:val="20"/>
+          <w:sz-cs w:val="20"/>
+          <w:b/>
+          <w:spacing w:val="0"/>
+        </w:rPr>
+        <w:t xml:space="preserve">MECH</w:t>
+      </w:r>
+      <w:r>
+        <w:rPr>
+          <w:rFonts w:ascii="Helvetica Neue" w:hAnsi="Helvetica Neue" w:cs="Helvetica Neue"/>
+          <w:sz w:val="20"/>
+          <w:sz-cs w:val="20"/>
+          <w:spacing w:val="0"/>
+        </w:rPr>
+        <w:t xml:space="preserve"/>
+      </w:r>
+    </w:p>
+    <w:p>
+      <w:pPr/>
+      <w:r>
+        <w:rPr>
+          <w:rFonts w:ascii="Helvetica Neue" w:hAnsi="Helvetica Neue" w:cs="Helvetica Neue"/>
+          <w:sz w:val="20"/>
+          <w:sz-cs w:val="20"/>
+          <w:spacing w:val="0"/>
+          <w:color w:val="393939"/>
+        </w:rPr>
+        <w:t xml:space="preserve">comprehension</w:t>
+      </w:r>
+      <w:r>
+        <w:rPr>
+          <w:rFonts w:ascii="Helvetica Neue" w:hAnsi="Helvetica Neue" w:cs="Helvetica Neue"/>
+          <w:sz w:val="20"/>
+          <w:sz-cs w:val="20"/>
+          <w:spacing w:val="0"/>
+        </w:rPr>
+        <w:t xml:space="preserve"/>
+      </w:r>
+    </w:p>
+    <w:p>
+      <w:pPr/>
+      <w:r>
+        <w:rPr>
+          <w:rFonts w:ascii="Helvetica Neue" w:hAnsi="Helvetica Neue" w:cs="Helvetica Neue"/>
+          <w:sz w:val="20"/>
+          <w:sz-cs w:val="20"/>
+          <w:spacing w:val="0"/>
+        </w:rPr>
+        <w:t xml:space="preserve">A reading becomes a belief that stays revisable, carries its inferential provenance and a condition that would overturn it, and only a promotion check can make it actual. Two reading lanes, measured on the live ledger: 120,927 claims at 99.9% in the bridge lane with no subject bound, and 136 typed readings. It abstains rather than guess.</w:t>
+      </w:r>
+      <w:r>
+        <w:rPr>
+          <w:rFonts w:ascii="Helvetica Neue" w:hAnsi="Helvetica Neue" w:cs="Helvetica Neue"/>
+          <w:sz w:val="20"/>
+          <w:sz-cs w:val="20"/>
+          <w:spacing w:val="0"/>
+        </w:rPr>
+        <w:t xml:space="preserve"/>
+      </w:r>
+    </w:p>
+    <w:p>
+      <w:pPr/>
+      <w:r>
+        <w:rPr>
+          <w:rFonts w:ascii="Helvetica Neue" w:hAnsi="Helvetica Neue" w:cs="Helvetica Neue"/>
+          <w:sz w:val="20"/>
+          <w:sz-cs w:val="20"/>
+          <w:spacing w:val="0"/>
+        </w:rPr>
+        <w:t xml:space="preserve">The books I own and attested, a 605 MB ledger indexed into one 727 MB SQLite file, and the toddler baseline of 3 books and 22 sentences.</w:t>
+      </w:r>
+      <w:r>
+        <w:rPr>
+          <w:rFonts w:ascii="Helvetica Neue" w:hAnsi="Helvetica Neue" w:cs="Helvetica Neue"/>
+          <w:sz w:val="20"/>
+          <w:sz-cs w:val="20"/>
+          <w:spacing w:val="0"/>
+        </w:rPr>
+        <w:t xml:space="preserve"/>
+      </w:r>
+    </w:p>
+    <w:p>
+      <w:pPr/>
+      <w:r>
+        <w:rPr>
+          <w:rFonts w:ascii="Helvetica Neue" w:hAnsi="Helvetica Neue" w:cs="Helvetica Neue"/>
+          <w:sz w:val="20"/>
+          <w:sz-cs w:val="20"/>
+          <w:spacing w:val="0"/>
+        </w:rPr>
+        <w:t xml:space="preserve">A re-read with comprehension on, which typed 17.5% of one documentation set, then the reading lane on the DevKit.</w:t>
+      </w:r>
+      <w:r>
+        <w:rPr>
+          <w:rFonts w:ascii="Helvetica Neue" w:hAnsi="Helvetica Neue" w:cs="Helvetica Neue"/>
+          <w:sz w:val="20"/>
+          <w:sz-cs w:val="20"/>
+          <w:spacing w:val="0"/>
+        </w:rPr>
+        <w:t xml:space="preserve"/>
+      </w:r>
+    </w:p>
+    <w:p>
+      <w:pPr/>
+      <w:r>
+        <w:rPr>
+          <w:rFonts w:ascii="Helvetica Neue" w:hAnsi="Helvetica Neue" w:cs="Helvetica Neue"/>
+          <w:sz w:val="20"/>
+          <w:sz-cs w:val="20"/>
+          <w:b/>
+          <w:spacing w:val="0"/>
+        </w:rPr>
+        <w:t xml:space="preserve">Verified mathematics</w:t>
+      </w:r>
+      <w:r>
+        <w:rPr>
+          <w:rFonts w:ascii="Helvetica Neue" w:hAnsi="Helvetica Neue" w:cs="Helvetica Neue"/>
+          <w:sz w:val="20"/>
+          <w:sz-cs w:val="20"/>
+          <w:spacing w:val="0"/>
+        </w:rPr>
+        <w:t xml:space="preserve"/>
+      </w:r>
+    </w:p>
+    <w:p>
+      <w:pPr/>
+      <w:r>
+        <w:rPr>
+          <w:rFonts w:ascii="Helvetica Neue" w:hAnsi="Helvetica Neue" w:cs="Helvetica Neue"/>
+          <w:sz w:val="20"/>
+          <w:sz-cs w:val="20"/>
+          <w:spacing w:val="0"/>
+        </w:rPr>
+        <w:t xml:space="preserve">Julia computes the exact answer and Python re-derives it, so the pair decides instead of approximating. In Ada/SPARK I closed 35 open verification conditions by running the prover per subprogram at level 2, with level 3 for float multiplication monotonicity. Rust libraries sit behind one C ABI.</w:t>
+      </w:r>
+      <w:r>
+        <w:rPr>
+          <w:rFonts w:ascii="Helvetica Neue" w:hAnsi="Helvetica Neue" w:cs="Helvetica Neue"/>
+          <w:sz w:val="20"/>
+          <w:sz-cs w:val="20"/>
+          <w:spacing w:val="0"/>
+        </w:rPr>
+        <w:t xml:space="preserve"/>
+      </w:r>
+    </w:p>
+    <w:p>
+      <w:pPr/>
+      <w:r>
+        <w:rPr>
+          <w:rFonts w:ascii="Helvetica Neue" w:hAnsi="Helvetica Neue" w:cs="Helvetica Neue"/>
+          <w:sz w:val="20"/>
+          <w:sz-cs w:val="20"/>
+          <w:spacing w:val="0"/>
+        </w:rPr>
+        <w:t xml:space="preserve">Julia, Ada/SPARK with gnatprove, and Rust.</w:t>
+      </w:r>
+      <w:r>
+        <w:rPr>
+          <w:rFonts w:ascii="Helvetica Neue" w:hAnsi="Helvetica Neue" w:cs="Helvetica Neue"/>
+          <w:sz w:val="20"/>
+          <w:sz-cs w:val="20"/>
+          <w:spacing w:val="0"/>
+        </w:rPr>
+        <w:t xml:space="preserve"/>
+      </w:r>
+    </w:p>
+    <w:p>
+      <w:pPr/>
+      <w:r>
+        <w:rPr>
+          <w:rFonts w:ascii="Helvetica Neue" w:hAnsi="Helvetica Neue" w:cs="Helvetica Neue"/>
+          <w:sz w:val="20"/>
+          <w:sz-cs w:val="20"/>
+          <w:spacing w:val="0"/>
+        </w:rPr>
+        <w:t xml:space="preserve">It proves what it can and refuses the rest: a codec body outside SPARK is labelled assumed and never proved, and a block whose scale saturates is rejected rather than silently zeroed.</w:t>
+      </w:r>
+      <w:r>
+        <w:rPr>
+          <w:rFonts w:ascii="Helvetica Neue" w:hAnsi="Helvetica Neue" w:cs="Helvetica Neue"/>
+          <w:sz w:val="20"/>
+          <w:sz-cs w:val="20"/>
+          <w:spacing w:val="0"/>
+        </w:rPr>
+        <w:t xml:space="preserve"/>
+      </w:r>
+    </w:p>
+    <w:p>
+      <w:pPr/>
+      <w:r>
+        <w:rPr>
+          <w:rFonts w:ascii="Helvetica Neue" w:hAnsi="Helvetica Neue" w:cs="Helvetica Neue"/>
+          <w:sz w:val="20"/>
+          <w:sz-cs w:val="20"/>
+          <w:b/>
+          <w:spacing w:val="0"/>
+        </w:rPr>
+        <w:t xml:space="preserve">The Astral Brain Engine</w:t>
+      </w:r>
+      <w:r>
+        <w:rPr>
+          <w:rFonts w:ascii="Helvetica Neue" w:hAnsi="Helvetica Neue" w:cs="Helvetica Neue"/>
+          <w:sz w:val="20"/>
+          <w:sz-cs w:val="20"/>
+          <w:spacing w:val="0"/>
+        </w:rPr>
+        <w:t xml:space="preserve"/>
+      </w:r>
+    </w:p>
+    <w:p>
+      <w:pPr/>
+      <w:r>
+        <w:rPr>
+          <w:rFonts w:ascii="Helvetica Neue" w:hAnsi="Helvetica Neue" w:cs="Helvetica Neue"/>
+          <w:sz w:val="20"/>
+          <w:sz-cs w:val="20"/>
+          <w:spacing w:val="0"/>
+        </w:rPr>
+        <w:t xml:space="preserve">Local-first orchestration under twelve prime directives. PD-1, evidence or silence, refuses a claim that arrives without a receipt. PD-3, nothing orphaned and nothing conflated, resolves every file I touch to one product and no other. PD-4, plan then prove then build, holds destructive work until I authorise it by hand. A coordination bus makes a process claim the work before it touches anything.</w:t>
+      </w:r>
+      <w:r>
+        <w:rPr>
+          <w:rFonts w:ascii="Helvetica Neue" w:hAnsi="Helvetica Neue" w:cs="Helvetica Neue"/>
+          <w:sz w:val="20"/>
+          <w:sz-cs w:val="20"/>
+          <w:spacing w:val="0"/>
+        </w:rPr>
+        <w:t xml:space="preserve"/>
+      </w:r>
+    </w:p>
+    <w:p>
+      <w:pPr/>
+      <w:r>
+        <w:rPr>
+          <w:rFonts w:ascii="Helvetica Neue" w:hAnsi="Helvetica Neue" w:cs="Helvetica Neue"/>
+          <w:sz w:val="20"/>
+          <w:sz-cs w:val="20"/>
+          <w:spacing w:val="0"/>
+        </w:rPr>
+        <w:t xml:space="preserve">The product map, the receipt ledger and the bus, all on my own machines.</w:t>
+      </w:r>
+      <w:r>
+        <w:rPr>
+          <w:rFonts w:ascii="Helvetica Neue" w:hAnsi="Helvetica Neue" w:cs="Helvetica Neue"/>
+          <w:sz w:val="20"/>
+          <w:sz-cs w:val="20"/>
+          <w:spacing w:val="0"/>
+        </w:rPr>
+        <w:t xml:space="preserve"/>
+      </w:r>
+    </w:p>
+    <w:p>
+      <w:pPr/>
+      <w:r>
+        <w:rPr>
+          <w:rFonts w:ascii="Helvetica Neue" w:hAnsi="Helvetica Neue" w:cs="Helvetica Neue"/>
+          <w:sz w:val="20"/>
+          <w:sz-cs w:val="20"/>
+          <w:spacing w:val="0"/>
+        </w:rPr>
+        <w:t xml:space="preserve">Move each directive from advisory text into code that enforces it.</w:t>
+      </w:r>
+      <w:r>
+        <w:rPr>
+          <w:rFonts w:ascii="Helvetica Neue" w:hAnsi="Helvetica Neue" w:cs="Helvetica Neue"/>
+          <w:sz w:val="20"/>
+          <w:sz-cs w:val="20"/>
+          <w:spacing w:val="0"/>
+        </w:rPr>
+        <w:t xml:space="preserve"/>
+      </w:r>
+    </w:p>
+    <w:p>
+      <w:pPr/>
+      <w:r>
+        <w:rPr>
+          <w:rFonts w:ascii="Helvetica Neue" w:hAnsi="Helvetica Neue" w:cs="Helvetica Neue"/>
+          <w:sz w:val="20"/>
+          <w:sz-cs w:val="20"/>
+          <w:b/>
+          <w:spacing w:val="0"/>
+        </w:rPr>
+        <w:t xml:space="preserve">The knowledge shelf</w:t>
+      </w:r>
+      <w:r>
+        <w:rPr>
+          <w:rFonts w:ascii="Helvetica Neue" w:hAnsi="Helvetica Neue" w:cs="Helvetica Neue"/>
+          <w:sz w:val="20"/>
+          <w:sz-cs w:val="20"/>
+          <w:spacing w:val="0"/>
+        </w:rPr>
+        <w:t xml:space="preserve"/>
+      </w:r>
+    </w:p>
+    <w:p>
+      <w:pPr/>
+      <w:r>
+        <w:rPr>
+          <w:rFonts w:ascii="Helvetica Neue" w:hAnsi="Helvetica Neue" w:cs="Helvetica Neue"/>
+          <w:sz w:val="20"/>
+          <w:sz-cs w:val="20"/>
+          <w:spacing w:val="0"/>
+        </w:rPr>
+        <w:t xml:space="preserve">On the card: 57 reference files and a 570 MB index over 308,952 passages, holding the 24 Encyclopedia of Physical Science and Technology volumes, Britannica across 29 files, the seven-volume World History set, the Encyclopedia of Computer Science, and Ancient and Forbidden Knowledge. Staged and converting today: 65 DK volumes, 6.4 GB of PDFs.</w:t>
+      </w:r>
+      <w:r>
+        <w:rPr>
+          <w:rFonts w:ascii="Helvetica Neue" w:hAnsi="Helvetica Neue" w:cs="Helvetica Neue"/>
+          <w:sz w:val="20"/>
+          <w:sz-cs w:val="20"/>
+          <w:spacing w:val="0"/>
+        </w:rPr>
+        <w:t xml:space="preserve"/>
+      </w:r>
+    </w:p>
+    <w:p>
+      <w:pPr/>
+      <w:r>
+        <w:rPr>
+          <w:rFonts w:ascii="Helvetica Neue" w:hAnsi="Helvetica Neue" w:cs="Helvetica Neue"/>
+          <w:sz w:val="20"/>
+          <w:sz-cs w:val="20"/>
+          <w:spacing w:val="0"/>
+        </w:rPr>
+        <w:t xml:space="preserve">Encyclopedias and books I bought and own, converted to text on my own hardware.</w:t>
+      </w:r>
+      <w:r>
+        <w:rPr>
+          <w:rFonts w:ascii="Helvetica Neue" w:hAnsi="Helvetica Neue" w:cs="Helvetica Neue"/>
+          <w:sz w:val="20"/>
+          <w:sz-cs w:val="20"/>
+          <w:spacing w:val="0"/>
+        </w:rPr>
+        <w:t xml:space="preserve"/>
+      </w:r>
+    </w:p>
+    <w:p>
+      <w:pPr/>
+      <w:r>
+        <w:rPr>
+          <w:rFonts w:ascii="Helvetica Neue" w:hAnsi="Helvetica Neue" w:cs="Helvetica Neue"/>
+          <w:sz w:val="20"/>
+          <w:sz-cs w:val="20"/>
+          <w:spacing w:val="0"/>
+        </w:rPr>
+        <w:t xml:space="preserve">Build the index on a real machine and ship it built, so the card gets the full shelf without hours of indexing on a Pi.</w:t>
+      </w:r>
+      <w:r>
+        <w:rPr>
+          <w:rFonts w:ascii="Helvetica Neue" w:hAnsi="Helvetica Neue" w:cs="Helvetica Neue"/>
+          <w:sz w:val="20"/>
+          <w:sz-cs w:val="20"/>
+          <w:spacing w:val="0"/>
+        </w:rPr>
+        <w:t xml:space="preserve"/>
+      </w:r>
+    </w:p>
+    <w:p>
+      <w:pPr>
+        <w:spacing w:after="60"/>
+      </w:pPr>
+      <w:r>
+        <w:rPr>
+          <w:rFonts w:ascii="Helvetica Neue" w:hAnsi="Helvetica Neue" w:cs="Helvetica Neue"/>
+          <w:sz w:val="26"/>
+          <w:sz-cs w:val="26"/>
+          <w:b/>
+          <w:spacing w:val="0"/>
+        </w:rPr>
+        <w:t xml:space="preserve">Sources</w:t>
+      </w:r>
+      <w:r>
+        <w:rPr>
+          <w:rFonts w:ascii="Helvetica Neue" w:hAnsi="Helvetica Neue" w:cs="Helvetica Neue"/>
+          <w:sz w:val="26"/>
+          <w:sz-cs w:val="26"/>
+          <w:b/>
+          <w:spacing w:val="0"/>
+        </w:rPr>
+        <w:t xml:space="preserve"/>
+      </w:r>
+    </w:p>
+    <w:p>
+      <w:pPr>
+        <w:spacing w:after="120"/>
+      </w:pPr>
+      <w:r>
+        <w:rPr>
+          <w:rFonts w:ascii="Helvetica Neue" w:hAnsi="Helvetica Neue" w:cs="Helvetica Neue"/>
+          <w:sz w:val="23"/>
+          <w:sz-cs w:val="23"/>
+          <w:spacing w:val="0"/>
+        </w:rPr>
+        <w:t xml:space="preserve">The open-source stack: whisper.cpp, piper, vosk, llama.cpp, openWakeWord, PipeWire, SQLite FTS5, Julia, Ada/SPARK and Rust. The encyclopedias and books I own. My own corpora and training runs. The measurements ledger in the repository, KNOWN-BUGS.md, where every number carries its date. OpenHome's SDK and its local-ability contract. My coursework at SNHU, where I am reading for a BS in Computer Science with a Software Engineering concentration.</w:t>
+      </w:r>
+      <w:r>
+        <w:rPr>
+          <w:rFonts w:ascii="Helvetica Neue" w:hAnsi="Helvetica Neue" w:cs="Helvetica Neue"/>
+          <w:sz w:val="23"/>
+          <w:sz-cs w:val="23"/>
+          <w:spacing w:val="0"/>
+        </w:rPr>
+        <w:t xml:space="preserve"/>
+      </w:r>
+    </w:p>
+    <w:p>
+      <w:pPr/>
+      <w:r>
+        <w:rPr>
+          <w:rFonts w:ascii="Helvetica Neue" w:hAnsi="Helvetica Neue" w:cs="Helvetica Neue"/>
+          <w:sz w:val="23"/>
+          <w:sz-cs w:val="23"/>
+          <w:spacing w:val="0"/>
+        </w:rPr>
+        <w:t xml:space="preserve">Every row above is running or measured today. The machine and the time are what turn the next column into the exists column.</w:t>
+      </w:r>
+    </w:p>
+    <w:p>
+      <w:pPr/>
+      <w:r>
+        <w:rPr>
+          <w:rFonts w:ascii="Helvetica Neue" w:hAnsi="Helvetica Neue" w:cs="Helvetica Neue"/>
+          <w:sz w:val="20"/>
+          <w:sz-cs w:val="20"/>
+          <w:spacing w:val="0"/>
+          <w:color w:val="393939"/>
+        </w:rPr>
+        <w:t xml:space="preserve">Jamesmykil Weber · for OpenHome</w:t>
+      </w:r>
+      <w:r>
+        <w:rPr>
+          <w:rFonts w:ascii="Helvetica Neue" w:hAnsi="Helvetica Neue" w:cs="Helvetica Neue"/>
+          <w:sz w:val="20"/>
+          <w:sz-cs w:val="20"/>
+          <w:spacing w:val="0"/>
+          <w:color w:val="393939"/>
+        </w:rPr>
+        <w:t xml:space="preserve"/>
+      </w:r>
+    </w:p>
+    <w:p>
+      <w:pPr/>
+      <w:r>
+        <w:rPr>
+          <w:rFonts w:ascii="Helvetica Neue" w:hAnsi="Helvetica Neue" w:cs="Helvetica Neue"/>
+          <w:sz w:val="20"/>
+          <w:sz-cs w:val="20"/>
+          <w:spacing w:val="0"/>
+          <w:color w:val="393939"/>
+        </w:rPr>
+        <w:t xml:space="preserve"/>
+      </w:r>
+    </w:p>
+    <w:p>
+      <w:pPr/>
+      <w:r>
+        <w:rPr>
+          <w:rFonts w:ascii="Helvetica Neue" w:hAnsi="Helvetica Neue" w:cs="Helvetica Neue"/>
+          <w:sz w:val="19"/>
+          <w:sz-cs w:val="19"/>
+          <w:b/>
+          <w:spacing w:val="0"/>
+          <w:color w:val="114A58"/>
+        </w:rPr>
+        <w:t xml:space="preserve">ASTRAL / OPENBRAIN</w:t>
+      </w:r>
+      <w:r>
+        <w:rPr>
+          <w:rFonts w:ascii="Helvetica Neue" w:hAnsi="Helvetica Neue" w:cs="Helvetica Neue"/>
+          <w:sz w:val="19"/>
+          <w:sz-cs w:val="19"/>
+          <w:spacing w:val="0"/>
+          <w:color w:val="393939"/>
+        </w:rPr>
+        <w:t xml:space="preserve"> · LOCAL-FIRST VOICE ON THE OPENHOME DEVKIT</w:t>
+      </w:r>
+      <w:r>
+        <w:rPr>
+          <w:rFonts w:ascii="Helvetica Neue" w:hAnsi="Helvetica Neue" w:cs="Helvetica Neue"/>
+          <w:sz w:val="19"/>
+          <w:sz-cs w:val="19"/>
+          <w:spacing w:val="0"/>
+          <w:color w:val="393939"/>
+        </w:rPr>
+        <w:t xml:space="preserve"/>
+      </w:r>
+    </w:p>
+    <w:p>
+      <w:pPr/>
+      <w:r>
+        <w:rPr>
+          <w:rFonts w:ascii="Helvetica Neue" w:hAnsi="Helvetica Neue" w:cs="Helvetica Neue"/>
+          <w:sz w:val="19"/>
+          <w:sz-cs w:val="19"/>
+          <w:spacing w:val="0"/>
+          <w:color w:val="393939"/>
+        </w:rPr>
+        <w:t xml:space="preserve">4 SEPTEMBER 2026</w:t>
+      </w:r>
+      <w:r>
+        <w:rPr>
+          <w:rFonts w:ascii="Helvetica Neue" w:hAnsi="Helvetica Neue" w:cs="Helvetica Neue"/>
+          <w:sz w:val="19"/>
+          <w:sz-cs w:val="19"/>
+          <w:spacing w:val="0"/>
+          <w:color w:val="393939"/>
+        </w:rPr>
+        <w:t xml:space="preserve"/>
+      </w:r>
+    </w:p>
+    <w:p>
+      <w:pPr/>
+      <w:r>
+        <w:rPr>
+          <w:rFonts w:ascii="Helvetica Neue" w:hAnsi="Helvetica Neue" w:cs="Helvetica Neue"/>
+          <w:sz w:val="21"/>
+          <w:sz-cs w:val="21"/>
+          <w:b/>
+          <w:spacing w:val="0"/>
+          <w:color w:val="114A58"/>
+        </w:rPr>
+        <w:t xml:space="preserve">SECTION 5 · CONTINUED</w:t>
+      </w:r>
+      <w:r>
+        <w:rPr>
+          <w:rFonts w:ascii="Helvetica Neue" w:hAnsi="Helvetica Neue" w:cs="Helvetica Neue"/>
+          <w:sz w:val="21"/>
+          <w:sz-cs w:val="21"/>
+          <w:b/>
+          <w:spacing w:val="0"/>
+          <w:color w:val="114A58"/>
+        </w:rPr>
+        <w:t xml:space="preserve"/>
+      </w:r>
+    </w:p>
+    <w:p>
+      <w:pPr>
+        <w:spacing w:after="90"/>
+      </w:pPr>
+      <w:r>
+        <w:rPr>
+          <w:rFonts w:ascii="Helvetica Neue" w:hAnsi="Helvetica Neue" w:cs="Helvetica Neue"/>
+          <w:sz w:val="37"/>
+          <w:sz-cs w:val="37"/>
+          <w:b/>
+          <w:spacing w:val="0"/>
+          <w:color w:val="114A58"/>
+        </w:rPr>
+        <w:t xml:space="preserve">5.</w:t>
+      </w:r>
+      <w:r>
+        <w:rPr>
+          <w:rFonts w:ascii="Helvetica Neue" w:hAnsi="Helvetica Neue" w:cs="Helvetica Neue"/>
+          <w:sz w:val="37"/>
+          <w:sz-cs w:val="37"/>
+          <w:b/>
+          <w:spacing w:val="0"/>
+        </w:rPr>
+        <w:t xml:space="preserve"> Previous work</w:t>
+      </w:r>
+      <w:r>
+        <w:rPr>
+          <w:rFonts w:ascii="Helvetica Neue" w:hAnsi="Helvetica Neue" w:cs="Helvetica Neue"/>
+          <w:sz w:val="37"/>
+          <w:sz-cs w:val="37"/>
+          <w:b/>
+          <w:spacing w:val="0"/>
+        </w:rPr>
+        <w:t xml:space="preserve"/>
+      </w:r>
+    </w:p>
+    <w:p>
+      <w:pPr>
+        <w:spacing w:after="256"/>
+      </w:pPr>
+      <w:r>
+        <w:rPr>
+          <w:rFonts w:ascii="Helvetica Neue" w:hAnsi="Helvetica Neue" w:cs="Helvetica Neue"/>
+          <w:sz w:val="27"/>
+          <w:sz-cs w:val="27"/>
+          <w:spacing w:val="0"/>
+        </w:rPr>
         <w:t xml:space="preserve">Three public repositories in the OpenHome ecosystem, and the private stack the DevKit work is cut from.</w:t>
       </w:r>
       <w:r>
@@ -8687,7 +9570,7 @@
           <w:sz-cs w:val="27"/>
           <w:spacing w:val="0"/>
         </w:rPr>
-        <w:t xml:space="preserve">The advancement is a fully mechanical assistant. A device that answers most of a household's questions on its own hardware in milliseconds, with no model call and nothing sent anywhere, and says so when it cannot.</w:t>
+        <w:t xml:space="preserve">The full grant is $50,000. Below is what each level buys, down to nothing, because I'm going to keep building this either way.</w:t>
       </w:r>
       <w:r>
         <w:rPr>
@@ -8710,7 +9593,7 @@
           <w:sz-cs w:val="25"/>
           <w:spacing w:val="0"/>
         </w:rPr>
-        <w:t xml:space="preserve">That runs today. Each level of funding buys more of it. I am a student with no income, and I will keep building this without money, slower and out of pocket. I am not asking for $50,000. I am showing what each amount does.</w:t>
+        <w:t xml:space="preserve">Every hour of compute today comes out of my own pocket and every test runs on one Pi. The advancement is a fully mechanical assistant: a device that answers most of a household's questions on its own hardware in milliseconds, with no model call and nothing sent anywhere, and says so when it can't. That runs today. Each level buys more of it.</w:t>
       </w:r>
       <w:r>
         <w:rPr>
@@ -9056,7 +9939,7 @@
           <w:sz-cs w:val="22"/>
           <w:spacing w:val="0"/>
         </w:rPr>
-        <w:t xml:space="preserve">One workstation, $3,800 to $4,750, is what milestones 1, 2, 3 and 5 all wait on.</w:t>
+        <w:t xml:space="preserve">One machine, from $2,000 up, is what milestones 1, 2, 3 and 5 all wait on.</w:t>
       </w:r>
       <w:r>
         <w:rPr>
@@ -9089,7 +9972,7 @@
           <w:spacing w:val="0"/>
           <w:color w:val="393939"/>
         </w:rPr>
-        <w:t xml:space="preserve"> The five milestones. Milestone 1 finishes the device that exists today; the rest widen what it can answer without asking anyone for permission.</w:t>
+        <w:t xml:space="preserve"> The five milestones.</w:t>
       </w:r>
       <w:r>
         <w:rPr>
@@ -9199,8 +10082,8 @@
       <w:r>
         <w:rPr>
           <w:rFonts w:ascii="Helvetica Neue" w:hAnsi="Helvetica Neue" w:cs="Helvetica Neue"/>
-          <w:sz w:val="22"/>
-          <w:sz-cs w:val="22"/>
+          <w:sz w:val="21"/>
+          <w:sz-cs w:val="21"/>
           <w:b/>
           <w:spacing w:val="0"/>
         </w:rPr>
@@ -9209,20 +10092,20 @@
       <w:r>
         <w:rPr>
           <w:rFonts w:ascii="Helvetica Neue" w:hAnsi="Helvetica Neue" w:cs="Helvetica Neue"/>
-          <w:sz w:val="22"/>
-          <w:sz-cs w:val="22"/>
-          <w:spacing w:val="0"/>
-        </w:rPr>
-        <w:t xml:space="preserve"/>
-      </w:r>
-    </w:p>
-    <w:p>
-      <w:pPr/>
-      <w:r>
-        <w:rPr>
-          <w:rFonts w:ascii="Helvetica Neue" w:hAnsi="Helvetica Neue" w:cs="Helvetica Neue"/>
-          <w:sz w:val="22"/>
-          <w:sz-cs w:val="22"/>
+          <w:sz w:val="21"/>
+          <w:sz-cs w:val="21"/>
+          <w:spacing w:val="0"/>
+        </w:rPr>
+        <w:t xml:space="preserve"/>
+      </w:r>
+    </w:p>
+    <w:p>
+      <w:pPr/>
+      <w:r>
+        <w:rPr>
+          <w:rFonts w:ascii="Helvetica Neue" w:hAnsi="Helvetica Neue" w:cs="Helvetica Neue"/>
+          <w:sz w:val="21"/>
+          <w:sz-cs w:val="21"/>
           <w:spacing w:val="0"/>
         </w:rPr>
         <w:t xml:space="preserve">Every exact-answer class complete: time, date, math, money, units, definitions, facts, the library, timers, notes and memory. The no-silent-failure suite held at zero failures, the kernel wheel published, the ability installable from the OpenHome catalogue, the runbook and the bug ledger current.</w:t>
@@ -9230,20 +10113,20 @@
       <w:r>
         <w:rPr>
           <w:rFonts w:ascii="Helvetica Neue" w:hAnsi="Helvetica Neue" w:cs="Helvetica Neue"/>
-          <w:sz w:val="22"/>
-          <w:sz-cs w:val="22"/>
-          <w:spacing w:val="0"/>
-        </w:rPr>
-        <w:t xml:space="preserve"/>
-      </w:r>
-    </w:p>
-    <w:p>
-      <w:pPr/>
-      <w:r>
-        <w:rPr>
-          <w:rFonts w:ascii="Helvetica Neue" w:hAnsi="Helvetica Neue" w:cs="Helvetica Neue"/>
-          <w:sz w:val="22"/>
-          <w:sz-cs w:val="22"/>
+          <w:sz w:val="21"/>
+          <w:sz-cs w:val="21"/>
+          <w:spacing w:val="0"/>
+        </w:rPr>
+        <w:t xml:space="preserve"/>
+      </w:r>
+    </w:p>
+    <w:p>
+      <w:pPr/>
+      <w:r>
+        <w:rPr>
+          <w:rFonts w:ascii="Helvetica Neue" w:hAnsi="Helvetica Neue" w:cs="Helvetica Neue"/>
+          <w:sz w:val="21"/>
+          <w:sz-cs w:val="21"/>
           <w:spacing w:val="0"/>
         </w:rPr>
         <w:t xml:space="preserve">my time</w:t>
@@ -9251,20 +10134,20 @@
       <w:r>
         <w:rPr>
           <w:rFonts w:ascii="Helvetica Neue" w:hAnsi="Helvetica Neue" w:cs="Helvetica Neue"/>
-          <w:sz w:val="22"/>
-          <w:sz-cs w:val="22"/>
-          <w:spacing w:val="0"/>
-        </w:rPr>
-        <w:t xml:space="preserve"/>
-      </w:r>
-    </w:p>
-    <w:p>
-      <w:pPr/>
-      <w:r>
-        <w:rPr>
-          <w:rFonts w:ascii="Helvetica Neue" w:hAnsi="Helvetica Neue" w:cs="Helvetica Neue"/>
-          <w:sz w:val="22"/>
-          <w:sz-cs w:val="22"/>
+          <w:sz w:val="21"/>
+          <w:sz-cs w:val="21"/>
+          <w:spacing w:val="0"/>
+        </w:rPr>
+        <w:t xml:space="preserve"/>
+      </w:r>
+    </w:p>
+    <w:p>
+      <w:pPr/>
+      <w:r>
+        <w:rPr>
+          <w:rFonts w:ascii="Helvetica Neue" w:hAnsi="Helvetica Neue" w:cs="Helvetica Neue"/>
+          <w:sz w:val="21"/>
+          <w:sz-cs w:val="21"/>
           <w:b/>
           <w:spacing w:val="0"/>
         </w:rPr>
@@ -9273,20 +10156,20 @@
       <w:r>
         <w:rPr>
           <w:rFonts w:ascii="Helvetica Neue" w:hAnsi="Helvetica Neue" w:cs="Helvetica Neue"/>
-          <w:sz w:val="22"/>
-          <w:sz-cs w:val="22"/>
-          <w:spacing w:val="0"/>
-        </w:rPr>
-        <w:t xml:space="preserve"/>
-      </w:r>
-    </w:p>
-    <w:p>
-      <w:pPr/>
-      <w:r>
-        <w:rPr>
-          <w:rFonts w:ascii="Helvetica Neue" w:hAnsi="Helvetica Neue" w:cs="Helvetica Neue"/>
-          <w:sz w:val="22"/>
-          <w:sz-cs w:val="22"/>
+          <w:sz w:val="21"/>
+          <w:sz-cs w:val="21"/>
+          <w:spacing w:val="0"/>
+        </w:rPr>
+        <w:t xml:space="preserve"/>
+      </w:r>
+    </w:p>
+    <w:p>
+      <w:pPr/>
+      <w:r>
+        <w:rPr>
+          <w:rFonts w:ascii="Helvetica Neue" w:hAnsi="Helvetica Neue" w:cs="Helvetica Neue"/>
+          <w:sz w:val="21"/>
+          <w:sz-cs w:val="21"/>
           <w:spacing w:val="0"/>
         </w:rPr>
         <w:t xml:space="preserve">A machine in the house as the LAN rung and named cloud providers as the last rung, each offered by name and consented to by voice, measured end to end.</w:t>
@@ -9294,20 +10177,20 @@
       <w:r>
         <w:rPr>
           <w:rFonts w:ascii="Helvetica Neue" w:hAnsi="Helvetica Neue" w:cs="Helvetica Neue"/>
-          <w:sz w:val="22"/>
-          <w:sz-cs w:val="22"/>
-          <w:spacing w:val="0"/>
-        </w:rPr>
-        <w:t xml:space="preserve"/>
-      </w:r>
-    </w:p>
-    <w:p>
-      <w:pPr/>
-      <w:r>
-        <w:rPr>
-          <w:rFonts w:ascii="Helvetica Neue" w:hAnsi="Helvetica Neue" w:cs="Helvetica Neue"/>
-          <w:sz w:val="22"/>
-          <w:sz-cs w:val="22"/>
+          <w:sz w:val="21"/>
+          <w:sz-cs w:val="21"/>
+          <w:spacing w:val="0"/>
+        </w:rPr>
+        <w:t xml:space="preserve"/>
+      </w:r>
+    </w:p>
+    <w:p>
+      <w:pPr/>
+      <w:r>
+        <w:rPr>
+          <w:rFonts w:ascii="Helvetica Neue" w:hAnsi="Helvetica Neue" w:cs="Helvetica Neue"/>
+          <w:sz w:val="21"/>
+          <w:sz-cs w:val="21"/>
           <w:spacing w:val="0"/>
         </w:rPr>
         <w:t xml:space="preserve">the machine, provider credits, my time</w:t>
@@ -9315,20 +10198,20 @@
       <w:r>
         <w:rPr>
           <w:rFonts w:ascii="Helvetica Neue" w:hAnsi="Helvetica Neue" w:cs="Helvetica Neue"/>
-          <w:sz w:val="22"/>
-          <w:sz-cs w:val="22"/>
-          <w:spacing w:val="0"/>
-        </w:rPr>
-        <w:t xml:space="preserve"/>
-      </w:r>
-    </w:p>
-    <w:p>
-      <w:pPr/>
-      <w:r>
-        <w:rPr>
-          <w:rFonts w:ascii="Helvetica Neue" w:hAnsi="Helvetica Neue" w:cs="Helvetica Neue"/>
-          <w:sz w:val="22"/>
-          <w:sz-cs w:val="22"/>
+          <w:sz w:val="21"/>
+          <w:sz-cs w:val="21"/>
+          <w:spacing w:val="0"/>
+        </w:rPr>
+        <w:t xml:space="preserve"/>
+      </w:r>
+    </w:p>
+    <w:p>
+      <w:pPr/>
+      <w:r>
+        <w:rPr>
+          <w:rFonts w:ascii="Helvetica Neue" w:hAnsi="Helvetica Neue" w:cs="Helvetica Neue"/>
+          <w:sz w:val="21"/>
+          <w:sz-cs w:val="21"/>
           <w:b/>
           <w:spacing w:val="0"/>
         </w:rPr>
@@ -9337,20 +10220,20 @@
       <w:r>
         <w:rPr>
           <w:rFonts w:ascii="Helvetica Neue" w:hAnsi="Helvetica Neue" w:cs="Helvetica Neue"/>
-          <w:sz w:val="22"/>
-          <w:sz-cs w:val="22"/>
-          <w:spacing w:val="0"/>
-        </w:rPr>
-        <w:t xml:space="preserve"/>
-      </w:r>
-    </w:p>
-    <w:p>
-      <w:pPr/>
-      <w:r>
-        <w:rPr>
-          <w:rFonts w:ascii="Helvetica Neue" w:hAnsi="Helvetica Neue" w:cs="Helvetica Neue"/>
-          <w:sz w:val="22"/>
-          <w:sz-cs w:val="22"/>
+          <w:sz w:val="21"/>
+          <w:sz-cs w:val="21"/>
+          <w:spacing w:val="0"/>
+        </w:rPr>
+        <w:t xml:space="preserve"/>
+      </w:r>
+    </w:p>
+    <w:p>
+      <w:pPr/>
+      <w:r>
+        <w:rPr>
+          <w:rFonts w:ascii="Helvetica Neue" w:hAnsi="Helvetica Neue" w:cs="Helvetica Neue"/>
+          <w:sz w:val="21"/>
+          <w:sz-cs w:val="21"/>
           <w:spacing w:val="0"/>
         </w:rPr>
         <w:t xml:space="preserve">The encyclopedias I already own, with 65 more volumes converted and waiting today, on the card. The index gets built on a real machine and ships built, so an offline device answers from an encyclopedia in under a second.</w:t>
@@ -9358,20 +10241,20 @@
       <w:r>
         <w:rPr>
           <w:rFonts w:ascii="Helvetica Neue" w:hAnsi="Helvetica Neue" w:cs="Helvetica Neue"/>
-          <w:sz w:val="22"/>
-          <w:sz-cs w:val="22"/>
-          <w:spacing w:val="0"/>
-        </w:rPr>
-        <w:t xml:space="preserve"/>
-      </w:r>
-    </w:p>
-    <w:p>
-      <w:pPr/>
-      <w:r>
-        <w:rPr>
-          <w:rFonts w:ascii="Helvetica Neue" w:hAnsi="Helvetica Neue" w:cs="Helvetica Neue"/>
-          <w:sz w:val="22"/>
-          <w:sz-cs w:val="22"/>
+          <w:sz w:val="21"/>
+          <w:sz-cs w:val="21"/>
+          <w:spacing w:val="0"/>
+        </w:rPr>
+        <w:t xml:space="preserve"/>
+      </w:r>
+    </w:p>
+    <w:p>
+      <w:pPr/>
+      <w:r>
+        <w:rPr>
+          <w:rFonts w:ascii="Helvetica Neue" w:hAnsi="Helvetica Neue" w:cs="Helvetica Neue"/>
+          <w:sz w:val="21"/>
+          <w:sz-cs w:val="21"/>
           <w:spacing w:val="0"/>
         </w:rPr>
         <w:t xml:space="preserve">the machine, my time</w:t>
@@ -9379,20 +10262,20 @@
       <w:r>
         <w:rPr>
           <w:rFonts w:ascii="Helvetica Neue" w:hAnsi="Helvetica Neue" w:cs="Helvetica Neue"/>
-          <w:sz w:val="22"/>
-          <w:sz-cs w:val="22"/>
-          <w:spacing w:val="0"/>
-        </w:rPr>
-        <w:t xml:space="preserve"/>
-      </w:r>
-    </w:p>
-    <w:p>
-      <w:pPr/>
-      <w:r>
-        <w:rPr>
-          <w:rFonts w:ascii="Helvetica Neue" w:hAnsi="Helvetica Neue" w:cs="Helvetica Neue"/>
-          <w:sz w:val="22"/>
-          <w:sz-cs w:val="22"/>
+          <w:sz w:val="21"/>
+          <w:sz-cs w:val="21"/>
+          <w:spacing w:val="0"/>
+        </w:rPr>
+        <w:t xml:space="preserve"/>
+      </w:r>
+    </w:p>
+    <w:p>
+      <w:pPr/>
+      <w:r>
+        <w:rPr>
+          <w:rFonts w:ascii="Helvetica Neue" w:hAnsi="Helvetica Neue" w:cs="Helvetica Neue"/>
+          <w:sz w:val="21"/>
+          <w:sz-cs w:val="21"/>
           <w:b/>
           <w:spacing w:val="0"/>
         </w:rPr>
@@ -9401,20 +10284,20 @@
       <w:r>
         <w:rPr>
           <w:rFonts w:ascii="Helvetica Neue" w:hAnsi="Helvetica Neue" w:cs="Helvetica Neue"/>
-          <w:sz w:val="22"/>
-          <w:sz-cs w:val="22"/>
-          <w:spacing w:val="0"/>
-        </w:rPr>
-        <w:t xml:space="preserve"/>
-      </w:r>
-    </w:p>
-    <w:p>
-      <w:pPr/>
-      <w:r>
-        <w:rPr>
-          <w:rFonts w:ascii="Helvetica Neue" w:hAnsi="Helvetica Neue" w:cs="Helvetica Neue"/>
-          <w:sz w:val="22"/>
-          <w:sz-cs w:val="22"/>
+          <w:sz w:val="21"/>
+          <w:sz-cs w:val="21"/>
+          <w:spacing w:val="0"/>
+        </w:rPr>
+        <w:t xml:space="preserve"/>
+      </w:r>
+    </w:p>
+    <w:p>
+      <w:pPr/>
+      <w:r>
+        <w:rPr>
+          <w:rFonts w:ascii="Helvetica Neue" w:hAnsi="Helvetica Neue" w:cs="Helvetica Neue"/>
+          <w:sz w:val="21"/>
+          <w:sz-cs w:val="21"/>
           <w:spacing w:val="0"/>
         </w:rPr>
         <w:t xml:space="preserve">Two more DevKits in homes that are not mine, a month each, with false wakes, loudness and every failure read out of the logs and fixed.</w:t>
@@ -9422,20 +10305,20 @@
       <w:r>
         <w:rPr>
           <w:rFonts w:ascii="Helvetica Neue" w:hAnsi="Helvetica Neue" w:cs="Helvetica Neue"/>
-          <w:sz w:val="22"/>
-          <w:sz-cs w:val="22"/>
-          <w:spacing w:val="0"/>
-        </w:rPr>
-        <w:t xml:space="preserve"/>
-      </w:r>
-    </w:p>
-    <w:p>
-      <w:pPr/>
-      <w:r>
-        <w:rPr>
-          <w:rFonts w:ascii="Helvetica Neue" w:hAnsi="Helvetica Neue" w:cs="Helvetica Neue"/>
-          <w:sz w:val="22"/>
-          <w:sz-cs w:val="22"/>
+          <w:sz w:val="21"/>
+          <w:sz-cs w:val="21"/>
+          <w:spacing w:val="0"/>
+        </w:rPr>
+        <w:t xml:space="preserve"/>
+      </w:r>
+    </w:p>
+    <w:p>
+      <w:pPr/>
+      <w:r>
+        <w:rPr>
+          <w:rFonts w:ascii="Helvetica Neue" w:hAnsi="Helvetica Neue" w:cs="Helvetica Neue"/>
+          <w:sz w:val="21"/>
+          <w:sz-cs w:val="21"/>
           <w:spacing w:val="0"/>
         </w:rPr>
         <w:t xml:space="preserve">two DevKits, speakers and microphones for testing, travel, my time</w:t>
@@ -9443,20 +10326,20 @@
       <w:r>
         <w:rPr>
           <w:rFonts w:ascii="Helvetica Neue" w:hAnsi="Helvetica Neue" w:cs="Helvetica Neue"/>
-          <w:sz w:val="22"/>
-          <w:sz-cs w:val="22"/>
-          <w:spacing w:val="0"/>
-        </w:rPr>
-        <w:t xml:space="preserve"/>
-      </w:r>
-    </w:p>
-    <w:p>
-      <w:pPr/>
-      <w:r>
-        <w:rPr>
-          <w:rFonts w:ascii="Helvetica Neue" w:hAnsi="Helvetica Neue" w:cs="Helvetica Neue"/>
-          <w:sz w:val="22"/>
-          <w:sz-cs w:val="22"/>
+          <w:sz w:val="21"/>
+          <w:sz-cs w:val="21"/>
+          <w:spacing w:val="0"/>
+        </w:rPr>
+        <w:t xml:space="preserve"/>
+      </w:r>
+    </w:p>
+    <w:p>
+      <w:pPr/>
+      <w:r>
+        <w:rPr>
+          <w:rFonts w:ascii="Helvetica Neue" w:hAnsi="Helvetica Neue" w:cs="Helvetica Neue"/>
+          <w:sz w:val="21"/>
+          <w:sz-cs w:val="21"/>
           <w:b/>
           <w:spacing w:val="0"/>
         </w:rPr>
@@ -9465,20 +10348,20 @@
       <w:r>
         <w:rPr>
           <w:rFonts w:ascii="Helvetica Neue" w:hAnsi="Helvetica Neue" w:cs="Helvetica Neue"/>
-          <w:sz w:val="22"/>
-          <w:sz-cs w:val="22"/>
-          <w:spacing w:val="0"/>
-        </w:rPr>
-        <w:t xml:space="preserve"/>
-      </w:r>
-    </w:p>
-    <w:p>
-      <w:pPr/>
-      <w:r>
-        <w:rPr>
-          <w:rFonts w:ascii="Helvetica Neue" w:hAnsi="Helvetica Neue" w:cs="Helvetica Neue"/>
-          <w:sz w:val="22"/>
-          <w:sz-cs w:val="22"/>
+          <w:sz w:val="21"/>
+          <w:sz-cs w:val="21"/>
+          <w:spacing w:val="0"/>
+        </w:rPr>
+        <w:t xml:space="preserve"/>
+      </w:r>
+    </w:p>
+    <w:p>
+      <w:pPr/>
+      <w:r>
+        <w:rPr>
+          <w:rFonts w:ascii="Helvetica Neue" w:hAnsi="Helvetica Neue" w:cs="Helvetica Neue"/>
+          <w:sz w:val="21"/>
+          <w:sz-cs w:val="21"/>
           <w:spacing w:val="0"/>
         </w:rPr>
         <w:t xml:space="preserve">My own inference and transformer work applied to the one tier that still uses a stock model, trained and evaluated completely on the machine, so the device can hold a conversation the way it holds a fact.</w:t>
@@ -9486,20 +10369,20 @@
       <w:r>
         <w:rPr>
           <w:rFonts w:ascii="Helvetica Neue" w:hAnsi="Helvetica Neue" w:cs="Helvetica Neue"/>
-          <w:sz w:val="22"/>
-          <w:sz-cs w:val="22"/>
-          <w:spacing w:val="0"/>
-        </w:rPr>
-        <w:t xml:space="preserve"/>
-      </w:r>
-    </w:p>
-    <w:p>
-      <w:pPr/>
-      <w:r>
-        <w:rPr>
-          <w:rFonts w:ascii="Helvetica Neue" w:hAnsi="Helvetica Neue" w:cs="Helvetica Neue"/>
-          <w:sz w:val="22"/>
-          <w:sz-cs w:val="22"/>
+          <w:sz w:val="21"/>
+          <w:sz-cs w:val="21"/>
+          <w:spacing w:val="0"/>
+        </w:rPr>
+        <w:t xml:space="preserve"/>
+      </w:r>
+    </w:p>
+    <w:p>
+      <w:pPr/>
+      <w:r>
+        <w:rPr>
+          <w:rFonts w:ascii="Helvetica Neue" w:hAnsi="Helvetica Neue" w:cs="Helvetica Neue"/>
+          <w:sz w:val="21"/>
+          <w:sz-cs w:val="21"/>
           <w:spacing w:val="0"/>
         </w:rPr>
         <w:t xml:space="preserve">training compute, frontier model access for evaluation, my time</w:t>
@@ -9507,8 +10390,8 @@
       <w:r>
         <w:rPr>
           <w:rFonts w:ascii="Helvetica Neue" w:hAnsi="Helvetica Neue" w:cs="Helvetica Neue"/>
-          <w:sz w:val="22"/>
-          <w:sz-cs w:val="22"/>
+          <w:sz w:val="21"/>
+          <w:sz-cs w:val="21"/>
           <w:spacing w:val="0"/>
         </w:rPr>
         <w:t xml:space="preserve"/>
@@ -9574,7 +10457,7 @@
           <w:b/>
           <w:spacing w:val="0"/>
         </w:rPr>
-        <w:t xml:space="preserve">The machine</w:t>
+        <w:t xml:space="preserve">Hardware, by level</w:t>
       </w:r>
       <w:r>
         <w:rPr>
@@ -9598,7 +10481,7 @@
           <w:sz-cs w:val="25"/>
           <w:spacing w:val="0"/>
         </w:rPr>
-        <w:t xml:space="preserve">The single purchase that changes what I can do is a Minisforum MS-S1 MAX in the 128 GB unified-memory edition: an AMD Ryzen AI Max+ 395, Radeon 8060S graphics, a 2 TB SSD and dual 10 GbE. It is $3,799 on the maker's store today and $4,749 at list, and a Mac Studio at the same level does the same job.</w:t>
+        <w:t xml:space="preserve">I'm upfront about my limits because they are the reason I'm asking. Today the training lane is a 16 GB Mac mini and a 6 GB RTX 2060 that cannot hold a training run. There are levels, and each one buys real speed.</w:t>
       </w:r>
       <w:r>
         <w:rPr>
@@ -9612,22 +10495,140 @@
     </w:p>
     <w:p>
       <w:pPr>
-        <w:spacing w:after="158"/>
+        <w:ind w:left="720" w:first-line="-720"/>
+        <w:spacing w:after="45"/>
       </w:pPr>
       <w:r>
         <w:rPr>
           <w:rFonts w:ascii="Helvetica Neue" w:hAnsi="Helvetica Neue" w:cs="Helvetica Neue"/>
-          <w:sz w:val="25"/>
-          <w:sz-cs w:val="25"/>
-          <w:spacing w:val="0"/>
-        </w:rPr>
-        <w:t xml:space="preserve">Memory the GPU can use is the point. 128 GB holds a 70-billion-parameter model quantised, so I can train and run the comprehension tier at home. The same machine builds the library index in minutes instead of hours on the Pi, and it serves as the LAN rung for milestone 2.</w:t>
-      </w:r>
-      <w:r>
-        <w:rPr>
-          <w:rFonts w:ascii="Helvetica Neue" w:hAnsi="Helvetica Neue" w:cs="Helvetica Neue"/>
-          <w:sz w:val="25"/>
-          <w:sz-cs w:val="25"/>
+          <w:sz w:val="23"/>
+          <w:sz-cs w:val="23"/>
+          <w:b/>
+        </w:rPr>
+        <w:t xml:space="preserve"/>
+        <w:tab/>
+        <w:t xml:space="preserve">•</w:t>
+        <w:tab/>
+        <w:t xml:space="preserve"/>
+      </w:r>
+      <w:r>
+        <w:rPr>
+          <w:rFonts w:ascii="Helvetica Neue" w:hAnsi="Helvetica Neue" w:cs="Helvetica Neue"/>
+          <w:sz w:val="23"/>
+          <w:sz-cs w:val="23"/>
+          <w:b/>
+          <w:spacing w:val="0"/>
+        </w:rPr>
+        <w:t xml:space="preserve">$2,000 to $5,000.</w:t>
+      </w:r>
+      <w:r>
+        <w:rPr>
+          <w:rFonts w:ascii="Helvetica Neue" w:hAnsi="Helvetica Neue" w:cs="Helvetica Neue"/>
+          <w:sz w:val="23"/>
+          <w:sz-cs w:val="23"/>
+          <w:spacing w:val="0"/>
+        </w:rPr>
+        <w:t xml:space="preserve"> A GPU with real memory, plus RAM for my second machine. That alone moves training and the library index off the mini and onto a card that can hold them.</w:t>
+      </w:r>
+      <w:r>
+        <w:rPr>
+          <w:rFonts w:ascii="Helvetica Neue" w:hAnsi="Helvetica Neue" w:cs="Helvetica Neue"/>
+          <w:sz w:val="23"/>
+          <w:sz-cs w:val="23"/>
+          <w:spacing w:val="0"/>
+        </w:rPr>
+        <w:t xml:space="preserve"/>
+      </w:r>
+    </w:p>
+    <w:p>
+      <w:pPr>
+        <w:ind w:left="720" w:first-line="-720"/>
+        <w:spacing w:after="45"/>
+      </w:pPr>
+      <w:r>
+        <w:rPr>
+          <w:rFonts w:ascii="Helvetica Neue" w:hAnsi="Helvetica Neue" w:cs="Helvetica Neue"/>
+          <w:sz w:val="23"/>
+          <w:sz-cs w:val="23"/>
+          <w:b/>
+        </w:rPr>
+        <w:t xml:space="preserve"/>
+        <w:tab/>
+        <w:t xml:space="preserve">•</w:t>
+        <w:tab/>
+        <w:t xml:space="preserve"/>
+      </w:r>
+      <w:r>
+        <w:rPr>
+          <w:rFonts w:ascii="Helvetica Neue" w:hAnsi="Helvetica Neue" w:cs="Helvetica Neue"/>
+          <w:sz w:val="23"/>
+          <w:sz-cs w:val="23"/>
+          <w:b/>
+          <w:spacing w:val="0"/>
+        </w:rPr>
+        <w:t xml:space="preserve">$3,800 to $4,750.</w:t>
+      </w:r>
+      <w:r>
+        <w:rPr>
+          <w:rFonts w:ascii="Helvetica Neue" w:hAnsi="Helvetica Neue" w:cs="Helvetica Neue"/>
+          <w:sz w:val="23"/>
+          <w:sz-cs w:val="23"/>
+          <w:spacing w:val="0"/>
+        </w:rPr>
+        <w:t xml:space="preserve"> A Minisforum MS-S1 MAX with 128 GB of unified memory, a Ryzen AI Max+ 395, Radeon 8060S graphics and a 2 TB SSD, at $3,799 on the maker's store today, or a Mac Studio at the same level. 128 GB the GPU can use holds a 70-billion-parameter model quantised.</w:t>
+      </w:r>
+      <w:r>
+        <w:rPr>
+          <w:rFonts w:ascii="Helvetica Neue" w:hAnsi="Helvetica Neue" w:cs="Helvetica Neue"/>
+          <w:sz w:val="23"/>
+          <w:sz-cs w:val="23"/>
+          <w:spacing w:val="0"/>
+        </w:rPr>
+        <w:t xml:space="preserve"/>
+      </w:r>
+    </w:p>
+    <w:p>
+      <w:pPr>
+        <w:ind w:left="720" w:first-line="-720"/>
+        <w:spacing w:after="45"/>
+      </w:pPr>
+      <w:r>
+        <w:rPr>
+          <w:rFonts w:ascii="Helvetica Neue" w:hAnsi="Helvetica Neue" w:cs="Helvetica Neue"/>
+          <w:sz w:val="23"/>
+          <w:sz-cs w:val="23"/>
+          <w:b/>
+        </w:rPr>
+        <w:t xml:space="preserve"/>
+        <w:tab/>
+        <w:t xml:space="preserve">•</w:t>
+        <w:tab/>
+        <w:t xml:space="preserve"/>
+      </w:r>
+      <w:r>
+        <w:rPr>
+          <w:rFonts w:ascii="Helvetica Neue" w:hAnsi="Helvetica Neue" w:cs="Helvetica Neue"/>
+          <w:sz w:val="23"/>
+          <w:sz-cs w:val="23"/>
+          <w:b/>
+          <w:spacing w:val="0"/>
+        </w:rPr>
+        <w:t xml:space="preserve">The full build.</w:t>
+      </w:r>
+      <w:r>
+        <w:rPr>
+          <w:rFonts w:ascii="Helvetica Neue" w:hAnsi="Helvetica Neue" w:cs="Helvetica Neue"/>
+          <w:sz w:val="23"/>
+          <w:sz-cs w:val="23"/>
+          <w:spacing w:val="0"/>
+        </w:rPr>
+        <w:t xml:space="preserve"> A board with two full-lane PCIe slots, two cards at 32 to 48 GB of VRAM each, and the RAM to match. That is the machine that trains the comprehension tier and serves the LAN rung at once.</w:t>
+      </w:r>
+      <w:r>
+        <w:rPr>
+          <w:rFonts w:ascii="Helvetica Neue" w:hAnsi="Helvetica Neue" w:cs="Helvetica Neue"/>
+          <w:sz w:val="23"/>
+          <w:sz-cs w:val="23"/>
           <w:spacing w:val="0"/>
         </w:rPr>
         <w:t xml:space="preserve"/>

</xml_diff>

<commit_message>
The library after this morning: 397,706 passages, 660 MB, the 65 DK volumes on the card; every document and the handout say so
</commit_message>
<xml_diff>
--- a/handout/OpenBrain-Handout.docx
+++ b/handout/OpenBrain-Handout.docx
@@ -3363,7 +3363,7 @@
           <w:sz-cs w:val="23"/>
           <w:spacing w:val="0"/>
         </w:rPr>
-        <w:t xml:space="preserve">The card is what makes the upper tiers possible here rather than somewhere else: the dictionary is Open English WordNet with 135,969 lexemes and 107,519 defined senses; the comprehension core reads against 133,218 dictionary entries and 52,571 phrases from a 456 MB data set; 308,952 indexed passages sit beside them. A LAN route exists for anything the device cannot hold, and today nothing in this table needs it.</w:t>
+        <w:t xml:space="preserve">The card is what makes the upper tiers possible here rather than somewhere else: the dictionary is Open English WordNet with 135,969 lexemes and 107,519 defined senses; the comprehension core reads against 133,218 dictionary entries and 52,571 phrases from a 456 MB data set; 397,706 indexed passages sit beside them. A LAN route exists for anything the device cannot hold, and today nothing in this table needs it.</w:t>
       </w:r>
       <w:r>
         <w:rPr>
@@ -7675,7 +7675,7 @@
           <w:sz-cs w:val="20"/>
           <w:spacing w:val="0"/>
         </w:rPr>
-        <w:t xml:space="preserve">On the card: 57 reference files and a 570 MB index over 308,952 passages, holding the 24 Encyclopedia of Physical Science and Technology volumes, Britannica across 29 files, the seven-volume World History set, the Encyclopedia of Computer Science, and Ancient and Forbidden Knowledge. Staged and converting today: 65 DK volumes, 6.4 GB of PDFs.</w:t>
+        <w:t xml:space="preserve">On the card: 57 reference files and a 660 MB index over 397,706 passages, holding the 24 Encyclopedia of Physical Science and Technology volumes, Britannica across 29 files, the seven-volume World History set, the Encyclopedia of Computer Science, and Ancient and Forbidden Knowledge. Staged and converting today: 65 DK volumes, 6.4 GB of PDFs.</w:t>
       </w:r>
       <w:r>
         <w:rPr>
@@ -10236,7 +10236,7 @@
           <w:sz-cs w:val="21"/>
           <w:spacing w:val="0"/>
         </w:rPr>
-        <w:t xml:space="preserve">The encyclopedias I already own, with 65 more volumes converted and waiting today, on the card. The index gets built on a real machine and ships built, so an offline device answers from an encyclopedia in under a second.</w:t>
+        <w:t xml:space="preserve">The encyclopedias I already own, with 65 DK volumes on the card and indexed today, on the card. The index gets built on a real machine and ships built, so an offline device answers from an encyclopedia in under a second.</w:t>
       </w:r>
       <w:r>
         <w:rPr>
@@ -12795,7 +12795,7 @@
           <w:sz-cs w:val="22"/>
           <w:spacing w:val="0"/>
         </w:rPr>
-        <w:t xml:space="preserve">the SQLite index on the card (570 MB)</w:t>
+        <w:t xml:space="preserve">the SQLite index on the card (660 MB)</w:t>
       </w:r>
       <w:r>
         <w:rPr>
@@ -13033,7 +13033,7 @@
           <w:sz-cs w:val="22"/>
           <w:spacing w:val="0"/>
         </w:rPr>
-        <w:t xml:space="preserve">full-text search across the books, then the reference shelf (~300k passages)</w:t>
+        <w:t xml:space="preserve">full-text search across the books, then the reference shelf (~400k passages)</w:t>
       </w:r>
       <w:r>
         <w:rPr>
@@ -14313,7 +14313,7 @@
           <w:sz-cs w:val="19"/>
           <w:spacing w:val="0"/>
         </w:rPr>
-        <w:t xml:space="preserve">library index on the card, SQLite, 570 MB</w:t>
+        <w:t xml:space="preserve">library index on the card, SQLite, 660 MB</w:t>
       </w:r>
       <w:r>
         <w:rPr>
@@ -14539,7 +14539,7 @@
           <w:sz-cs w:val="19"/>
           <w:spacing w:val="0"/>
         </w:rPr>
-        <w:t xml:space="preserve">books, then the reference shelf, ~300k passages</w:t>
+        <w:t xml:space="preserve">books, then the reference shelf, ~400k passages</w:t>
       </w:r>
       <w:r>
         <w:rPr>

</xml_diff>

<commit_message>
The handout's previous-work page says what I built: the harness, MECH, Q OS, the ecosystem, the games
</commit_message>
<xml_diff>
--- a/handout/OpenBrain-Handout.docx
+++ b/handout/OpenBrain-Handout.docx
@@ -6712,7 +6712,7 @@
           <w:sz-cs w:val="25"/>
           <w:spacing w:val="0"/>
         </w:rPr>
-        <w:t xml:space="preserve">Prime directives gate what any process may do; product isolation keeps two projects from ever being conflated into one build path; and a coordination bus makes a process claim the work before it touches anything.</w:t>
+        <w:t xml:space="preserve">It is model-agnostic orchestration with a delegation hierarchy, persistent memory, budgets and a task board, and it routed the work on this project. Prime directives set what any process may do, product isolation keeps two projects from being conflated into one build path, and a coordination bus makes a process claim the work before it touches anything.</w:t>
       </w:r>
       <w:r>
         <w:rPr>
@@ -6760,7 +6760,7 @@
           <w:sz-cs w:val="25"/>
           <w:spacing w:val="0"/>
         </w:rPr>
-        <w:t xml:space="preserve">Its law is that a reading becomes a </w:t>
+        <w:t xml:space="preserve">It carries no model weights and does no sampling. Its law is that a reading becomes a </w:t>
       </w:r>
       <w:r>
         <w:rPr>
@@ -7954,7 +7954,7 @@
           <w:sz-cs w:val="27"/>
           <w:spacing w:val="0"/>
         </w:rPr>
-        <w:t xml:space="preserve">Three public repositories in the OpenHome ecosystem, and the private stack the DevKit work is cut from.</w:t>
+        <w:t xml:space="preserve">The work I'm proudest of is the harness and the engines under it. This device is the small end of that, and the first piece to ship through someone else's review.</w:t>
       </w:r>
       <w:r>
         <w:rPr>
@@ -7967,30 +7967,203 @@
       </w:r>
     </w:p>
     <w:p>
-      <w:pPr>
-        <w:spacing w:after="158"/>
-      </w:pPr>
-      <w:r>
-        <w:rPr>
-          <w:rFonts w:ascii="Helvetica Neue" w:hAnsi="Helvetica Neue" w:cs="Helvetica Neue"/>
-          <w:sz w:val="25"/>
-          <w:sz-cs w:val="25"/>
-          <w:spacing w:val="0"/>
-        </w:rPr>
-        <w:t xml:space="preserve">I already ship into OpenHome, specifically into the ability system. The ability in this handout is public, the abilities repository is public, and the command-line tool I wrote for deploying and validating abilities is public. The engine underneath stays private, and I am happy to open any of it for review on request. The rest of the list is here because it is the same discipline applied to other problems, and because two of those private repositories run on the DevKit today.</w:t>
-      </w:r>
-      <w:r>
-        <w:rPr>
-          <w:rFonts w:ascii="Helvetica Neue" w:hAnsi="Helvetica Neue" w:cs="Helvetica Neue"/>
-          <w:sz w:val="25"/>
-          <w:sz-cs w:val="25"/>
-          <w:spacing w:val="0"/>
-        </w:rPr>
-        <w:t xml:space="preserve"/>
-      </w:r>
-    </w:p>
-    <w:p>
-      <w:pPr/>
+      <w:pPr/>
+      <w:r>
+        <w:rPr>
+          <w:rFonts w:ascii="Helvetica Neue" w:hAnsi="Helvetica Neue" w:cs="Helvetica Neue"/>
+          <w:sz w:val="20"/>
+          <w:sz-cs w:val="20"/>
+          <w:b/>
+          <w:spacing w:val="0"/>
+        </w:rPr>
+        <w:t xml:space="preserve">PROJECT</w:t>
+      </w:r>
+      <w:r>
+        <w:rPr>
+          <w:rFonts w:ascii="Helvetica Neue" w:hAnsi="Helvetica Neue" w:cs="Helvetica Neue"/>
+          <w:sz w:val="20"/>
+          <w:sz-cs w:val="20"/>
+          <w:b/>
+          <w:spacing w:val="0"/>
+        </w:rPr>
+        <w:t xml:space="preserve"/>
+      </w:r>
+    </w:p>
+    <w:p>
+      <w:pPr/>
+      <w:r>
+        <w:rPr>
+          <w:rFonts w:ascii="Helvetica Neue" w:hAnsi="Helvetica Neue" w:cs="Helvetica Neue"/>
+          <w:sz w:val="20"/>
+          <w:sz-cs w:val="20"/>
+          <w:b/>
+          <w:spacing w:val="0"/>
+        </w:rPr>
+        <w:t xml:space="preserve">LANGUAGE</w:t>
+      </w:r>
+      <w:r>
+        <w:rPr>
+          <w:rFonts w:ascii="Helvetica Neue" w:hAnsi="Helvetica Neue" w:cs="Helvetica Neue"/>
+          <w:sz w:val="20"/>
+          <w:sz-cs w:val="20"/>
+          <w:b/>
+          <w:spacing w:val="0"/>
+        </w:rPr>
+        <w:t xml:space="preserve"/>
+      </w:r>
+    </w:p>
+    <w:p>
+      <w:pPr/>
+      <w:r>
+        <w:rPr>
+          <w:rFonts w:ascii="Helvetica Neue" w:hAnsi="Helvetica Neue" w:cs="Helvetica Neue"/>
+          <w:sz w:val="20"/>
+          <w:sz-cs w:val="20"/>
+          <w:b/>
+          <w:spacing w:val="0"/>
+        </w:rPr>
+        <w:t xml:space="preserve">AVAILABILITY</w:t>
+      </w:r>
+      <w:r>
+        <w:rPr>
+          <w:rFonts w:ascii="Helvetica Neue" w:hAnsi="Helvetica Neue" w:cs="Helvetica Neue"/>
+          <w:sz w:val="20"/>
+          <w:sz-cs w:val="20"/>
+          <w:b/>
+          <w:spacing w:val="0"/>
+        </w:rPr>
+        <w:t xml:space="preserve"/>
+      </w:r>
+    </w:p>
+    <w:p>
+      <w:pPr/>
+      <w:r>
+        <w:rPr>
+          <w:rFonts w:ascii="Helvetica Neue" w:hAnsi="Helvetica Neue" w:cs="Helvetica Neue"/>
+          <w:sz w:val="20"/>
+          <w:sz-cs w:val="20"/>
+          <w:b/>
+          <w:spacing w:val="0"/>
+        </w:rPr>
+        <w:t xml:space="preserve">WHAT IT IS</w:t>
+      </w:r>
+      <w:r>
+        <w:rPr>
+          <w:rFonts w:ascii="Helvetica Neue" w:hAnsi="Helvetica Neue" w:cs="Helvetica Neue"/>
+          <w:sz w:val="20"/>
+          <w:sz-cs w:val="20"/>
+          <w:b/>
+          <w:spacing w:val="0"/>
+        </w:rPr>
+        <w:t xml:space="preserve"/>
+      </w:r>
+    </w:p>
+    <w:p>
+      <w:pPr/>
+      <w:r>
+        <w:rPr>
+          <w:rFonts w:ascii="Helvetica Neue" w:hAnsi="Helvetica Neue" w:cs="Helvetica Neue"/>
+          <w:sz w:val="20"/>
+          <w:sz-cs w:val="20"/>
+          <w:b/>
+          <w:spacing w:val="0"/>
+        </w:rPr>
+        <w:t xml:space="preserve">Astral Brain Engine</w:t>
+      </w:r>
+      <w:r>
+        <w:rPr>
+          <w:rFonts w:ascii="Helvetica Neue" w:hAnsi="Helvetica Neue" w:cs="Helvetica Neue"/>
+          <w:sz w:val="20"/>
+          <w:sz-cs w:val="20"/>
+          <w:spacing w:val="0"/>
+        </w:rPr>
+        <w:t xml:space="preserve"/>
+      </w:r>
+    </w:p>
+    <w:p>
+      <w:pPr/>
+      <w:r>
+        <w:rPr>
+          <w:rFonts w:ascii="Helvetica Neue" w:hAnsi="Helvetica Neue" w:cs="Helvetica Neue"/>
+          <w:sz w:val="20"/>
+          <w:sz-cs w:val="20"/>
+          <w:spacing w:val="0"/>
+        </w:rPr>
+        <w:t xml:space="preserve">Python, Rust, Shell, Dart</w:t>
+      </w:r>
+      <w:r>
+        <w:rPr>
+          <w:rFonts w:ascii="Helvetica Neue" w:hAnsi="Helvetica Neue" w:cs="Helvetica Neue"/>
+          <w:sz w:val="20"/>
+          <w:sz-cs w:val="20"/>
+          <w:spacing w:val="0"/>
+        </w:rPr>
+        <w:t xml:space="preserve"/>
+      </w:r>
+    </w:p>
+    <w:p>
+      <w:pPr/>
+      <w:r>
+        <w:rPr>
+          <w:rFonts w:ascii="Helvetica Neue" w:hAnsi="Helvetica Neue" w:cs="Helvetica Neue"/>
+          <w:sz w:val="20"/>
+          <w:sz-cs w:val="20"/>
+          <w:spacing w:val="0"/>
+        </w:rPr>
+        <w:t xml:space="preserve">private</w:t>
+      </w:r>
+      <w:r>
+        <w:rPr>
+          <w:rFonts w:ascii="Helvetica Neue" w:hAnsi="Helvetica Neue" w:cs="Helvetica Neue"/>
+          <w:sz w:val="20"/>
+          <w:sz-cs w:val="20"/>
+          <w:spacing w:val="0"/>
+        </w:rPr>
+        <w:t xml:space="preserve"/>
+      </w:r>
+    </w:p>
+    <w:p>
+      <w:pPr/>
+      <w:r>
+        <w:rPr>
+          <w:rFonts w:ascii="Helvetica Neue" w:hAnsi="Helvetica Neue" w:cs="Helvetica Neue"/>
+          <w:sz w:val="20"/>
+          <w:sz-cs w:val="20"/>
+          <w:spacing w:val="0"/>
+        </w:rPr>
+        <w:t xml:space="preserve">The harness. A model-agnostic orchestration layer with a delegation hierarchy, persistent memory, budgets and a task board. 607 commits. It routed the work on this project.</w:t>
+      </w:r>
+      <w:r>
+        <w:rPr>
+          <w:rFonts w:ascii="Helvetica Neue" w:hAnsi="Helvetica Neue" w:cs="Helvetica Neue"/>
+          <w:sz w:val="20"/>
+          <w:sz-cs w:val="20"/>
+          <w:spacing w:val="0"/>
+        </w:rPr>
+        <w:t xml:space="preserve"/>
+      </w:r>
+    </w:p>
+    <w:p>
+      <w:pPr/>
+      <w:r>
+        <w:rPr>
+          <w:rFonts w:ascii="Helvetica Neue" w:hAnsi="Helvetica Neue" w:cs="Helvetica Neue"/>
+          <w:sz w:val="20"/>
+          <w:sz-cs w:val="20"/>
+          <w:b/>
+          <w:spacing w:val="0"/>
+        </w:rPr>
+        <w:t xml:space="preserve">Strata</w:t>
+      </w:r>
+      <w:r>
+        <w:rPr>
+          <w:rFonts w:ascii="Helvetica Neue" w:hAnsi="Helvetica Neue" w:cs="Helvetica Neue"/>
+          <w:sz w:val="20"/>
+          <w:sz-cs w:val="20"/>
+          <w:spacing w:val="0"/>
+        </w:rPr>
+        <w:t xml:space="preserve"> </w:t>
+      </w:r>
       <w:r>
         <w:rPr>
           <w:rFonts w:ascii="Helvetica Neue" w:hAnsi="Helvetica Neue" w:cs="Helvetica Neue"/>
@@ -7999,7 +8172,186 @@
           <w:spacing w:val="0"/>
           <w:color w:val="393939"/>
         </w:rPr>
-        <w:t xml:space="preserve">My repositories under the account Jmesmykil, ordered by what matters to this conversation.</w:t>
+        <w:t xml:space="preserve">(Astral MECH)</w:t>
+      </w:r>
+      <w:r>
+        <w:rPr>
+          <w:rFonts w:ascii="Helvetica Neue" w:hAnsi="Helvetica Neue" w:cs="Helvetica Neue"/>
+          <w:sz w:val="20"/>
+          <w:sz-cs w:val="20"/>
+          <w:spacing w:val="0"/>
+        </w:rPr>
+        <w:t xml:space="preserve"/>
+      </w:r>
+    </w:p>
+    <w:p>
+      <w:pPr/>
+      <w:r>
+        <w:rPr>
+          <w:rFonts w:ascii="Helvetica Neue" w:hAnsi="Helvetica Neue" w:cs="Helvetica Neue"/>
+          <w:sz w:val="20"/>
+          <w:sz-cs w:val="20"/>
+          <w:spacing w:val="0"/>
+        </w:rPr>
+        <w:t xml:space="preserve">Julia, Rust, Ada SPARK</w:t>
+      </w:r>
+      <w:r>
+        <w:rPr>
+          <w:rFonts w:ascii="Helvetica Neue" w:hAnsi="Helvetica Neue" w:cs="Helvetica Neue"/>
+          <w:sz w:val="20"/>
+          <w:sz-cs w:val="20"/>
+          <w:spacing w:val="0"/>
+        </w:rPr>
+        <w:t xml:space="preserve"/>
+      </w:r>
+    </w:p>
+    <w:p>
+      <w:pPr/>
+      <w:r>
+        <w:rPr>
+          <w:rFonts w:ascii="Helvetica Neue" w:hAnsi="Helvetica Neue" w:cs="Helvetica Neue"/>
+          <w:sz w:val="20"/>
+          <w:sz-cs w:val="20"/>
+          <w:spacing w:val="0"/>
+        </w:rPr>
+        <w:t xml:space="preserve">private</w:t>
+      </w:r>
+      <w:r>
+        <w:rPr>
+          <w:rFonts w:ascii="Helvetica Neue" w:hAnsi="Helvetica Neue" w:cs="Helvetica Neue"/>
+          <w:sz w:val="20"/>
+          <w:sz-cs w:val="20"/>
+          <w:spacing w:val="0"/>
+        </w:rPr>
+        <w:t xml:space="preserve"/>
+      </w:r>
+    </w:p>
+    <w:p>
+      <w:pPr/>
+      <w:r>
+        <w:rPr>
+          <w:rFonts w:ascii="Helvetica Neue" w:hAnsi="Helvetica Neue" w:cs="Helvetica Neue"/>
+          <w:sz w:val="20"/>
+          <w:sz-cs w:val="20"/>
+          <w:spacing w:val="0"/>
+        </w:rPr>
+        <w:t xml:space="preserve">A language comprehension engine with no model weights and no sampling: a typed role graph for every sentence, memory that keeps its sources, byte-identical output for the same input, and an honest refusal when it cannot read. 436 commits. Ships as a signed macOS app over a Flutter surface.</w:t>
+      </w:r>
+      <w:r>
+        <w:rPr>
+          <w:rFonts w:ascii="Helvetica Neue" w:hAnsi="Helvetica Neue" w:cs="Helvetica Neue"/>
+          <w:sz w:val="20"/>
+          <w:sz-cs w:val="20"/>
+          <w:spacing w:val="0"/>
+        </w:rPr>
+        <w:t xml:space="preserve"/>
+      </w:r>
+    </w:p>
+    <w:p>
+      <w:pPr/>
+      <w:r>
+        <w:rPr>
+          <w:rFonts w:ascii="Helvetica Neue" w:hAnsi="Helvetica Neue" w:cs="Helvetica Neue"/>
+          <w:sz w:val="20"/>
+          <w:sz-cs w:val="20"/>
+          <w:b/>
+          <w:spacing w:val="0"/>
+        </w:rPr>
+        <w:t xml:space="preserve">Slate</w:t>
+      </w:r>
+      <w:r>
+        <w:rPr>
+          <w:rFonts w:ascii="Helvetica Neue" w:hAnsi="Helvetica Neue" w:cs="Helvetica Neue"/>
+          <w:sz w:val="20"/>
+          <w:sz-cs w:val="20"/>
+          <w:spacing w:val="0"/>
+        </w:rPr>
+        <w:t xml:space="preserve"/>
+      </w:r>
+    </w:p>
+    <w:p>
+      <w:pPr/>
+      <w:r>
+        <w:rPr>
+          <w:rFonts w:ascii="Helvetica Neue" w:hAnsi="Helvetica Neue" w:cs="Helvetica Neue"/>
+          <w:sz w:val="20"/>
+          <w:sz-cs w:val="20"/>
+          <w:spacing w:val="0"/>
+        </w:rPr>
+        <w:t xml:space="preserve">Julia</w:t>
+      </w:r>
+      <w:r>
+        <w:rPr>
+          <w:rFonts w:ascii="Helvetica Neue" w:hAnsi="Helvetica Neue" w:cs="Helvetica Neue"/>
+          <w:sz w:val="20"/>
+          <w:sz-cs w:val="20"/>
+          <w:spacing w:val="0"/>
+        </w:rPr>
+        <w:t xml:space="preserve"/>
+      </w:r>
+    </w:p>
+    <w:p>
+      <w:pPr/>
+      <w:r>
+        <w:rPr>
+          <w:rFonts w:ascii="Helvetica Neue" w:hAnsi="Helvetica Neue" w:cs="Helvetica Neue"/>
+          <w:sz w:val="20"/>
+          <w:sz-cs w:val="20"/>
+          <w:spacing w:val="0"/>
+        </w:rPr>
+        <w:t xml:space="preserve">private</w:t>
+      </w:r>
+      <w:r>
+        <w:rPr>
+          <w:rFonts w:ascii="Helvetica Neue" w:hAnsi="Helvetica Neue" w:cs="Helvetica Neue"/>
+          <w:sz w:val="20"/>
+          <w:sz-cs w:val="20"/>
+          <w:spacing w:val="0"/>
+        </w:rPr>
+        <w:t xml:space="preserve"/>
+      </w:r>
+    </w:p>
+    <w:p>
+      <w:pPr/>
+      <w:r>
+        <w:rPr>
+          <w:rFonts w:ascii="Helvetica Neue" w:hAnsi="Helvetica Neue" w:cs="Helvetica Neue"/>
+          <w:sz w:val="20"/>
+          <w:sz-cs w:val="20"/>
+          <w:spacing w:val="0"/>
+        </w:rPr>
+        <w:t xml:space="preserve">The mathematics lane. It runs on the DevKit today as the kernel service.</w:t>
+      </w:r>
+      <w:r>
+        <w:rPr>
+          <w:rFonts w:ascii="Helvetica Neue" w:hAnsi="Helvetica Neue" w:cs="Helvetica Neue"/>
+          <w:sz w:val="20"/>
+          <w:sz-cs w:val="20"/>
+          <w:spacing w:val="0"/>
+        </w:rPr>
+        <w:t xml:space="preserve"/>
+      </w:r>
+    </w:p>
+    <w:p>
+      <w:pPr/>
+      <w:r>
+        <w:rPr>
+          <w:rFonts w:ascii="Helvetica Neue" w:hAnsi="Helvetica Neue" w:cs="Helvetica Neue"/>
+          <w:sz w:val="20"/>
+          <w:sz-cs w:val="20"/>
+          <w:b/>
+          <w:spacing w:val="0"/>
+        </w:rPr>
+        <w:t xml:space="preserve">Q OS</w:t>
+      </w:r>
+      <w:r>
+        <w:rPr>
+          <w:rFonts w:ascii="Helvetica Neue" w:hAnsi="Helvetica Neue" w:cs="Helvetica Neue"/>
+          <w:sz w:val="20"/>
+          <w:sz-cs w:val="20"/>
+          <w:spacing w:val="0"/>
+        </w:rPr>
+        <w:t xml:space="preserve"> </w:t>
       </w:r>
       <w:r>
         <w:rPr>
@@ -8009,108 +8361,1064 @@
           <w:spacing w:val="0"/>
           <w:color w:val="393939"/>
         </w:rPr>
-        <w:t xml:space="preserve"/>
-      </w:r>
-    </w:p>
-    <w:p>
-      <w:pPr/>
-      <w:r>
-        <w:rPr>
-          <w:rFonts w:ascii="Helvetica Neue" w:hAnsi="Helvetica Neue" w:cs="Helvetica Neue"/>
-          <w:sz w:val="20"/>
-          <w:sz-cs w:val="20"/>
-          <w:b/>
-          <w:spacing w:val="0"/>
-        </w:rPr>
-        <w:t xml:space="preserve">REPOSITORY</w:t>
-      </w:r>
-      <w:r>
-        <w:rPr>
-          <w:rFonts w:ascii="Helvetica Neue" w:hAnsi="Helvetica Neue" w:cs="Helvetica Neue"/>
-          <w:sz w:val="20"/>
-          <w:sz-cs w:val="20"/>
-          <w:b/>
-          <w:spacing w:val="0"/>
-        </w:rPr>
-        <w:t xml:space="preserve"/>
-      </w:r>
-    </w:p>
-    <w:p>
-      <w:pPr/>
-      <w:r>
-        <w:rPr>
-          <w:rFonts w:ascii="Helvetica Neue" w:hAnsi="Helvetica Neue" w:cs="Helvetica Neue"/>
-          <w:sz w:val="20"/>
-          <w:sz-cs w:val="20"/>
-          <w:b/>
-          <w:spacing w:val="0"/>
-        </w:rPr>
-        <w:t xml:space="preserve">LANGUAGE</w:t>
-      </w:r>
-      <w:r>
-        <w:rPr>
-          <w:rFonts w:ascii="Helvetica Neue" w:hAnsi="Helvetica Neue" w:cs="Helvetica Neue"/>
-          <w:sz w:val="20"/>
-          <w:sz-cs w:val="20"/>
-          <w:b/>
-          <w:spacing w:val="0"/>
-        </w:rPr>
-        <w:t xml:space="preserve"/>
-      </w:r>
-    </w:p>
-    <w:p>
-      <w:pPr/>
-      <w:r>
-        <w:rPr>
-          <w:rFonts w:ascii="Helvetica Neue" w:hAnsi="Helvetica Neue" w:cs="Helvetica Neue"/>
-          <w:sz w:val="20"/>
-          <w:sz-cs w:val="20"/>
-          <w:b/>
-          <w:spacing w:val="0"/>
-        </w:rPr>
-        <w:t xml:space="preserve">AVAILABILITY</w:t>
-      </w:r>
-      <w:r>
-        <w:rPr>
-          <w:rFonts w:ascii="Helvetica Neue" w:hAnsi="Helvetica Neue" w:cs="Helvetica Neue"/>
-          <w:sz w:val="20"/>
-          <w:sz-cs w:val="20"/>
-          <w:b/>
-          <w:spacing w:val="0"/>
-        </w:rPr>
-        <w:t xml:space="preserve"/>
-      </w:r>
-    </w:p>
-    <w:p>
-      <w:pPr/>
-      <w:r>
-        <w:rPr>
-          <w:rFonts w:ascii="Helvetica Neue" w:hAnsi="Helvetica Neue" w:cs="Helvetica Neue"/>
-          <w:sz w:val="20"/>
-          <w:sz-cs w:val="20"/>
-          <w:b/>
-          <w:spacing w:val="0"/>
-        </w:rPr>
-        <w:t xml:space="preserve">WHAT IT IS</w:t>
-      </w:r>
-      <w:r>
-        <w:rPr>
-          <w:rFonts w:ascii="Helvetica Neue" w:hAnsi="Helvetica Neue" w:cs="Helvetica Neue"/>
-          <w:sz w:val="20"/>
-          <w:sz-cs w:val="20"/>
-          <w:b/>
-          <w:spacing w:val="0"/>
-        </w:rPr>
-        <w:t xml:space="preserve"/>
-      </w:r>
-    </w:p>
-    <w:p>
-      <w:pPr/>
-      <w:r>
-        <w:rPr>
-          <w:rFonts w:ascii="Helvetica Neue" w:hAnsi="Helvetica Neue" w:cs="Helvetica Neue"/>
-          <w:sz w:val="22"/>
-          <w:sz-cs w:val="22"/>
+        <w:t xml:space="preserve">(QNX, QOS)</w:t>
+      </w:r>
+      <w:r>
+        <w:rPr>
+          <w:rFonts w:ascii="Helvetica Neue" w:hAnsi="Helvetica Neue" w:cs="Helvetica Neue"/>
+          <w:sz w:val="20"/>
+          <w:sz-cs w:val="20"/>
+          <w:spacing w:val="0"/>
+        </w:rPr>
+        <w:t xml:space="preserve"/>
+      </w:r>
+    </w:p>
+    <w:p>
+      <w:pPr/>
+      <w:r>
+        <w:rPr>
+          <w:rFonts w:ascii="Helvetica Neue" w:hAnsi="Helvetica Neue" w:cs="Helvetica Neue"/>
+          <w:sz w:val="20"/>
+          <w:sz-cs w:val="20"/>
+          <w:spacing w:val="0"/>
+        </w:rPr>
+        <w:t xml:space="preserve">C++, Rust</w:t>
+      </w:r>
+      <w:r>
+        <w:rPr>
+          <w:rFonts w:ascii="Helvetica Neue" w:hAnsi="Helvetica Neue" w:cs="Helvetica Neue"/>
+          <w:sz w:val="20"/>
+          <w:sz-cs w:val="20"/>
+          <w:spacing w:val="0"/>
+        </w:rPr>
+        <w:t xml:space="preserve"/>
+      </w:r>
+    </w:p>
+    <w:p>
+      <w:pPr/>
+      <w:r>
+        <w:rPr>
+          <w:rFonts w:ascii="Helvetica Neue" w:hAnsi="Helvetica Neue" w:cs="Helvetica Neue"/>
+          <w:sz w:val="20"/>
+          <w:sz-cs w:val="20"/>
+          <w:spacing w:val="0"/>
+        </w:rPr>
+        <w:t xml:space="preserve">public</w:t>
+      </w:r>
+      <w:r>
+        <w:rPr>
+          <w:rFonts w:ascii="Helvetica Neue" w:hAnsi="Helvetica Neue" w:cs="Helvetica Neue"/>
+          <w:sz w:val="20"/>
+          <w:sz-cs w:val="20"/>
+          <w:spacing w:val="0"/>
+        </w:rPr>
+        <w:t xml:space="preserve"/>
+      </w:r>
+    </w:p>
+    <w:p>
+      <w:pPr/>
+      <w:r>
+        <w:rPr>
+          <w:rFonts w:ascii="Helvetica Neue" w:hAnsi="Helvetica Neue" w:cs="Helvetica Neue"/>
+          <w:sz w:val="20"/>
+          <w:sz-cs w:val="20"/>
+          <w:spacing w:val="0"/>
+        </w:rPr>
+        <w:t xml:space="preserve">A windowed desktop environment for the Nintendo Switch that replaces the home menu, with a real file manager. Verified on hardware: Erista, Atmosphere and Hekate.</w:t>
+      </w:r>
+      <w:r>
+        <w:rPr>
+          <w:rFonts w:ascii="Helvetica Neue" w:hAnsi="Helvetica Neue" w:cs="Helvetica Neue"/>
+          <w:sz w:val="20"/>
+          <w:sz-cs w:val="20"/>
+          <w:spacing w:val="0"/>
+        </w:rPr>
+        <w:t xml:space="preserve"/>
+      </w:r>
+    </w:p>
+    <w:p>
+      <w:pPr/>
+      <w:r>
+        <w:rPr>
+          <w:rFonts w:ascii="Menlo" w:hAnsi="Menlo" w:cs="Menlo"/>
+          <w:sz w:val="19"/>
+          <w:sz-cs w:val="19"/>
+          <w:spacing w:val="0"/>
+          <w:color w:val="114A58"/>
+        </w:rPr>
+        <w:t xml:space="preserve">https://github.com/Jmesmykil/QNX</w:t>
+      </w:r>
+      <w:r>
+        <w:rPr>
+          <w:rFonts w:ascii="Helvetica Neue" w:hAnsi="Helvetica Neue" w:cs="Helvetica Neue"/>
+          <w:sz w:val="20"/>
+          <w:sz-cs w:val="20"/>
+          <w:spacing w:val="0"/>
+        </w:rPr>
+        <w:t xml:space="preserve"/>
+      </w:r>
+    </w:p>
+    <w:p>
+      <w:pPr/>
+      <w:r>
+        <w:rPr>
+          <w:rFonts w:ascii="Helvetica Neue" w:hAnsi="Helvetica Neue" w:cs="Helvetica Neue"/>
+          <w:sz w:val="20"/>
+          <w:sz-cs w:val="20"/>
+          <w:b/>
+          <w:spacing w:val="0"/>
+        </w:rPr>
+        <w:t xml:space="preserve">Void IDE</w:t>
+      </w:r>
+      <w:r>
+        <w:rPr>
+          <w:rFonts w:ascii="Helvetica Neue" w:hAnsi="Helvetica Neue" w:cs="Helvetica Neue"/>
+          <w:sz w:val="20"/>
+          <w:sz-cs w:val="20"/>
+          <w:spacing w:val="0"/>
+        </w:rPr>
+        <w:t xml:space="preserve"/>
+      </w:r>
+    </w:p>
+    <w:p>
+      <w:pPr/>
+      <w:r>
+        <w:rPr>
+          <w:rFonts w:ascii="Helvetica Neue" w:hAnsi="Helvetica Neue" w:cs="Helvetica Neue"/>
+          <w:sz w:val="20"/>
+          <w:sz-cs w:val="20"/>
+          <w:spacing w:val="0"/>
+        </w:rPr>
+        <w:t xml:space="preserve">Swift</w:t>
+      </w:r>
+      <w:r>
+        <w:rPr>
+          <w:rFonts w:ascii="Helvetica Neue" w:hAnsi="Helvetica Neue" w:cs="Helvetica Neue"/>
+          <w:sz w:val="20"/>
+          <w:sz-cs w:val="20"/>
+          <w:spacing w:val="0"/>
+        </w:rPr>
+        <w:t xml:space="preserve"/>
+      </w:r>
+    </w:p>
+    <w:p>
+      <w:pPr/>
+      <w:r>
+        <w:rPr>
+          <w:rFonts w:ascii="Helvetica Neue" w:hAnsi="Helvetica Neue" w:cs="Helvetica Neue"/>
+          <w:sz w:val="20"/>
+          <w:sz-cs w:val="20"/>
+          <w:spacing w:val="0"/>
+        </w:rPr>
+        <w:t xml:space="preserve">private</w:t>
+      </w:r>
+      <w:r>
+        <w:rPr>
+          <w:rFonts w:ascii="Helvetica Neue" w:hAnsi="Helvetica Neue" w:cs="Helvetica Neue"/>
+          <w:sz w:val="20"/>
+          <w:sz-cs w:val="20"/>
+          <w:spacing w:val="0"/>
+        </w:rPr>
+        <w:t xml:space="preserve"/>
+      </w:r>
+    </w:p>
+    <w:p>
+      <w:pPr/>
+      <w:r>
+        <w:rPr>
+          <w:rFonts w:ascii="Helvetica Neue" w:hAnsi="Helvetica Neue" w:cs="Helvetica Neue"/>
+          <w:sz w:val="20"/>
+          <w:sz-cs w:val="20"/>
+          <w:spacing w:val="0"/>
+        </w:rPr>
+        <w:t xml:space="preserve">A native macOS editor that speaks to the engine. 82 commits.</w:t>
+      </w:r>
+      <w:r>
+        <w:rPr>
+          <w:rFonts w:ascii="Helvetica Neue" w:hAnsi="Helvetica Neue" w:cs="Helvetica Neue"/>
+          <w:sz w:val="20"/>
+          <w:sz-cs w:val="20"/>
+          <w:spacing w:val="0"/>
+        </w:rPr>
+        <w:t xml:space="preserve"/>
+      </w:r>
+    </w:p>
+    <w:p>
+      <w:pPr/>
+      <w:r>
+        <w:rPr>
+          <w:rFonts w:ascii="Helvetica Neue" w:hAnsi="Helvetica Neue" w:cs="Helvetica Neue"/>
+          <w:sz w:val="20"/>
+          <w:sz-cs w:val="20"/>
+          <w:b/>
+          <w:spacing w:val="0"/>
+        </w:rPr>
+        <w:t xml:space="preserve">Void CLI</w:t>
+      </w:r>
+      <w:r>
+        <w:rPr>
+          <w:rFonts w:ascii="Helvetica Neue" w:hAnsi="Helvetica Neue" w:cs="Helvetica Neue"/>
+          <w:sz w:val="20"/>
+          <w:sz-cs w:val="20"/>
+          <w:spacing w:val="0"/>
+        </w:rPr>
+        <w:t xml:space="preserve"/>
+      </w:r>
+    </w:p>
+    <w:p>
+      <w:pPr/>
+      <w:r>
+        <w:rPr>
+          <w:rFonts w:ascii="Helvetica Neue" w:hAnsi="Helvetica Neue" w:cs="Helvetica Neue"/>
+          <w:sz w:val="20"/>
+          <w:sz-cs w:val="20"/>
+          <w:spacing w:val="0"/>
+        </w:rPr>
+        <w:t xml:space="preserve">Rust</w:t>
+      </w:r>
+      <w:r>
+        <w:rPr>
+          <w:rFonts w:ascii="Helvetica Neue" w:hAnsi="Helvetica Neue" w:cs="Helvetica Neue"/>
+          <w:sz w:val="20"/>
+          <w:sz-cs w:val="20"/>
+          <w:spacing w:val="0"/>
+        </w:rPr>
+        <w:t xml:space="preserve"/>
+      </w:r>
+    </w:p>
+    <w:p>
+      <w:pPr/>
+      <w:r>
+        <w:rPr>
+          <w:rFonts w:ascii="Helvetica Neue" w:hAnsi="Helvetica Neue" w:cs="Helvetica Neue"/>
+          <w:sz w:val="20"/>
+          <w:sz-cs w:val="20"/>
+          <w:spacing w:val="0"/>
+        </w:rPr>
+        <w:t xml:space="preserve">private</w:t>
+      </w:r>
+      <w:r>
+        <w:rPr>
+          <w:rFonts w:ascii="Helvetica Neue" w:hAnsi="Helvetica Neue" w:cs="Helvetica Neue"/>
+          <w:sz w:val="20"/>
+          <w:sz-cs w:val="20"/>
+          <w:spacing w:val="0"/>
+        </w:rPr>
+        <w:t xml:space="preserve"/>
+      </w:r>
+    </w:p>
+    <w:p>
+      <w:pPr/>
+      <w:r>
+        <w:rPr>
+          <w:rFonts w:ascii="Helvetica Neue" w:hAnsi="Helvetica Neue" w:cs="Helvetica Neue"/>
+          <w:sz w:val="20"/>
+          <w:sz-cs w:val="20"/>
+          <w:spacing w:val="0"/>
+        </w:rPr>
+        <w:t xml:space="preserve">A terminal for the engine, with six or more model providers behind one binary. 86 commits.</w:t>
+      </w:r>
+      <w:r>
+        <w:rPr>
+          <w:rFonts w:ascii="Helvetica Neue" w:hAnsi="Helvetica Neue" w:cs="Helvetica Neue"/>
+          <w:sz w:val="20"/>
+          <w:sz-cs w:val="20"/>
+          <w:spacing w:val="0"/>
+        </w:rPr>
+        <w:t xml:space="preserve"/>
+      </w:r>
+    </w:p>
+    <w:p>
+      <w:pPr/>
+      <w:r>
+        <w:rPr>
+          <w:rFonts w:ascii="Helvetica Neue" w:hAnsi="Helvetica Neue" w:cs="Helvetica Neue"/>
+          <w:sz w:val="20"/>
+          <w:sz-cs w:val="20"/>
+          <w:b/>
+          <w:spacing w:val="0"/>
+        </w:rPr>
+        <w:t xml:space="preserve">Astral Workspace, BrainManager, AstralEngineKit</w:t>
+      </w:r>
+      <w:r>
+        <w:rPr>
+          <w:rFonts w:ascii="Helvetica Neue" w:hAnsi="Helvetica Neue" w:cs="Helvetica Neue"/>
+          <w:sz w:val="20"/>
+          <w:sz-cs w:val="20"/>
+          <w:spacing w:val="0"/>
+        </w:rPr>
+        <w:t xml:space="preserve"/>
+      </w:r>
+    </w:p>
+    <w:p>
+      <w:pPr/>
+      <w:r>
+        <w:rPr>
+          <w:rFonts w:ascii="Helvetica Neue" w:hAnsi="Helvetica Neue" w:cs="Helvetica Neue"/>
+          <w:sz w:val="20"/>
+          <w:sz-cs w:val="20"/>
+          <w:spacing w:val="0"/>
+        </w:rPr>
+        <w:t xml:space="preserve">Swift</w:t>
+      </w:r>
+      <w:r>
+        <w:rPr>
+          <w:rFonts w:ascii="Helvetica Neue" w:hAnsi="Helvetica Neue" w:cs="Helvetica Neue"/>
+          <w:sz w:val="20"/>
+          <w:sz-cs w:val="20"/>
+          <w:spacing w:val="0"/>
+        </w:rPr>
+        <w:t xml:space="preserve"/>
+      </w:r>
+    </w:p>
+    <w:p>
+      <w:pPr/>
+      <w:r>
+        <w:rPr>
+          <w:rFonts w:ascii="Helvetica Neue" w:hAnsi="Helvetica Neue" w:cs="Helvetica Neue"/>
+          <w:sz w:val="20"/>
+          <w:sz-cs w:val="20"/>
+          <w:spacing w:val="0"/>
+        </w:rPr>
+        <w:t xml:space="preserve">private</w:t>
+      </w:r>
+      <w:r>
+        <w:rPr>
+          <w:rFonts w:ascii="Helvetica Neue" w:hAnsi="Helvetica Neue" w:cs="Helvetica Neue"/>
+          <w:sz w:val="20"/>
+          <w:sz-cs w:val="20"/>
+          <w:spacing w:val="0"/>
+        </w:rPr>
+        <w:t xml:space="preserve"/>
+      </w:r>
+    </w:p>
+    <w:p>
+      <w:pPr/>
+      <w:r>
+        <w:rPr>
+          <w:rFonts w:ascii="Helvetica Neue" w:hAnsi="Helvetica Neue" w:cs="Helvetica Neue"/>
+          <w:sz w:val="20"/>
+          <w:sz-cs w:val="20"/>
+          <w:spacing w:val="0"/>
+        </w:rPr>
+        <w:t xml:space="preserve">The macOS apps and the shared package around the engine daemon.</w:t>
+      </w:r>
+      <w:r>
+        <w:rPr>
+          <w:rFonts w:ascii="Helvetica Neue" w:hAnsi="Helvetica Neue" w:cs="Helvetica Neue"/>
+          <w:sz w:val="20"/>
+          <w:sz-cs w:val="20"/>
+          <w:spacing w:val="0"/>
+        </w:rPr>
+        <w:t xml:space="preserve"/>
+      </w:r>
+    </w:p>
+    <w:p>
+      <w:pPr/>
+      <w:r>
+        <w:rPr>
+          <w:rFonts w:ascii="Helvetica Neue" w:hAnsi="Helvetica Neue" w:cs="Helvetica Neue"/>
+          <w:sz w:val="20"/>
+          <w:sz-cs w:val="20"/>
+          <w:b/>
+          <w:spacing w:val="0"/>
+        </w:rPr>
+        <w:t xml:space="preserve">ASCII</w:t>
+      </w:r>
+      <w:r>
+        <w:rPr>
+          <w:rFonts w:ascii="Helvetica Neue" w:hAnsi="Helvetica Neue" w:cs="Helvetica Neue"/>
+          <w:sz w:val="20"/>
+          <w:sz-cs w:val="20"/>
+          <w:spacing w:val="0"/>
+        </w:rPr>
+        <w:t xml:space="preserve"/>
+      </w:r>
+    </w:p>
+    <w:p>
+      <w:pPr/>
+      <w:r>
+        <w:rPr>
+          <w:rFonts w:ascii="Helvetica Neue" w:hAnsi="Helvetica Neue" w:cs="Helvetica Neue"/>
+          <w:sz w:val="20"/>
+          <w:sz-cs w:val="20"/>
+          <w:spacing w:val="0"/>
+        </w:rPr>
+        <w:t xml:space="preserve">JavaScript</w:t>
+      </w:r>
+      <w:r>
+        <w:rPr>
+          <w:rFonts w:ascii="Helvetica Neue" w:hAnsi="Helvetica Neue" w:cs="Helvetica Neue"/>
+          <w:sz w:val="20"/>
+          <w:sz-cs w:val="20"/>
+          <w:spacing w:val="0"/>
+        </w:rPr>
+        <w:t xml:space="preserve"/>
+      </w:r>
+    </w:p>
+    <w:p>
+      <w:pPr/>
+      <w:r>
+        <w:rPr>
+          <w:rFonts w:ascii="Helvetica Neue" w:hAnsi="Helvetica Neue" w:cs="Helvetica Neue"/>
+          <w:sz w:val="20"/>
+          <w:sz-cs w:val="20"/>
+          <w:spacing w:val="0"/>
+        </w:rPr>
+        <w:t xml:space="preserve">private</w:t>
+      </w:r>
+      <w:r>
+        <w:rPr>
+          <w:rFonts w:ascii="Helvetica Neue" w:hAnsi="Helvetica Neue" w:cs="Helvetica Neue"/>
+          <w:sz w:val="20"/>
+          <w:sz-cs w:val="20"/>
+          <w:spacing w:val="0"/>
+        </w:rPr>
+        <w:t xml:space="preserve"/>
+      </w:r>
+    </w:p>
+    <w:p>
+      <w:pPr/>
+      <w:r>
+        <w:rPr>
+          <w:rFonts w:ascii="Helvetica Neue" w:hAnsi="Helvetica Neue" w:cs="Helvetica Neue"/>
+          <w:sz w:val="20"/>
+          <w:sz-cs w:val="20"/>
+          <w:spacing w:val="0"/>
+        </w:rPr>
+        <w:t xml:space="preserve">A glyph-grid render kernel that composites any signal on the GPU in one draw call. 77 commits. It hosts ASCII Studio for Unity 6, a shipped package, ASCII Studio for Blender, and Tessera: 3D models in, sprite sheets out, with no image model in the path.</w:t>
+      </w:r>
+      <w:r>
+        <w:rPr>
+          <w:rFonts w:ascii="Helvetica Neue" w:hAnsi="Helvetica Neue" w:cs="Helvetica Neue"/>
+          <w:sz w:val="20"/>
+          <w:sz-cs w:val="20"/>
+          <w:spacing w:val="0"/>
+        </w:rPr>
+        <w:t xml:space="preserve"/>
+      </w:r>
+    </w:p>
+    <w:p>
+      <w:pPr/>
+      <w:r>
+        <w:rPr>
+          <w:rFonts w:ascii="Helvetica Neue" w:hAnsi="Helvetica Neue" w:cs="Helvetica Neue"/>
+          <w:sz w:val="20"/>
+          <w:sz-cs w:val="20"/>
+          <w:b/>
+          <w:spacing w:val="0"/>
+        </w:rPr>
+        <w:t xml:space="preserve">sCAN</w:t>
+      </w:r>
+      <w:r>
+        <w:rPr>
+          <w:rFonts w:ascii="Helvetica Neue" w:hAnsi="Helvetica Neue" w:cs="Helvetica Neue"/>
+          <w:sz w:val="20"/>
+          <w:sz-cs w:val="20"/>
+          <w:spacing w:val="0"/>
+        </w:rPr>
+        <w:t xml:space="preserve"> </w:t>
+      </w:r>
+      <w:r>
+        <w:rPr>
+          <w:rFonts w:ascii="Helvetica Neue" w:hAnsi="Helvetica Neue" w:cs="Helvetica Neue"/>
+          <w:sz w:val="20"/>
+          <w:sz-cs w:val="20"/>
+          <w:spacing w:val="0"/>
+          <w:color w:val="393939"/>
+        </w:rPr>
+        <w:t xml:space="preserve">(CryptoBuddy)</w:t>
+      </w:r>
+      <w:r>
+        <w:rPr>
+          <w:rFonts w:ascii="Helvetica Neue" w:hAnsi="Helvetica Neue" w:cs="Helvetica Neue"/>
+          <w:sz w:val="20"/>
+          <w:sz-cs w:val="20"/>
+          <w:spacing w:val="0"/>
+        </w:rPr>
+        <w:t xml:space="preserve"/>
+      </w:r>
+    </w:p>
+    <w:p>
+      <w:pPr/>
+      <w:r>
+        <w:rPr>
+          <w:rFonts w:ascii="Helvetica Neue" w:hAnsi="Helvetica Neue" w:cs="Helvetica Neue"/>
+          <w:sz w:val="20"/>
+          <w:sz-cs w:val="20"/>
+          <w:spacing w:val="0"/>
+        </w:rPr>
+        <w:t xml:space="preserve">HTML, JavaScript, Rust, PostgreSQL</w:t>
+      </w:r>
+      <w:r>
+        <w:rPr>
+          <w:rFonts w:ascii="Helvetica Neue" w:hAnsi="Helvetica Neue" w:cs="Helvetica Neue"/>
+          <w:sz w:val="20"/>
+          <w:sz-cs w:val="20"/>
+          <w:spacing w:val="0"/>
+        </w:rPr>
+        <w:t xml:space="preserve"/>
+      </w:r>
+    </w:p>
+    <w:p>
+      <w:pPr/>
+      <w:r>
+        <w:rPr>
+          <w:rFonts w:ascii="Helvetica Neue" w:hAnsi="Helvetica Neue" w:cs="Helvetica Neue"/>
+          <w:sz w:val="20"/>
+          <w:sz-cs w:val="20"/>
+          <w:spacing w:val="0"/>
+        </w:rPr>
+        <w:t xml:space="preserve">private</w:t>
+      </w:r>
+      <w:r>
+        <w:rPr>
+          <w:rFonts w:ascii="Helvetica Neue" w:hAnsi="Helvetica Neue" w:cs="Helvetica Neue"/>
+          <w:sz w:val="20"/>
+          <w:sz-cs w:val="20"/>
+          <w:spacing w:val="0"/>
+        </w:rPr>
+        <w:t xml:space="preserve"/>
+      </w:r>
+    </w:p>
+    <w:p>
+      <w:pPr/>
+      <w:r>
+        <w:rPr>
+          <w:rFonts w:ascii="Helvetica Neue" w:hAnsi="Helvetica Neue" w:cs="Helvetica Neue"/>
+          <w:sz w:val="20"/>
+          <w:sz-cs w:val="20"/>
+          <w:spacing w:val="0"/>
+        </w:rPr>
+        <w:t xml:space="preserve">A desktop-style crypto research workspace with a Rust gateway. 179 commits.</w:t>
+      </w:r>
+      <w:r>
+        <w:rPr>
+          <w:rFonts w:ascii="Helvetica Neue" w:hAnsi="Helvetica Neue" w:cs="Helvetica Neue"/>
+          <w:sz w:val="20"/>
+          <w:sz-cs w:val="20"/>
+          <w:spacing w:val="0"/>
+        </w:rPr>
+        <w:t xml:space="preserve"/>
+      </w:r>
+    </w:p>
+    <w:p>
+      <w:pPr/>
+      <w:r>
+        <w:rPr>
+          <w:rFonts w:ascii="Helvetica Neue" w:hAnsi="Helvetica Neue" w:cs="Helvetica Neue"/>
+          <w:sz w:val="20"/>
+          <w:sz-cs w:val="20"/>
+          <w:b/>
+          <w:spacing w:val="0"/>
+        </w:rPr>
+        <w:t xml:space="preserve">SlimeShot</w:t>
+      </w:r>
+      <w:r>
+        <w:rPr>
+          <w:rFonts w:ascii="Helvetica Neue" w:hAnsi="Helvetica Neue" w:cs="Helvetica Neue"/>
+          <w:sz w:val="20"/>
+          <w:sz-cs w:val="20"/>
+          <w:spacing w:val="0"/>
+        </w:rPr>
+        <w:t xml:space="preserve"/>
+      </w:r>
+    </w:p>
+    <w:p>
+      <w:pPr/>
+      <w:r>
+        <w:rPr>
+          <w:rFonts w:ascii="Helvetica Neue" w:hAnsi="Helvetica Neue" w:cs="Helvetica Neue"/>
+          <w:sz w:val="20"/>
+          <w:sz-cs w:val="20"/>
+          <w:spacing w:val="0"/>
+        </w:rPr>
+        <w:t xml:space="preserve">C#, Unity</w:t>
+      </w:r>
+      <w:r>
+        <w:rPr>
+          <w:rFonts w:ascii="Helvetica Neue" w:hAnsi="Helvetica Neue" w:cs="Helvetica Neue"/>
+          <w:sz w:val="20"/>
+          <w:sz-cs w:val="20"/>
+          <w:spacing w:val="0"/>
+        </w:rPr>
+        <w:t xml:space="preserve"/>
+      </w:r>
+    </w:p>
+    <w:p>
+      <w:pPr/>
+      <w:r>
+        <w:rPr>
+          <w:rFonts w:ascii="Helvetica Neue" w:hAnsi="Helvetica Neue" w:cs="Helvetica Neue"/>
+          <w:sz w:val="20"/>
+          <w:sz-cs w:val="20"/>
+          <w:spacing w:val="0"/>
+        </w:rPr>
+        <w:t xml:space="preserve">private</w:t>
+      </w:r>
+      <w:r>
+        <w:rPr>
+          <w:rFonts w:ascii="Helvetica Neue" w:hAnsi="Helvetica Neue" w:cs="Helvetica Neue"/>
+          <w:sz w:val="20"/>
+          <w:sz-cs w:val="20"/>
+          <w:spacing w:val="0"/>
+        </w:rPr>
+        <w:t xml:space="preserve"/>
+      </w:r>
+    </w:p>
+    <w:p>
+      <w:pPr/>
+      <w:r>
+        <w:rPr>
+          <w:rFonts w:ascii="Helvetica Neue" w:hAnsi="Helvetica Neue" w:cs="Helvetica Neue"/>
+          <w:sz w:val="20"/>
+          <w:sz-cs w:val="20"/>
+          <w:spacing w:val="0"/>
+        </w:rPr>
+        <w:t xml:space="preserve">A game with its own physics kernel. Close to done.</w:t>
+      </w:r>
+      <w:r>
+        <w:rPr>
+          <w:rFonts w:ascii="Helvetica Neue" w:hAnsi="Helvetica Neue" w:cs="Helvetica Neue"/>
+          <w:sz w:val="20"/>
+          <w:sz-cs w:val="20"/>
+          <w:spacing w:val="0"/>
+        </w:rPr>
+        <w:t xml:space="preserve"/>
+      </w:r>
+    </w:p>
+    <w:p>
+      <w:pPr/>
+      <w:r>
+        <w:rPr>
+          <w:rFonts w:ascii="Helvetica Neue" w:hAnsi="Helvetica Neue" w:cs="Helvetica Neue"/>
+          <w:sz w:val="20"/>
+          <w:sz-cs w:val="20"/>
+          <w:b/>
+          <w:spacing w:val="0"/>
+        </w:rPr>
+        <w:t xml:space="preserve">MoBA</w:t>
+      </w:r>
+      <w:r>
+        <w:rPr>
+          <w:rFonts w:ascii="Helvetica Neue" w:hAnsi="Helvetica Neue" w:cs="Helvetica Neue"/>
+          <w:sz w:val="20"/>
+          <w:sz-cs w:val="20"/>
+          <w:spacing w:val="0"/>
+        </w:rPr>
+        <w:t xml:space="preserve"/>
+      </w:r>
+    </w:p>
+    <w:p>
+      <w:pPr/>
+      <w:r>
+        <w:rPr>
+          <w:rFonts w:ascii="Helvetica Neue" w:hAnsi="Helvetica Neue" w:cs="Helvetica Neue"/>
+          <w:sz w:val="20"/>
+          <w:sz-cs w:val="20"/>
+          <w:spacing w:val="0"/>
+        </w:rPr>
+        <w:t xml:space="preserve">C#, Unity</w:t>
+      </w:r>
+      <w:r>
+        <w:rPr>
+          <w:rFonts w:ascii="Helvetica Neue" w:hAnsi="Helvetica Neue" w:cs="Helvetica Neue"/>
+          <w:sz w:val="20"/>
+          <w:sz-cs w:val="20"/>
+          <w:spacing w:val="0"/>
+        </w:rPr>
+        <w:t xml:space="preserve"/>
+      </w:r>
+    </w:p>
+    <w:p>
+      <w:pPr/>
+      <w:r>
+        <w:rPr>
+          <w:rFonts w:ascii="Helvetica Neue" w:hAnsi="Helvetica Neue" w:cs="Helvetica Neue"/>
+          <w:sz w:val="20"/>
+          <w:sz-cs w:val="20"/>
+          <w:spacing w:val="0"/>
+        </w:rPr>
+        <w:t xml:space="preserve">private</w:t>
+      </w:r>
+      <w:r>
+        <w:rPr>
+          <w:rFonts w:ascii="Helvetica Neue" w:hAnsi="Helvetica Neue" w:cs="Helvetica Neue"/>
+          <w:sz w:val="20"/>
+          <w:sz-cs w:val="20"/>
+          <w:spacing w:val="0"/>
+        </w:rPr>
+        <w:t xml:space="preserve"/>
+      </w:r>
+    </w:p>
+    <w:p>
+      <w:pPr/>
+      <w:r>
+        <w:rPr>
+          <w:rFonts w:ascii="Helvetica Neue" w:hAnsi="Helvetica Neue" w:cs="Helvetica Neue"/>
+          <w:sz w:val="20"/>
+          <w:sz-cs w:val="20"/>
+          <w:spacing w:val="0"/>
+        </w:rPr>
+        <w:t xml:space="preserve">A server-authoritative online game, close to mechanically done. 579 commits.</w:t>
+      </w:r>
+      <w:r>
+        <w:rPr>
+          <w:rFonts w:ascii="Helvetica Neue" w:hAnsi="Helvetica Neue" w:cs="Helvetica Neue"/>
+          <w:sz w:val="20"/>
+          <w:sz-cs w:val="20"/>
+          <w:spacing w:val="0"/>
+        </w:rPr>
+        <w:t xml:space="preserve"/>
+      </w:r>
+    </w:p>
+    <w:p>
+      <w:pPr/>
+      <w:r>
+        <w:rPr>
+          <w:rFonts w:ascii="Helvetica Neue" w:hAnsi="Helvetica Neue" w:cs="Helvetica Neue"/>
+          <w:sz w:val="20"/>
+          <w:sz-cs w:val="20"/>
+          <w:b/>
+          <w:spacing w:val="0"/>
+        </w:rPr>
+        <w:t xml:space="preserve">soloDOLO</w:t>
+      </w:r>
+      <w:r>
+        <w:rPr>
+          <w:rFonts w:ascii="Helvetica Neue" w:hAnsi="Helvetica Neue" w:cs="Helvetica Neue"/>
+          <w:sz w:val="20"/>
+          <w:sz-cs w:val="20"/>
+          <w:spacing w:val="0"/>
+        </w:rPr>
+        <w:t xml:space="preserve"/>
+      </w:r>
+    </w:p>
+    <w:p>
+      <w:pPr/>
+      <w:r>
+        <w:rPr>
+          <w:rFonts w:ascii="Helvetica Neue" w:hAnsi="Helvetica Neue" w:cs="Helvetica Neue"/>
+          <w:sz w:val="20"/>
+          <w:sz-cs w:val="20"/>
+          <w:spacing w:val="0"/>
+        </w:rPr>
+        <w:t xml:space="preserve">Python, Blender</w:t>
+      </w:r>
+      <w:r>
+        <w:rPr>
+          <w:rFonts w:ascii="Helvetica Neue" w:hAnsi="Helvetica Neue" w:cs="Helvetica Neue"/>
+          <w:sz w:val="20"/>
+          <w:sz-cs w:val="20"/>
+          <w:spacing w:val="0"/>
+        </w:rPr>
+        <w:t xml:space="preserve"/>
+      </w:r>
+    </w:p>
+    <w:p>
+      <w:pPr/>
+      <w:r>
+        <w:rPr>
+          <w:rFonts w:ascii="Helvetica Neue" w:hAnsi="Helvetica Neue" w:cs="Helvetica Neue"/>
+          <w:sz w:val="20"/>
+          <w:sz-cs w:val="20"/>
+          <w:spacing w:val="0"/>
+        </w:rPr>
+        <w:t xml:space="preserve">private</w:t>
+      </w:r>
+      <w:r>
+        <w:rPr>
+          <w:rFonts w:ascii="Helvetica Neue" w:hAnsi="Helvetica Neue" w:cs="Helvetica Neue"/>
+          <w:sz w:val="20"/>
+          <w:sz-cs w:val="20"/>
+          <w:spacing w:val="0"/>
+        </w:rPr>
+        <w:t xml:space="preserve"/>
+      </w:r>
+    </w:p>
+    <w:p>
+      <w:pPr/>
+      <w:r>
+        <w:rPr>
+          <w:rFonts w:ascii="Helvetica Neue" w:hAnsi="Helvetica Neue" w:cs="Helvetica Neue"/>
+          <w:sz w:val="20"/>
+          <w:sz-cs w:val="20"/>
+          <w:spacing w:val="0"/>
+        </w:rPr>
+        <w:t xml:space="preserve">An animated series in production. 87 commits.</w:t>
+      </w:r>
+      <w:r>
+        <w:rPr>
+          <w:rFonts w:ascii="Helvetica Neue" w:hAnsi="Helvetica Neue" w:cs="Helvetica Neue"/>
+          <w:sz w:val="20"/>
+          <w:sz-cs w:val="20"/>
+          <w:spacing w:val="0"/>
+        </w:rPr>
+        <w:t xml:space="preserve"/>
+      </w:r>
+    </w:p>
+    <w:p>
+      <w:pPr/>
+      <w:r>
+        <w:rPr>
+          <w:rFonts w:ascii="Helvetica Neue" w:hAnsi="Helvetica Neue" w:cs="Helvetica Neue"/>
+          <w:sz w:val="20"/>
+          <w:sz-cs w:val="20"/>
+          <w:b/>
+          <w:spacing w:val="0"/>
+        </w:rPr>
+        <w:t xml:space="preserve">SourceBound</w:t>
+      </w:r>
+      <w:r>
+        <w:rPr>
+          <w:rFonts w:ascii="Helvetica Neue" w:hAnsi="Helvetica Neue" w:cs="Helvetica Neue"/>
+          <w:sz w:val="20"/>
+          <w:sz-cs w:val="20"/>
+          <w:spacing w:val="0"/>
+        </w:rPr>
+        <w:t xml:space="preserve"/>
+      </w:r>
+    </w:p>
+    <w:p>
+      <w:pPr/>
+      <w:r>
+        <w:rPr>
+          <w:rFonts w:ascii="Helvetica Neue" w:hAnsi="Helvetica Neue" w:cs="Helvetica Neue"/>
+          <w:sz w:val="20"/>
+          <w:sz-cs w:val="20"/>
+          <w:spacing w:val="0"/>
+        </w:rPr>
+        <w:t xml:space="preserve">C#</w:t>
+      </w:r>
+      <w:r>
+        <w:rPr>
+          <w:rFonts w:ascii="Helvetica Neue" w:hAnsi="Helvetica Neue" w:cs="Helvetica Neue"/>
+          <w:sz w:val="20"/>
+          <w:sz-cs w:val="20"/>
+          <w:spacing w:val="0"/>
+        </w:rPr>
+        <w:t xml:space="preserve"/>
+      </w:r>
+    </w:p>
+    <w:p>
+      <w:pPr/>
+      <w:r>
+        <w:rPr>
+          <w:rFonts w:ascii="Helvetica Neue" w:hAnsi="Helvetica Neue" w:cs="Helvetica Neue"/>
+          <w:sz w:val="20"/>
+          <w:sz-cs w:val="20"/>
+          <w:spacing w:val="0"/>
+        </w:rPr>
+        <w:t xml:space="preserve">private</w:t>
+      </w:r>
+      <w:r>
+        <w:rPr>
+          <w:rFonts w:ascii="Helvetica Neue" w:hAnsi="Helvetica Neue" w:cs="Helvetica Neue"/>
+          <w:sz w:val="20"/>
+          <w:sz-cs w:val="20"/>
+          <w:spacing w:val="0"/>
+        </w:rPr>
+        <w:t xml:space="preserve"/>
+      </w:r>
+    </w:p>
+    <w:p>
+      <w:pPr/>
+      <w:r>
+        <w:rPr>
+          <w:rFonts w:ascii="Helvetica Neue" w:hAnsi="Helvetica Neue" w:cs="Helvetica Neue"/>
+          <w:sz w:val="20"/>
+          <w:sz-cs w:val="20"/>
+          <w:spacing w:val="0"/>
+        </w:rPr>
+        <w:t xml:space="preserve">A 2D adventure RPG that teaches coding by having the player code regions into existence.</w:t>
+      </w:r>
+      <w:r>
+        <w:rPr>
+          <w:rFonts w:ascii="Helvetica Neue" w:hAnsi="Helvetica Neue" w:cs="Helvetica Neue"/>
+          <w:sz w:val="20"/>
+          <w:sz-cs w:val="20"/>
+          <w:spacing w:val="0"/>
+        </w:rPr>
+        <w:t xml:space="preserve"/>
+      </w:r>
+    </w:p>
+    <w:p>
+      <w:pPr/>
+      <w:r>
+        <w:rPr>
+          <w:rFonts w:ascii="Helvetica Neue" w:hAnsi="Helvetica Neue" w:cs="Helvetica Neue"/>
+          <w:sz w:val="20"/>
+          <w:sz-cs w:val="20"/>
+          <w:b/>
+          <w:spacing w:val="0"/>
+        </w:rPr>
+        <w:t xml:space="preserve">Filament</w:t>
+      </w:r>
+      <w:r>
+        <w:rPr>
+          <w:rFonts w:ascii="Helvetica Neue" w:hAnsi="Helvetica Neue" w:cs="Helvetica Neue"/>
+          <w:sz w:val="20"/>
+          <w:sz-cs w:val="20"/>
+          <w:spacing w:val="0"/>
+        </w:rPr>
+        <w:t xml:space="preserve"/>
+      </w:r>
+    </w:p>
+    <w:p>
+      <w:pPr/>
+      <w:r>
+        <w:rPr>
+          <w:rFonts w:ascii="Helvetica Neue" w:hAnsi="Helvetica Neue" w:cs="Helvetica Neue"/>
+          <w:sz w:val="20"/>
+          <w:sz-cs w:val="20"/>
+          <w:spacing w:val="0"/>
+        </w:rPr>
+        <w:t xml:space="preserve">Swift</w:t>
+      </w:r>
+      <w:r>
+        <w:rPr>
+          <w:rFonts w:ascii="Helvetica Neue" w:hAnsi="Helvetica Neue" w:cs="Helvetica Neue"/>
+          <w:sz w:val="20"/>
+          <w:sz-cs w:val="20"/>
+          <w:spacing w:val="0"/>
+        </w:rPr>
+        <w:t xml:space="preserve"/>
+      </w:r>
+    </w:p>
+    <w:p>
+      <w:pPr/>
+      <w:r>
+        <w:rPr>
+          <w:rFonts w:ascii="Helvetica Neue" w:hAnsi="Helvetica Neue" w:cs="Helvetica Neue"/>
+          <w:sz w:val="20"/>
+          <w:sz-cs w:val="20"/>
+          <w:spacing w:val="0"/>
+        </w:rPr>
+        <w:t xml:space="preserve">private</w:t>
+      </w:r>
+      <w:r>
+        <w:rPr>
+          <w:rFonts w:ascii="Helvetica Neue" w:hAnsi="Helvetica Neue" w:cs="Helvetica Neue"/>
+          <w:sz w:val="20"/>
+          <w:sz-cs w:val="20"/>
+          <w:spacing w:val="0"/>
+        </w:rPr>
+        <w:t xml:space="preserve"/>
+      </w:r>
+    </w:p>
+    <w:p>
+      <w:pPr/>
+      <w:r>
+        <w:rPr>
+          <w:rFonts w:ascii="Helvetica Neue" w:hAnsi="Helvetica Neue" w:cs="Helvetica Neue"/>
+          <w:sz w:val="20"/>
+          <w:sz-cs w:val="20"/>
+          <w:spacing w:val="0"/>
+        </w:rPr>
+        <w:t xml:space="preserve">A hardware-in-the-loop workbench for firmware work with local models.</w:t>
+      </w:r>
+      <w:r>
+        <w:rPr>
+          <w:rFonts w:ascii="Helvetica Neue" w:hAnsi="Helvetica Neue" w:cs="Helvetica Neue"/>
+          <w:sz w:val="20"/>
+          <w:sz-cs w:val="20"/>
+          <w:spacing w:val="0"/>
+        </w:rPr>
+        <w:t xml:space="preserve"/>
+      </w:r>
+    </w:p>
+    <w:p>
+      <w:pPr/>
+      <w:r>
+        <w:rPr>
+          <w:rFonts w:ascii="Helvetica Neue" w:hAnsi="Helvetica Neue" w:cs="Helvetica Neue"/>
+          <w:sz w:val="20"/>
+          <w:sz-cs w:val="20"/>
+          <w:b/>
+          <w:spacing w:val="0"/>
+        </w:rPr>
+        <w:t xml:space="preserve">EMULive</w:t>
+      </w:r>
+      <w:r>
+        <w:rPr>
+          <w:rFonts w:ascii="Helvetica Neue" w:hAnsi="Helvetica Neue" w:cs="Helvetica Neue"/>
+          <w:sz w:val="20"/>
+          <w:sz-cs w:val="20"/>
+          <w:spacing w:val="0"/>
+        </w:rPr>
+        <w:t xml:space="preserve"/>
+      </w:r>
+    </w:p>
+    <w:p>
+      <w:pPr/>
+      <w:r>
+        <w:rPr>
+          <w:rFonts w:ascii="Helvetica Neue" w:hAnsi="Helvetica Neue" w:cs="Helvetica Neue"/>
+          <w:sz w:val="20"/>
+          <w:sz-cs w:val="20"/>
+          <w:spacing w:val="0"/>
+        </w:rPr>
+        <w:t xml:space="preserve">Python, Rust</w:t>
+      </w:r>
+      <w:r>
+        <w:rPr>
+          <w:rFonts w:ascii="Helvetica Neue" w:hAnsi="Helvetica Neue" w:cs="Helvetica Neue"/>
+          <w:sz w:val="20"/>
+          <w:sz-cs w:val="20"/>
+          <w:spacing w:val="0"/>
+        </w:rPr>
+        <w:t xml:space="preserve"/>
+      </w:r>
+    </w:p>
+    <w:p>
+      <w:pPr/>
+      <w:r>
+        <w:rPr>
+          <w:rFonts w:ascii="Helvetica Neue" w:hAnsi="Helvetica Neue" w:cs="Helvetica Neue"/>
+          <w:sz w:val="20"/>
+          <w:sz-cs w:val="20"/>
+          <w:spacing w:val="0"/>
+        </w:rPr>
+        <w:t xml:space="preserve">private</w:t>
+      </w:r>
+      <w:r>
+        <w:rPr>
+          <w:rFonts w:ascii="Helvetica Neue" w:hAnsi="Helvetica Neue" w:cs="Helvetica Neue"/>
+          <w:sz w:val="20"/>
+          <w:sz-cs w:val="20"/>
+          <w:spacing w:val="0"/>
+        </w:rPr>
+        <w:t xml:space="preserve"/>
+      </w:r>
+    </w:p>
+    <w:p>
+      <w:pPr/>
+      <w:r>
+        <w:rPr>
+          <w:rFonts w:ascii="Helvetica Neue" w:hAnsi="Helvetica Neue" w:cs="Helvetica Neue"/>
+          <w:sz w:val="20"/>
+          <w:sz-cs w:val="20"/>
+          <w:spacing w:val="0"/>
+        </w:rPr>
+        <w:t xml:space="preserve">A living Game Boy emulator with a mind layer. Alpha.</w:t>
+      </w:r>
+      <w:r>
+        <w:rPr>
+          <w:rFonts w:ascii="Helvetica Neue" w:hAnsi="Helvetica Neue" w:cs="Helvetica Neue"/>
+          <w:sz w:val="20"/>
+          <w:sz-cs w:val="20"/>
+          <w:spacing w:val="0"/>
+        </w:rPr>
+        <w:t xml:space="preserve"/>
+      </w:r>
+    </w:p>
+    <w:p>
+      <w:pPr/>
+      <w:r>
+        <w:rPr>
+          <w:rFonts w:ascii="Helvetica Neue" w:hAnsi="Helvetica Neue" w:cs="Helvetica Neue"/>
+          <w:sz w:val="20"/>
+          <w:sz-cs w:val="20"/>
           <w:b/>
           <w:spacing w:val="0"/>
         </w:rPr>
@@ -8119,20 +9427,20 @@
       <w:r>
         <w:rPr>
           <w:rFonts w:ascii="Helvetica Neue" w:hAnsi="Helvetica Neue" w:cs="Helvetica Neue"/>
-          <w:sz w:val="22"/>
-          <w:sz-cs w:val="22"/>
-          <w:spacing w:val="0"/>
-        </w:rPr>
-        <w:t xml:space="preserve"/>
-      </w:r>
-    </w:p>
-    <w:p>
-      <w:pPr/>
-      <w:r>
-        <w:rPr>
-          <w:rFonts w:ascii="Helvetica Neue" w:hAnsi="Helvetica Neue" w:cs="Helvetica Neue"/>
-          <w:sz w:val="22"/>
-          <w:sz-cs w:val="22"/>
+          <w:sz w:val="20"/>
+          <w:sz-cs w:val="20"/>
+          <w:spacing w:val="0"/>
+        </w:rPr>
+        <w:t xml:space="preserve"/>
+      </w:r>
+    </w:p>
+    <w:p>
+      <w:pPr/>
+      <w:r>
+        <w:rPr>
+          <w:rFonts w:ascii="Helvetica Neue" w:hAnsi="Helvetica Neue" w:cs="Helvetica Neue"/>
+          <w:sz w:val="20"/>
+          <w:sz-cs w:val="20"/>
           <w:spacing w:val="0"/>
         </w:rPr>
         <w:t xml:space="preserve">Python</w:t>
@@ -8140,20 +9448,20 @@
       <w:r>
         <w:rPr>
           <w:rFonts w:ascii="Helvetica Neue" w:hAnsi="Helvetica Neue" w:cs="Helvetica Neue"/>
-          <w:sz w:val="22"/>
-          <w:sz-cs w:val="22"/>
-          <w:spacing w:val="0"/>
-        </w:rPr>
-        <w:t xml:space="preserve"/>
-      </w:r>
-    </w:p>
-    <w:p>
-      <w:pPr/>
-      <w:r>
-        <w:rPr>
-          <w:rFonts w:ascii="Helvetica Neue" w:hAnsi="Helvetica Neue" w:cs="Helvetica Neue"/>
-          <w:sz w:val="22"/>
-          <w:sz-cs w:val="22"/>
+          <w:sz w:val="20"/>
+          <w:sz-cs w:val="20"/>
+          <w:spacing w:val="0"/>
+        </w:rPr>
+        <w:t xml:space="preserve"/>
+      </w:r>
+    </w:p>
+    <w:p>
+      <w:pPr/>
+      <w:r>
+        <w:rPr>
+          <w:rFonts w:ascii="Helvetica Neue" w:hAnsi="Helvetica Neue" w:cs="Helvetica Neue"/>
+          <w:sz w:val="20"/>
+          <w:sz-cs w:val="20"/>
           <w:spacing w:val="0"/>
         </w:rPr>
         <w:t xml:space="preserve">public</w:t>
@@ -8161,29 +9469,29 @@
       <w:r>
         <w:rPr>
           <w:rFonts w:ascii="Helvetica Neue" w:hAnsi="Helvetica Neue" w:cs="Helvetica Neue"/>
-          <w:sz w:val="22"/>
-          <w:sz-cs w:val="22"/>
-          <w:spacing w:val="0"/>
-        </w:rPr>
-        <w:t xml:space="preserve"/>
-      </w:r>
-    </w:p>
-    <w:p>
-      <w:pPr/>
-      <w:r>
-        <w:rPr>
-          <w:rFonts w:ascii="Helvetica Neue" w:hAnsi="Helvetica Neue" w:cs="Helvetica Neue"/>
-          <w:sz w:val="22"/>
-          <w:sz-cs w:val="22"/>
-          <w:spacing w:val="0"/>
-        </w:rPr>
-        <w:t xml:space="preserve">This project. A deterministic layer for OpenHome: it answers the exact-answer class (time, date, math, money, unit conversions, telemetry) on-device without the LLM, and everything else passes to the agent.</w:t>
-      </w:r>
-      <w:r>
-        <w:rPr>
-          <w:rFonts w:ascii="Helvetica Neue" w:hAnsi="Helvetica Neue" w:cs="Helvetica Neue"/>
-          <w:sz w:val="22"/>
-          <w:sz-cs w:val="22"/>
+          <w:sz w:val="20"/>
+          <w:sz-cs w:val="20"/>
+          <w:spacing w:val="0"/>
+        </w:rPr>
+        <w:t xml:space="preserve"/>
+      </w:r>
+    </w:p>
+    <w:p>
+      <w:pPr/>
+      <w:r>
+        <w:rPr>
+          <w:rFonts w:ascii="Helvetica Neue" w:hAnsi="Helvetica Neue" w:cs="Helvetica Neue"/>
+          <w:sz w:val="20"/>
+          <w:sz-cs w:val="20"/>
+          <w:spacing w:val="0"/>
+        </w:rPr>
+        <w:t xml:space="preserve">This project.</w:t>
+      </w:r>
+      <w:r>
+        <w:rPr>
+          <w:rFonts w:ascii="Helvetica Neue" w:hAnsi="Helvetica Neue" w:cs="Helvetica Neue"/>
+          <w:sz w:val="20"/>
+          <w:sz-cs w:val="20"/>
           <w:spacing w:val="0"/>
         </w:rPr>
         <w:t xml:space="preserve"/>
@@ -8204,20 +9512,127 @@
       <w:r>
         <w:rPr>
           <w:rFonts w:ascii="Helvetica Neue" w:hAnsi="Helvetica Neue" w:cs="Helvetica Neue"/>
-          <w:sz w:val="22"/>
-          <w:sz-cs w:val="22"/>
-          <w:spacing w:val="0"/>
-        </w:rPr>
-        <w:t xml:space="preserve"/>
-      </w:r>
-    </w:p>
-    <w:p>
-      <w:pPr/>
-      <w:r>
-        <w:rPr>
-          <w:rFonts w:ascii="Helvetica Neue" w:hAnsi="Helvetica Neue" w:cs="Helvetica Neue"/>
-          <w:sz w:val="22"/>
-          <w:sz-cs w:val="22"/>
+          <w:sz w:val="20"/>
+          <w:sz-cs w:val="20"/>
+          <w:spacing w:val="0"/>
+        </w:rPr>
+        <w:t xml:space="preserve"/>
+      </w:r>
+    </w:p>
+    <w:p>
+      <w:pPr/>
+      <w:r>
+        <w:rPr>
+          <w:rFonts w:ascii="Helvetica Neue" w:hAnsi="Helvetica Neue" w:cs="Helvetica Neue"/>
+          <w:sz w:val="20"/>
+          <w:sz-cs w:val="20"/>
+          <w:b/>
+          <w:spacing w:val="0"/>
+        </w:rPr>
+        <w:t xml:space="preserve">openhome-cli</w:t>
+      </w:r>
+      <w:r>
+        <w:rPr>
+          <w:rFonts w:ascii="Helvetica Neue" w:hAnsi="Helvetica Neue" w:cs="Helvetica Neue"/>
+          <w:sz w:val="20"/>
+          <w:sz-cs w:val="20"/>
+          <w:spacing w:val="0"/>
+        </w:rPr>
+        <w:t xml:space="preserve"/>
+      </w:r>
+    </w:p>
+    <w:p>
+      <w:pPr/>
+      <w:r>
+        <w:rPr>
+          <w:rFonts w:ascii="Helvetica Neue" w:hAnsi="Helvetica Neue" w:cs="Helvetica Neue"/>
+          <w:sz w:val="20"/>
+          <w:sz-cs w:val="20"/>
+          <w:spacing w:val="0"/>
+        </w:rPr>
+        <w:t xml:space="preserve">TypeScript</w:t>
+      </w:r>
+      <w:r>
+        <w:rPr>
+          <w:rFonts w:ascii="Helvetica Neue" w:hAnsi="Helvetica Neue" w:cs="Helvetica Neue"/>
+          <w:sz w:val="20"/>
+          <w:sz-cs w:val="20"/>
+          <w:spacing w:val="0"/>
+        </w:rPr>
+        <w:t xml:space="preserve"/>
+      </w:r>
+    </w:p>
+    <w:p>
+      <w:pPr/>
+      <w:r>
+        <w:rPr>
+          <w:rFonts w:ascii="Helvetica Neue" w:hAnsi="Helvetica Neue" w:cs="Helvetica Neue"/>
+          <w:sz w:val="20"/>
+          <w:sz-cs w:val="20"/>
+          <w:spacing w:val="0"/>
+        </w:rPr>
+        <w:t xml:space="preserve">public</w:t>
+      </w:r>
+      <w:r>
+        <w:rPr>
+          <w:rFonts w:ascii="Helvetica Neue" w:hAnsi="Helvetica Neue" w:cs="Helvetica Neue"/>
+          <w:sz w:val="20"/>
+          <w:sz-cs w:val="20"/>
+          <w:spacing w:val="0"/>
+        </w:rPr>
+        <w:t xml:space="preserve"/>
+      </w:r>
+    </w:p>
+    <w:p>
+      <w:pPr/>
+      <w:r>
+        <w:rPr>
+          <w:rFonts w:ascii="Helvetica Neue" w:hAnsi="Helvetica Neue" w:cs="Helvetica Neue"/>
+          <w:sz w:val="20"/>
+          <w:sz-cs w:val="20"/>
+          <w:spacing w:val="0"/>
+        </w:rPr>
+        <w:t xml:space="preserve">The CLI that deploys and assigns OpenHome abilities from the terminal.</w:t>
+      </w:r>
+      <w:r>
+        <w:rPr>
+          <w:rFonts w:ascii="Helvetica Neue" w:hAnsi="Helvetica Neue" w:cs="Helvetica Neue"/>
+          <w:sz w:val="20"/>
+          <w:sz-cs w:val="20"/>
+          <w:spacing w:val="0"/>
+        </w:rPr>
+        <w:t xml:space="preserve"/>
+      </w:r>
+    </w:p>
+    <w:p>
+      <w:pPr/>
+      <w:r>
+        <w:rPr>
+          <w:rFonts w:ascii="Menlo" w:hAnsi="Menlo" w:cs="Menlo"/>
+          <w:sz w:val="19"/>
+          <w:sz-cs w:val="19"/>
+          <w:spacing w:val="0"/>
+          <w:color w:val="114A58"/>
+        </w:rPr>
+        <w:t xml:space="preserve">https://github.com/Jmesmykil/openhome-cli</w:t>
+      </w:r>
+      <w:r>
+        <w:rPr>
+          <w:rFonts w:ascii="Helvetica Neue" w:hAnsi="Helvetica Neue" w:cs="Helvetica Neue"/>
+          <w:sz w:val="20"/>
+          <w:sz-cs w:val="20"/>
+          <w:spacing w:val="0"/>
+        </w:rPr>
+        <w:t xml:space="preserve"/>
+      </w:r>
+    </w:p>
+    <w:p>
+      <w:pPr/>
+      <w:r>
+        <w:rPr>
+          <w:rFonts w:ascii="Helvetica Neue" w:hAnsi="Helvetica Neue" w:cs="Helvetica Neue"/>
+          <w:sz w:val="20"/>
+          <w:sz-cs w:val="20"/>
           <w:b/>
           <w:spacing w:val="0"/>
         </w:rPr>
@@ -8226,20 +9641,20 @@
       <w:r>
         <w:rPr>
           <w:rFonts w:ascii="Helvetica Neue" w:hAnsi="Helvetica Neue" w:cs="Helvetica Neue"/>
-          <w:sz w:val="22"/>
-          <w:sz-cs w:val="22"/>
-          <w:spacing w:val="0"/>
-        </w:rPr>
-        <w:t xml:space="preserve"/>
-      </w:r>
-    </w:p>
-    <w:p>
-      <w:pPr/>
-      <w:r>
-        <w:rPr>
-          <w:rFonts w:ascii="Helvetica Neue" w:hAnsi="Helvetica Neue" w:cs="Helvetica Neue"/>
-          <w:sz w:val="22"/>
-          <w:sz-cs w:val="22"/>
+          <w:sz w:val="20"/>
+          <w:sz-cs w:val="20"/>
+          <w:spacing w:val="0"/>
+        </w:rPr>
+        <w:t xml:space="preserve"/>
+      </w:r>
+    </w:p>
+    <w:p>
+      <w:pPr/>
+      <w:r>
+        <w:rPr>
+          <w:rFonts w:ascii="Helvetica Neue" w:hAnsi="Helvetica Neue" w:cs="Helvetica Neue"/>
+          <w:sz w:val="20"/>
+          <w:sz-cs w:val="20"/>
           <w:spacing w:val="0"/>
         </w:rPr>
         <w:t xml:space="preserve">Python</w:t>
@@ -8247,20 +9662,20 @@
       <w:r>
         <w:rPr>
           <w:rFonts w:ascii="Helvetica Neue" w:hAnsi="Helvetica Neue" w:cs="Helvetica Neue"/>
-          <w:sz w:val="22"/>
-          <w:sz-cs w:val="22"/>
-          <w:spacing w:val="0"/>
-        </w:rPr>
-        <w:t xml:space="preserve"/>
-      </w:r>
-    </w:p>
-    <w:p>
-      <w:pPr/>
-      <w:r>
-        <w:rPr>
-          <w:rFonts w:ascii="Helvetica Neue" w:hAnsi="Helvetica Neue" w:cs="Helvetica Neue"/>
-          <w:sz w:val="22"/>
-          <w:sz-cs w:val="22"/>
+          <w:sz w:val="20"/>
+          <w:sz-cs w:val="20"/>
+          <w:spacing w:val="0"/>
+        </w:rPr>
+        <w:t xml:space="preserve"/>
+      </w:r>
+    </w:p>
+    <w:p>
+      <w:pPr/>
+      <w:r>
+        <w:rPr>
+          <w:rFonts w:ascii="Helvetica Neue" w:hAnsi="Helvetica Neue" w:cs="Helvetica Neue"/>
+          <w:sz w:val="20"/>
+          <w:sz-cs w:val="20"/>
           <w:spacing w:val="0"/>
         </w:rPr>
         <w:t xml:space="preserve">public</w:t>
@@ -8268,20 +9683,20 @@
       <w:r>
         <w:rPr>
           <w:rFonts w:ascii="Helvetica Neue" w:hAnsi="Helvetica Neue" w:cs="Helvetica Neue"/>
-          <w:sz w:val="22"/>
-          <w:sz-cs w:val="22"/>
-          <w:spacing w:val="0"/>
-        </w:rPr>
-        <w:t xml:space="preserve"/>
-      </w:r>
-    </w:p>
-    <w:p>
-      <w:pPr/>
-      <w:r>
-        <w:rPr>
-          <w:rFonts w:ascii="Helvetica Neue" w:hAnsi="Helvetica Neue" w:cs="Helvetica Neue"/>
-          <w:sz w:val="22"/>
-          <w:sz-cs w:val="22"/>
+          <w:sz w:val="20"/>
+          <w:sz-cs w:val="20"/>
+          <w:spacing w:val="0"/>
+        </w:rPr>
+        <w:t xml:space="preserve"/>
+      </w:r>
+    </w:p>
+    <w:p>
+      <w:pPr/>
+      <w:r>
+        <w:rPr>
+          <w:rFonts w:ascii="Helvetica Neue" w:hAnsi="Helvetica Neue" w:cs="Helvetica Neue"/>
+          <w:sz w:val="20"/>
+          <w:sz-cs w:val="20"/>
           <w:spacing w:val="0"/>
         </w:rPr>
         <w:t xml:space="preserve">Open-source abilities for OpenHome agents.</w:t>
@@ -8289,8 +9704,8 @@
       <w:r>
         <w:rPr>
           <w:rFonts w:ascii="Helvetica Neue" w:hAnsi="Helvetica Neue" w:cs="Helvetica Neue"/>
-          <w:sz w:val="22"/>
-          <w:sz-cs w:val="22"/>
+          <w:sz w:val="20"/>
+          <w:sz-cs w:val="20"/>
           <w:spacing w:val="0"/>
         </w:rPr>
         <w:t xml:space="preserve"/>
@@ -8311,1072 +9726,8 @@
       <w:r>
         <w:rPr>
           <w:rFonts w:ascii="Helvetica Neue" w:hAnsi="Helvetica Neue" w:cs="Helvetica Neue"/>
-          <w:sz w:val="22"/>
-          <w:sz-cs w:val="22"/>
-          <w:spacing w:val="0"/>
-        </w:rPr>
-        <w:t xml:space="preserve"/>
-      </w:r>
-    </w:p>
-    <w:p>
-      <w:pPr/>
-      <w:r>
-        <w:rPr>
-          <w:rFonts w:ascii="Helvetica Neue" w:hAnsi="Helvetica Neue" w:cs="Helvetica Neue"/>
-          <w:sz w:val="22"/>
-          <w:sz-cs w:val="22"/>
-          <w:b/>
-          <w:spacing w:val="0"/>
-        </w:rPr>
-        <w:t xml:space="preserve">openhome-cli</w:t>
-      </w:r>
-      <w:r>
-        <w:rPr>
-          <w:rFonts w:ascii="Helvetica Neue" w:hAnsi="Helvetica Neue" w:cs="Helvetica Neue"/>
-          <w:sz w:val="22"/>
-          <w:sz-cs w:val="22"/>
-          <w:spacing w:val="0"/>
-        </w:rPr>
-        <w:t xml:space="preserve"/>
-      </w:r>
-    </w:p>
-    <w:p>
-      <w:pPr/>
-      <w:r>
-        <w:rPr>
-          <w:rFonts w:ascii="Helvetica Neue" w:hAnsi="Helvetica Neue" w:cs="Helvetica Neue"/>
-          <w:sz w:val="22"/>
-          <w:sz-cs w:val="22"/>
-          <w:spacing w:val="0"/>
-        </w:rPr>
-        <w:t xml:space="preserve">TypeScript</w:t>
-      </w:r>
-      <w:r>
-        <w:rPr>
-          <w:rFonts w:ascii="Helvetica Neue" w:hAnsi="Helvetica Neue" w:cs="Helvetica Neue"/>
-          <w:sz w:val="22"/>
-          <w:sz-cs w:val="22"/>
-          <w:spacing w:val="0"/>
-        </w:rPr>
-        <w:t xml:space="preserve"/>
-      </w:r>
-    </w:p>
-    <w:p>
-      <w:pPr/>
-      <w:r>
-        <w:rPr>
-          <w:rFonts w:ascii="Helvetica Neue" w:hAnsi="Helvetica Neue" w:cs="Helvetica Neue"/>
-          <w:sz w:val="22"/>
-          <w:sz-cs w:val="22"/>
-          <w:spacing w:val="0"/>
-        </w:rPr>
-        <w:t xml:space="preserve">public</w:t>
-      </w:r>
-      <w:r>
-        <w:rPr>
-          <w:rFonts w:ascii="Helvetica Neue" w:hAnsi="Helvetica Neue" w:cs="Helvetica Neue"/>
-          <w:sz w:val="22"/>
-          <w:sz-cs w:val="22"/>
-          <w:spacing w:val="0"/>
-        </w:rPr>
-        <w:t xml:space="preserve"/>
-      </w:r>
-    </w:p>
-    <w:p>
-      <w:pPr/>
-      <w:r>
-        <w:rPr>
-          <w:rFonts w:ascii="Helvetica Neue" w:hAnsi="Helvetica Neue" w:cs="Helvetica Neue"/>
-          <w:sz w:val="22"/>
-          <w:sz-cs w:val="22"/>
-          <w:spacing w:val="0"/>
-        </w:rPr>
-        <w:t xml:space="preserve">CLI for managing OpenHome voice abilities: deploy, validate, and scaffold from your terminal.</w:t>
-      </w:r>
-      <w:r>
-        <w:rPr>
-          <w:rFonts w:ascii="Helvetica Neue" w:hAnsi="Helvetica Neue" w:cs="Helvetica Neue"/>
-          <w:sz w:val="22"/>
-          <w:sz-cs w:val="22"/>
-          <w:spacing w:val="0"/>
-        </w:rPr>
-        <w:t xml:space="preserve"/>
-      </w:r>
-    </w:p>
-    <w:p>
-      <w:pPr/>
-      <w:r>
-        <w:rPr>
-          <w:rFonts w:ascii="Menlo" w:hAnsi="Menlo" w:cs="Menlo"/>
-          <w:sz w:val="19"/>
-          <w:sz-cs w:val="19"/>
-          <w:spacing w:val="0"/>
-          <w:color w:val="114A58"/>
-        </w:rPr>
-        <w:t xml:space="preserve">https://github.com/Jmesmykil/openhome-cli</w:t>
-      </w:r>
-      <w:r>
-        <w:rPr>
-          <w:rFonts w:ascii="Helvetica Neue" w:hAnsi="Helvetica Neue" w:cs="Helvetica Neue"/>
-          <w:sz w:val="22"/>
-          <w:sz-cs w:val="22"/>
-          <w:spacing w:val="0"/>
-        </w:rPr>
-        <w:t xml:space="preserve"/>
-      </w:r>
-    </w:p>
-    <w:p>
-      <w:pPr/>
-      <w:r>
-        <w:rPr>
-          <w:rFonts w:ascii="Helvetica Neue" w:hAnsi="Helvetica Neue" w:cs="Helvetica Neue"/>
-          <w:sz w:val="22"/>
-          <w:sz-cs w:val="22"/>
-          <w:b/>
-          <w:spacing w:val="0"/>
-        </w:rPr>
-        <w:t xml:space="preserve">astral-hub</w:t>
-      </w:r>
-      <w:r>
-        <w:rPr>
-          <w:rFonts w:ascii="Helvetica Neue" w:hAnsi="Helvetica Neue" w:cs="Helvetica Neue"/>
-          <w:sz w:val="22"/>
-          <w:sz-cs w:val="22"/>
-          <w:spacing w:val="0"/>
-        </w:rPr>
-        <w:t xml:space="preserve"/>
-      </w:r>
-    </w:p>
-    <w:p>
-      <w:pPr/>
-      <w:r>
-        <w:rPr>
-          <w:rFonts w:ascii="Helvetica Neue" w:hAnsi="Helvetica Neue" w:cs="Helvetica Neue"/>
-          <w:sz w:val="22"/>
-          <w:sz-cs w:val="22"/>
-          <w:spacing w:val="0"/>
-        </w:rPr>
-        <w:t xml:space="preserve">Python</w:t>
-      </w:r>
-      <w:r>
-        <w:rPr>
-          <w:rFonts w:ascii="Helvetica Neue" w:hAnsi="Helvetica Neue" w:cs="Helvetica Neue"/>
-          <w:sz w:val="22"/>
-          <w:sz-cs w:val="22"/>
-          <w:spacing w:val="0"/>
-        </w:rPr>
-        <w:t xml:space="preserve"/>
-      </w:r>
-    </w:p>
-    <w:p>
-      <w:pPr/>
-      <w:r>
-        <w:rPr>
-          <w:rFonts w:ascii="Helvetica Neue" w:hAnsi="Helvetica Neue" w:cs="Helvetica Neue"/>
-          <w:sz w:val="22"/>
-          <w:sz-cs w:val="22"/>
-          <w:spacing w:val="0"/>
-        </w:rPr>
-        <w:t xml:space="preserve">private, available on request</w:t>
-      </w:r>
-      <w:r>
-        <w:rPr>
-          <w:rFonts w:ascii="Helvetica Neue" w:hAnsi="Helvetica Neue" w:cs="Helvetica Neue"/>
-          <w:sz w:val="22"/>
-          <w:sz-cs w:val="22"/>
-          <w:spacing w:val="0"/>
-        </w:rPr>
-        <w:t xml:space="preserve"/>
-      </w:r>
-    </w:p>
-    <w:p>
-      <w:pPr/>
-      <w:r>
-        <w:rPr>
-          <w:rFonts w:ascii="Helvetica Neue" w:hAnsi="Helvetica Neue" w:cs="Helvetica Neue"/>
-          <w:sz w:val="22"/>
-          <w:sz-cs w:val="22"/>
-          <w:spacing w:val="0"/>
-        </w:rPr>
-        <w:t xml:space="preserve">The engine half of this project: routing, tables, kernels and the library. The shipped ability is a thin MIT shim over a compiled wheel built from these sources.</w:t>
-      </w:r>
-      <w:r>
-        <w:rPr>
-          <w:rFonts w:ascii="Helvetica Neue" w:hAnsi="Helvetica Neue" w:cs="Helvetica Neue"/>
-          <w:sz w:val="22"/>
-          <w:sz-cs w:val="22"/>
-          <w:spacing w:val="0"/>
-        </w:rPr>
-        <w:t xml:space="preserve"/>
-      </w:r>
-    </w:p>
-    <w:p>
-      <w:pPr/>
-      <w:r>
-        <w:rPr>
-          <w:rFonts w:ascii="Helvetica Neue" w:hAnsi="Helvetica Neue" w:cs="Helvetica Neue"/>
-          <w:sz w:val="22"/>
-          <w:sz-cs w:val="22"/>
-          <w:b/>
-          <w:spacing w:val="0"/>
-        </w:rPr>
-        <w:t xml:space="preserve">Slate</w:t>
-      </w:r>
-      <w:r>
-        <w:rPr>
-          <w:rFonts w:ascii="Helvetica Neue" w:hAnsi="Helvetica Neue" w:cs="Helvetica Neue"/>
-          <w:sz w:val="22"/>
-          <w:sz-cs w:val="22"/>
-          <w:spacing w:val="0"/>
-        </w:rPr>
-        <w:t xml:space="preserve"/>
-      </w:r>
-    </w:p>
-    <w:p>
-      <w:pPr/>
-      <w:r>
-        <w:rPr>
-          <w:rFonts w:ascii="Helvetica Neue" w:hAnsi="Helvetica Neue" w:cs="Helvetica Neue"/>
-          <w:sz w:val="22"/>
-          <w:sz-cs w:val="22"/>
-          <w:spacing w:val="0"/>
-        </w:rPr>
-        <w:t xml:space="preserve">Julia</w:t>
-      </w:r>
-      <w:r>
-        <w:rPr>
-          <w:rFonts w:ascii="Helvetica Neue" w:hAnsi="Helvetica Neue" w:cs="Helvetica Neue"/>
-          <w:sz w:val="22"/>
-          <w:sz-cs w:val="22"/>
-          <w:spacing w:val="0"/>
-        </w:rPr>
-        <w:t xml:space="preserve"/>
-      </w:r>
-    </w:p>
-    <w:p>
-      <w:pPr/>
-      <w:r>
-        <w:rPr>
-          <w:rFonts w:ascii="Helvetica Neue" w:hAnsi="Helvetica Neue" w:cs="Helvetica Neue"/>
-          <w:sz w:val="22"/>
-          <w:sz-cs w:val="22"/>
-          <w:spacing w:val="0"/>
-        </w:rPr>
-        <w:t xml:space="preserve">private, available on request</w:t>
-      </w:r>
-      <w:r>
-        <w:rPr>
-          <w:rFonts w:ascii="Helvetica Neue" w:hAnsi="Helvetica Neue" w:cs="Helvetica Neue"/>
-          <w:sz w:val="22"/>
-          <w:sz-cs w:val="22"/>
-          <w:spacing w:val="0"/>
-        </w:rPr>
-        <w:t xml:space="preserve"/>
-      </w:r>
-    </w:p>
-    <w:p>
-      <w:pPr/>
-      <w:r>
-        <w:rPr>
-          <w:rFonts w:ascii="Helvetica Neue" w:hAnsi="Helvetica Neue" w:cs="Helvetica Neue"/>
-          <w:sz w:val="22"/>
-          <w:sz-cs w:val="22"/>
-          <w:spacing w:val="0"/>
-        </w:rPr>
-        <w:t xml:space="preserve">The mathematics lane behind MECH. It runs on the DevKit today as the maths kernel service.</w:t>
-      </w:r>
-      <w:r>
-        <w:rPr>
-          <w:rFonts w:ascii="Helvetica Neue" w:hAnsi="Helvetica Neue" w:cs="Helvetica Neue"/>
-          <w:sz w:val="22"/>
-          <w:sz-cs w:val="22"/>
-          <w:spacing w:val="0"/>
-        </w:rPr>
-        <w:t xml:space="preserve"/>
-      </w:r>
-    </w:p>
-    <w:p>
-      <w:pPr/>
-      <w:r>
-        <w:rPr>
-          <w:rFonts w:ascii="Helvetica Neue" w:hAnsi="Helvetica Neue" w:cs="Helvetica Neue"/>
-          <w:sz w:val="22"/>
-          <w:sz-cs w:val="22"/>
-          <w:b/>
-          <w:spacing w:val="0"/>
-        </w:rPr>
-        <w:t xml:space="preserve">Strata</w:t>
-      </w:r>
-      <w:r>
-        <w:rPr>
-          <w:rFonts w:ascii="Helvetica Neue" w:hAnsi="Helvetica Neue" w:cs="Helvetica Neue"/>
-          <w:sz w:val="22"/>
-          <w:sz-cs w:val="22"/>
-          <w:spacing w:val="0"/>
-        </w:rPr>
-        <w:t xml:space="preserve"/>
-      </w:r>
-    </w:p>
-    <w:p>
-      <w:pPr/>
-      <w:r>
-        <w:rPr>
-          <w:rFonts w:ascii="Helvetica Neue" w:hAnsi="Helvetica Neue" w:cs="Helvetica Neue"/>
-          <w:sz w:val="22"/>
-          <w:sz-cs w:val="22"/>
-          <w:spacing w:val="0"/>
-        </w:rPr>
-        <w:t xml:space="preserve">Julia</w:t>
-      </w:r>
-      <w:r>
-        <w:rPr>
-          <w:rFonts w:ascii="Helvetica Neue" w:hAnsi="Helvetica Neue" w:cs="Helvetica Neue"/>
-          <w:sz w:val="22"/>
-          <w:sz-cs w:val="22"/>
-          <w:spacing w:val="0"/>
-        </w:rPr>
-        <w:t xml:space="preserve"/>
-      </w:r>
-    </w:p>
-    <w:p>
-      <w:pPr/>
-      <w:r>
-        <w:rPr>
-          <w:rFonts w:ascii="Helvetica Neue" w:hAnsi="Helvetica Neue" w:cs="Helvetica Neue"/>
-          <w:sz w:val="22"/>
-          <w:sz-cs w:val="22"/>
-          <w:spacing w:val="0"/>
-        </w:rPr>
-        <w:t xml:space="preserve">private, available on request</w:t>
-      </w:r>
-      <w:r>
-        <w:rPr>
-          <w:rFonts w:ascii="Helvetica Neue" w:hAnsi="Helvetica Neue" w:cs="Helvetica Neue"/>
-          <w:sz w:val="22"/>
-          <w:sz-cs w:val="22"/>
-          <w:spacing w:val="0"/>
-        </w:rPr>
-        <w:t xml:space="preserve"/>
-      </w:r>
-    </w:p>
-    <w:p>
-      <w:pPr/>
-      <w:r>
-        <w:rPr>
-          <w:rFonts w:ascii="Helvetica Neue" w:hAnsi="Helvetica Neue" w:cs="Helvetica Neue"/>
-          <w:sz w:val="22"/>
-          <w:sz-cs w:val="22"/>
-          <w:spacing w:val="0"/>
-        </w:rPr>
-        <w:t xml:space="preserve">The reading lane behind MECH.</w:t>
-      </w:r>
-      <w:r>
-        <w:rPr>
-          <w:rFonts w:ascii="Helvetica Neue" w:hAnsi="Helvetica Neue" w:cs="Helvetica Neue"/>
-          <w:sz w:val="22"/>
-          <w:sz-cs w:val="22"/>
-          <w:spacing w:val="0"/>
-        </w:rPr>
-        <w:t xml:space="preserve"/>
-      </w:r>
-    </w:p>
-    <w:p>
-      <w:pPr/>
-      <w:r>
-        <w:rPr>
-          <w:rFonts w:ascii="Helvetica Neue" w:hAnsi="Helvetica Neue" w:cs="Helvetica Neue"/>
-          <w:sz w:val="22"/>
-          <w:sz-cs w:val="22"/>
-          <w:b/>
-          <w:spacing w:val="0"/>
-        </w:rPr>
-        <w:t xml:space="preserve">AstralBrainEngine</w:t>
-      </w:r>
-      <w:r>
-        <w:rPr>
-          <w:rFonts w:ascii="Helvetica Neue" w:hAnsi="Helvetica Neue" w:cs="Helvetica Neue"/>
-          <w:sz w:val="22"/>
-          <w:sz-cs w:val="22"/>
-          <w:spacing w:val="0"/>
-        </w:rPr>
-        <w:t xml:space="preserve"/>
-      </w:r>
-    </w:p>
-    <w:p>
-      <w:pPr/>
-      <w:r>
-        <w:rPr>
-          <w:rFonts w:ascii="Helvetica Neue" w:hAnsi="Helvetica Neue" w:cs="Helvetica Neue"/>
-          <w:sz w:val="22"/>
-          <w:sz-cs w:val="22"/>
-          <w:spacing w:val="0"/>
-        </w:rPr>
-        <w:t xml:space="preserve">Python</w:t>
-      </w:r>
-      <w:r>
-        <w:rPr>
-          <w:rFonts w:ascii="Helvetica Neue" w:hAnsi="Helvetica Neue" w:cs="Helvetica Neue"/>
-          <w:sz w:val="22"/>
-          <w:sz-cs w:val="22"/>
-          <w:spacing w:val="0"/>
-        </w:rPr>
-        <w:t xml:space="preserve"/>
-      </w:r>
-    </w:p>
-    <w:p>
-      <w:pPr/>
-      <w:r>
-        <w:rPr>
-          <w:rFonts w:ascii="Helvetica Neue" w:hAnsi="Helvetica Neue" w:cs="Helvetica Neue"/>
-          <w:sz w:val="22"/>
-          <w:sz-cs w:val="22"/>
-          <w:spacing w:val="0"/>
-        </w:rPr>
-        <w:t xml:space="preserve">private, available on request</w:t>
-      </w:r>
-      <w:r>
-        <w:rPr>
-          <w:rFonts w:ascii="Helvetica Neue" w:hAnsi="Helvetica Neue" w:cs="Helvetica Neue"/>
-          <w:sz w:val="22"/>
-          <w:sz-cs w:val="22"/>
-          <w:spacing w:val="0"/>
-        </w:rPr>
-        <w:t xml:space="preserve"/>
-      </w:r>
-    </w:p>
-    <w:p>
-      <w:pPr/>
-      <w:r>
-        <w:rPr>
-          <w:rFonts w:ascii="Helvetica Neue" w:hAnsi="Helvetica Neue" w:cs="Helvetica Neue"/>
-          <w:sz w:val="22"/>
-          <w:sz-cs w:val="22"/>
-          <w:spacing w:val="0"/>
-        </w:rPr>
-        <w:t xml:space="preserve">The orchestration brain for the Astral ecosystem.</w:t>
-      </w:r>
-      <w:r>
-        <w:rPr>
-          <w:rFonts w:ascii="Helvetica Neue" w:hAnsi="Helvetica Neue" w:cs="Helvetica Neue"/>
-          <w:sz w:val="22"/>
-          <w:sz-cs w:val="22"/>
-          <w:spacing w:val="0"/>
-        </w:rPr>
-        <w:t xml:space="preserve"/>
-      </w:r>
-    </w:p>
-    <w:p>
-      <w:pPr/>
-      <w:r>
-        <w:rPr>
-          <w:rFonts w:ascii="Helvetica Neue" w:hAnsi="Helvetica Neue" w:cs="Helvetica Neue"/>
-          <w:sz w:val="22"/>
-          <w:sz-cs w:val="22"/>
-          <w:b/>
-          <w:spacing w:val="0"/>
-        </w:rPr>
-        <w:t xml:space="preserve">Tessera</w:t>
-      </w:r>
-      <w:r>
-        <w:rPr>
-          <w:rFonts w:ascii="Helvetica Neue" w:hAnsi="Helvetica Neue" w:cs="Helvetica Neue"/>
-          <w:sz w:val="22"/>
-          <w:sz-cs w:val="22"/>
-          <w:spacing w:val="0"/>
-        </w:rPr>
-        <w:t xml:space="preserve"/>
-      </w:r>
-    </w:p>
-    <w:p>
-      <w:pPr/>
-      <w:r>
-        <w:rPr>
-          <w:rFonts w:ascii="Helvetica Neue" w:hAnsi="Helvetica Neue" w:cs="Helvetica Neue"/>
-          <w:sz w:val="22"/>
-          <w:sz-cs w:val="22"/>
-          <w:spacing w:val="0"/>
-        </w:rPr>
-        <w:t xml:space="preserve">Python</w:t>
-      </w:r>
-      <w:r>
-        <w:rPr>
-          <w:rFonts w:ascii="Helvetica Neue" w:hAnsi="Helvetica Neue" w:cs="Helvetica Neue"/>
-          <w:sz w:val="22"/>
-          <w:sz-cs w:val="22"/>
-          <w:spacing w:val="0"/>
-        </w:rPr>
-        <w:t xml:space="preserve"/>
-      </w:r>
-    </w:p>
-    <w:p>
-      <w:pPr/>
-      <w:r>
-        <w:rPr>
-          <w:rFonts w:ascii="Helvetica Neue" w:hAnsi="Helvetica Neue" w:cs="Helvetica Neue"/>
-          <w:sz w:val="22"/>
-          <w:sz-cs w:val="22"/>
-          <w:spacing w:val="0"/>
-        </w:rPr>
-        <w:t xml:space="preserve">private, available on request</w:t>
-      </w:r>
-      <w:r>
-        <w:rPr>
-          <w:rFonts w:ascii="Helvetica Neue" w:hAnsi="Helvetica Neue" w:cs="Helvetica Neue"/>
-          <w:sz w:val="22"/>
-          <w:sz-cs w:val="22"/>
-          <w:spacing w:val="0"/>
-        </w:rPr>
-        <w:t xml:space="preserve"/>
-      </w:r>
-    </w:p>
-    <w:p>
-      <w:pPr/>
-      <w:r>
-        <w:rPr>
-          <w:rFonts w:ascii="Helvetica Neue" w:hAnsi="Helvetica Neue" w:cs="Helvetica Neue"/>
-          <w:sz w:val="22"/>
-          <w:sz-cs w:val="22"/>
-          <w:spacing w:val="0"/>
-        </w:rPr>
-        <w:t xml:space="preserve">3D models in, game-ready sprite sheets out. No image model in the path.</w:t>
-      </w:r>
-      <w:r>
-        <w:rPr>
-          <w:rFonts w:ascii="Helvetica Neue" w:hAnsi="Helvetica Neue" w:cs="Helvetica Neue"/>
-          <w:sz w:val="22"/>
-          <w:sz-cs w:val="22"/>
-          <w:spacing w:val="0"/>
-        </w:rPr>
-        <w:t xml:space="preserve"/>
-      </w:r>
-    </w:p>
-    <w:p>
-      <w:pPr/>
-      <w:r>
-        <w:rPr>
-          <w:rFonts w:ascii="Helvetica Neue" w:hAnsi="Helvetica Neue" w:cs="Helvetica Neue"/>
-          <w:sz w:val="22"/>
-          <w:sz-cs w:val="22"/>
-          <w:b/>
-          <w:spacing w:val="0"/>
-        </w:rPr>
-        <w:t xml:space="preserve">modly</w:t>
-      </w:r>
-      <w:r>
-        <w:rPr>
-          <w:rFonts w:ascii="Helvetica Neue" w:hAnsi="Helvetica Neue" w:cs="Helvetica Neue"/>
-          <w:sz w:val="22"/>
-          <w:sz-cs w:val="22"/>
-          <w:spacing w:val="0"/>
-        </w:rPr>
-        <w:t xml:space="preserve"/>
-      </w:r>
-    </w:p>
-    <w:p>
-      <w:pPr/>
-      <w:r>
-        <w:rPr>
-          <w:rFonts w:ascii="Helvetica Neue" w:hAnsi="Helvetica Neue" w:cs="Helvetica Neue"/>
-          <w:sz w:val="22"/>
-          <w:sz-cs w:val="22"/>
-          <w:spacing w:val="0"/>
-        </w:rPr>
-        <w:t xml:space="preserve">TypeScript</w:t>
-      </w:r>
-      <w:r>
-        <w:rPr>
-          <w:rFonts w:ascii="Helvetica Neue" w:hAnsi="Helvetica Neue" w:cs="Helvetica Neue"/>
-          <w:sz w:val="22"/>
-          <w:sz-cs w:val="22"/>
-          <w:spacing w:val="0"/>
-        </w:rPr>
-        <w:t xml:space="preserve"/>
-      </w:r>
-    </w:p>
-    <w:p>
-      <w:pPr/>
-      <w:r>
-        <w:rPr>
-          <w:rFonts w:ascii="Helvetica Neue" w:hAnsi="Helvetica Neue" w:cs="Helvetica Neue"/>
-          <w:sz w:val="22"/>
-          <w:sz-cs w:val="22"/>
-          <w:spacing w:val="0"/>
-        </w:rPr>
-        <w:t xml:space="preserve">private, available on request</w:t>
-      </w:r>
-      <w:r>
-        <w:rPr>
-          <w:rFonts w:ascii="Helvetica Neue" w:hAnsi="Helvetica Neue" w:cs="Helvetica Neue"/>
-          <w:sz w:val="22"/>
-          <w:sz-cs w:val="22"/>
-          <w:spacing w:val="0"/>
-        </w:rPr>
-        <w:t xml:space="preserve"/>
-      </w:r>
-    </w:p>
-    <w:p>
-      <w:pPr/>
-      <w:r>
-        <w:rPr>
-          <w:rFonts w:ascii="Helvetica Neue" w:hAnsi="Helvetica Neue" w:cs="Helvetica Neue"/>
-          <w:sz w:val="22"/>
-          <w:sz-cs w:val="22"/>
-          <w:spacing w:val="0"/>
-        </w:rPr>
-        <w:t xml:space="preserve">Desktop app that builds 3D models from images on your own GPU, with nothing leaving the machine.</w:t>
-      </w:r>
-      <w:r>
-        <w:rPr>
-          <w:rFonts w:ascii="Helvetica Neue" w:hAnsi="Helvetica Neue" w:cs="Helvetica Neue"/>
-          <w:sz w:val="22"/>
-          <w:sz-cs w:val="22"/>
-          <w:spacing w:val="0"/>
-        </w:rPr>
-        <w:t xml:space="preserve"/>
-      </w:r>
-    </w:p>
-    <w:p>
-      <w:pPr/>
-      <w:r>
-        <w:rPr>
-          <w:rFonts w:ascii="Helvetica Neue" w:hAnsi="Helvetica Neue" w:cs="Helvetica Neue"/>
-          <w:sz w:val="22"/>
-          <w:sz-cs w:val="22"/>
-          <w:b/>
-          <w:spacing w:val="0"/>
-        </w:rPr>
-        <w:t xml:space="preserve">DemoGraph</w:t>
-      </w:r>
-      <w:r>
-        <w:rPr>
-          <w:rFonts w:ascii="Helvetica Neue" w:hAnsi="Helvetica Neue" w:cs="Helvetica Neue"/>
-          <w:sz w:val="22"/>
-          <w:sz-cs w:val="22"/>
-          <w:spacing w:val="0"/>
-        </w:rPr>
-        <w:t xml:space="preserve"/>
-      </w:r>
-    </w:p>
-    <w:p>
-      <w:pPr/>
-      <w:r>
-        <w:rPr>
-          <w:rFonts w:ascii="Helvetica Neue" w:hAnsi="Helvetica Neue" w:cs="Helvetica Neue"/>
-          <w:sz w:val="22"/>
-          <w:sz-cs w:val="22"/>
-          <w:spacing w:val="0"/>
-        </w:rPr>
-        <w:t xml:space="preserve">Rust</w:t>
-      </w:r>
-      <w:r>
-        <w:rPr>
-          <w:rFonts w:ascii="Helvetica Neue" w:hAnsi="Helvetica Neue" w:cs="Helvetica Neue"/>
-          <w:sz w:val="22"/>
-          <w:sz-cs w:val="22"/>
-          <w:spacing w:val="0"/>
-        </w:rPr>
-        <w:t xml:space="preserve"/>
-      </w:r>
-    </w:p>
-    <w:p>
-      <w:pPr/>
-      <w:r>
-        <w:rPr>
-          <w:rFonts w:ascii="Helvetica Neue" w:hAnsi="Helvetica Neue" w:cs="Helvetica Neue"/>
-          <w:sz w:val="22"/>
-          <w:sz-cs w:val="22"/>
-          <w:spacing w:val="0"/>
-        </w:rPr>
-        <w:t xml:space="preserve">private, available on request</w:t>
-      </w:r>
-      <w:r>
-        <w:rPr>
-          <w:rFonts w:ascii="Helvetica Neue" w:hAnsi="Helvetica Neue" w:cs="Helvetica Neue"/>
-          <w:sz w:val="22"/>
-          <w:sz-cs w:val="22"/>
-          <w:spacing w:val="0"/>
-        </w:rPr>
-        <w:t xml:space="preserve"/>
-      </w:r>
-    </w:p>
-    <w:p>
-      <w:pPr/>
-      <w:r>
-        <w:rPr>
-          <w:rFonts w:ascii="Helvetica Neue" w:hAnsi="Helvetica Neue" w:cs="Helvetica Neue"/>
-          <w:sz w:val="22"/>
-          <w:sz-cs w:val="22"/>
-          <w:spacing w:val="0"/>
-        </w:rPr>
-        <w:t xml:space="preserve">Rust systems work.</w:t>
-      </w:r>
-      <w:r>
-        <w:rPr>
-          <w:rFonts w:ascii="Helvetica Neue" w:hAnsi="Helvetica Neue" w:cs="Helvetica Neue"/>
-          <w:sz w:val="22"/>
-          <w:sz-cs w:val="22"/>
-          <w:spacing w:val="0"/>
-        </w:rPr>
-        <w:t xml:space="preserve"/>
-      </w:r>
-    </w:p>
-    <w:p>
-      <w:pPr/>
-      <w:r>
-        <w:rPr>
-          <w:rFonts w:ascii="Helvetica Neue" w:hAnsi="Helvetica Neue" w:cs="Helvetica Neue"/>
-          <w:sz w:val="22"/>
-          <w:sz-cs w:val="22"/>
-          <w:b/>
-          <w:spacing w:val="0"/>
-        </w:rPr>
-        <w:t xml:space="preserve">QNX</w:t>
-      </w:r>
-      <w:r>
-        <w:rPr>
-          <w:rFonts w:ascii="Helvetica Neue" w:hAnsi="Helvetica Neue" w:cs="Helvetica Neue"/>
-          <w:sz w:val="22"/>
-          <w:sz-cs w:val="22"/>
-          <w:spacing w:val="0"/>
-        </w:rPr>
-        <w:t xml:space="preserve"/>
-      </w:r>
-    </w:p>
-    <w:p>
-      <w:pPr/>
-      <w:r>
-        <w:rPr>
-          <w:rFonts w:ascii="Helvetica Neue" w:hAnsi="Helvetica Neue" w:cs="Helvetica Neue"/>
-          <w:sz w:val="22"/>
-          <w:sz-cs w:val="22"/>
-          <w:spacing w:val="0"/>
-        </w:rPr>
-        <w:t xml:space="preserve">C++</w:t>
-      </w:r>
-      <w:r>
-        <w:rPr>
-          <w:rFonts w:ascii="Helvetica Neue" w:hAnsi="Helvetica Neue" w:cs="Helvetica Neue"/>
-          <w:sz w:val="22"/>
-          <w:sz-cs w:val="22"/>
-          <w:spacing w:val="0"/>
-        </w:rPr>
-        <w:t xml:space="preserve"/>
-      </w:r>
-    </w:p>
-    <w:p>
-      <w:pPr/>
-      <w:r>
-        <w:rPr>
-          <w:rFonts w:ascii="Helvetica Neue" w:hAnsi="Helvetica Neue" w:cs="Helvetica Neue"/>
-          <w:sz w:val="22"/>
-          <w:sz-cs w:val="22"/>
-          <w:spacing w:val="0"/>
-        </w:rPr>
-        <w:t xml:space="preserve">public</w:t>
-      </w:r>
-      <w:r>
-        <w:rPr>
-          <w:rFonts w:ascii="Helvetica Neue" w:hAnsi="Helvetica Neue" w:cs="Helvetica Neue"/>
-          <w:sz w:val="22"/>
-          <w:sz-cs w:val="22"/>
-          <w:spacing w:val="0"/>
-        </w:rPr>
-        <w:t xml:space="preserve"/>
-      </w:r>
-    </w:p>
-    <w:p>
-      <w:pPr/>
-      <w:r>
-        <w:rPr>
-          <w:rFonts w:ascii="Helvetica Neue" w:hAnsi="Helvetica Neue" w:cs="Helvetica Neue"/>
-          <w:sz w:val="22"/>
-          <w:sz-cs w:val="22"/>
-          <w:spacing w:val="0"/>
-        </w:rPr>
-        <w:t xml:space="preserve">Custom firmware launcher work for the Nintendo Switch, in the Atmosphère ecosystem. Systems-level C++.</w:t>
-      </w:r>
-      <w:r>
-        <w:rPr>
-          <w:rFonts w:ascii="Helvetica Neue" w:hAnsi="Helvetica Neue" w:cs="Helvetica Neue"/>
-          <w:sz w:val="22"/>
-          <w:sz-cs w:val="22"/>
-          <w:spacing w:val="0"/>
-        </w:rPr>
-        <w:t xml:space="preserve"/>
-      </w:r>
-    </w:p>
-    <w:p>
-      <w:pPr/>
-      <w:r>
-        <w:rPr>
-          <w:rFonts w:ascii="Menlo" w:hAnsi="Menlo" w:cs="Menlo"/>
-          <w:sz w:val="19"/>
-          <w:sz-cs w:val="19"/>
-          <w:spacing w:val="0"/>
-          <w:color w:val="114A58"/>
-        </w:rPr>
-        <w:t xml:space="preserve">https://github.com/Jmesmykil/QNX</w:t>
-      </w:r>
-      <w:r>
-        <w:rPr>
-          <w:rFonts w:ascii="Helvetica Neue" w:hAnsi="Helvetica Neue" w:cs="Helvetica Neue"/>
-          <w:sz w:val="22"/>
-          <w:sz-cs w:val="22"/>
-          <w:spacing w:val="0"/>
-        </w:rPr>
-        <w:t xml:space="preserve"/>
-      </w:r>
-    </w:p>
-    <w:p>
-      <w:pPr/>
-      <w:r>
-        <w:rPr>
-          <w:rFonts w:ascii="Helvetica Neue" w:hAnsi="Helvetica Neue" w:cs="Helvetica Neue"/>
-          <w:sz w:val="22"/>
-          <w:sz-cs w:val="22"/>
-          <w:b/>
-          <w:spacing w:val="0"/>
-        </w:rPr>
-        <w:t xml:space="preserve">SlimeShot-Unity</w:t>
-      </w:r>
-      <w:r>
-        <w:rPr>
-          <w:rFonts w:ascii="Helvetica Neue" w:hAnsi="Helvetica Neue" w:cs="Helvetica Neue"/>
-          <w:sz w:val="22"/>
-          <w:sz-cs w:val="22"/>
-          <w:spacing w:val="0"/>
-        </w:rPr>
-        <w:t xml:space="preserve"/>
-      </w:r>
-    </w:p>
-    <w:p>
-      <w:pPr/>
-      <w:r>
-        <w:rPr>
-          <w:rFonts w:ascii="Helvetica Neue" w:hAnsi="Helvetica Neue" w:cs="Helvetica Neue"/>
-          <w:sz w:val="22"/>
-          <w:sz-cs w:val="22"/>
-          <w:spacing w:val="0"/>
-        </w:rPr>
-        <w:t xml:space="preserve">C#</w:t>
-      </w:r>
-      <w:r>
-        <w:rPr>
-          <w:rFonts w:ascii="Helvetica Neue" w:hAnsi="Helvetica Neue" w:cs="Helvetica Neue"/>
-          <w:sz w:val="22"/>
-          <w:sz-cs w:val="22"/>
-          <w:spacing w:val="0"/>
-        </w:rPr>
-        <w:t xml:space="preserve"/>
-      </w:r>
-    </w:p>
-    <w:p>
-      <w:pPr/>
-      <w:r>
-        <w:rPr>
-          <w:rFonts w:ascii="Helvetica Neue" w:hAnsi="Helvetica Neue" w:cs="Helvetica Neue"/>
-          <w:sz w:val="22"/>
-          <w:sz-cs w:val="22"/>
-          <w:spacing w:val="0"/>
-        </w:rPr>
-        <w:t xml:space="preserve">private, available on request</w:t>
-      </w:r>
-      <w:r>
-        <w:rPr>
-          <w:rFonts w:ascii="Helvetica Neue" w:hAnsi="Helvetica Neue" w:cs="Helvetica Neue"/>
-          <w:sz w:val="22"/>
-          <w:sz-cs w:val="22"/>
-          <w:spacing w:val="0"/>
-        </w:rPr>
-        <w:t xml:space="preserve"/>
-      </w:r>
-    </w:p>
-    <w:p>
-      <w:pPr/>
-      <w:r>
-        <w:rPr>
-          <w:rFonts w:ascii="Helvetica Neue" w:hAnsi="Helvetica Neue" w:cs="Helvetica Neue"/>
-          <w:sz w:val="22"/>
-          <w:sz-cs w:val="22"/>
-          <w:spacing w:val="0"/>
-        </w:rPr>
-        <w:t xml:space="preserve">A game in production. Physics and rendering.</w:t>
-      </w:r>
-      <w:r>
-        <w:rPr>
-          <w:rFonts w:ascii="Helvetica Neue" w:hAnsi="Helvetica Neue" w:cs="Helvetica Neue"/>
-          <w:sz w:val="22"/>
-          <w:sz-cs w:val="22"/>
-          <w:spacing w:val="0"/>
-        </w:rPr>
-        <w:t xml:space="preserve"/>
-      </w:r>
-    </w:p>
-    <w:p>
-      <w:pPr/>
-      <w:r>
-        <w:rPr>
-          <w:rFonts w:ascii="Helvetica Neue" w:hAnsi="Helvetica Neue" w:cs="Helvetica Neue"/>
-          <w:sz w:val="22"/>
-          <w:sz-cs w:val="22"/>
-          <w:b/>
-          <w:spacing w:val="0"/>
-        </w:rPr>
-        <w:t xml:space="preserve">soloDOLO</w:t>
-      </w:r>
-      <w:r>
-        <w:rPr>
-          <w:rFonts w:ascii="Helvetica Neue" w:hAnsi="Helvetica Neue" w:cs="Helvetica Neue"/>
-          <w:sz w:val="22"/>
-          <w:sz-cs w:val="22"/>
-          <w:spacing w:val="0"/>
-        </w:rPr>
-        <w:t xml:space="preserve"/>
-      </w:r>
-    </w:p>
-    <w:p>
-      <w:pPr/>
-      <w:r>
-        <w:rPr>
-          <w:rFonts w:ascii="Helvetica Neue" w:hAnsi="Helvetica Neue" w:cs="Helvetica Neue"/>
-          <w:sz w:val="22"/>
-          <w:sz-cs w:val="22"/>
-          <w:spacing w:val="0"/>
-        </w:rPr>
-        <w:t xml:space="preserve">Python</w:t>
-      </w:r>
-      <w:r>
-        <w:rPr>
-          <w:rFonts w:ascii="Helvetica Neue" w:hAnsi="Helvetica Neue" w:cs="Helvetica Neue"/>
-          <w:sz w:val="22"/>
-          <w:sz-cs w:val="22"/>
-          <w:spacing w:val="0"/>
-        </w:rPr>
-        <w:t xml:space="preserve"/>
-      </w:r>
-    </w:p>
-    <w:p>
-      <w:pPr/>
-      <w:r>
-        <w:rPr>
-          <w:rFonts w:ascii="Helvetica Neue" w:hAnsi="Helvetica Neue" w:cs="Helvetica Neue"/>
-          <w:sz w:val="22"/>
-          <w:sz-cs w:val="22"/>
-          <w:spacing w:val="0"/>
-        </w:rPr>
-        <w:t xml:space="preserve">private, available on request</w:t>
-      </w:r>
-      <w:r>
-        <w:rPr>
-          <w:rFonts w:ascii="Helvetica Neue" w:hAnsi="Helvetica Neue" w:cs="Helvetica Neue"/>
-          <w:sz w:val="22"/>
-          <w:sz-cs w:val="22"/>
-          <w:spacing w:val="0"/>
-        </w:rPr>
-        <w:t xml:space="preserve"/>
-      </w:r>
-    </w:p>
-    <w:p>
-      <w:pPr/>
-      <w:r>
-        <w:rPr>
-          <w:rFonts w:ascii="Helvetica Neue" w:hAnsi="Helvetica Neue" w:cs="Helvetica Neue"/>
-          <w:sz w:val="22"/>
-          <w:sz-cs w:val="22"/>
-          <w:spacing w:val="0"/>
-        </w:rPr>
-        <w:t xml:space="preserve">An animated series in production. Rigging and tooling.</w:t>
-      </w:r>
-      <w:r>
-        <w:rPr>
-          <w:rFonts w:ascii="Helvetica Neue" w:hAnsi="Helvetica Neue" w:cs="Helvetica Neue"/>
-          <w:sz w:val="22"/>
-          <w:sz-cs w:val="22"/>
-          <w:spacing w:val="0"/>
-        </w:rPr>
-        <w:t xml:space="preserve"/>
-      </w:r>
-    </w:p>
-    <w:p>
-      <w:pPr/>
-      <w:r>
-        <w:rPr>
-          <w:rFonts w:ascii="Helvetica Neue" w:hAnsi="Helvetica Neue" w:cs="Helvetica Neue"/>
-          <w:sz w:val="22"/>
-          <w:sz-cs w:val="22"/>
-          <w:b/>
-          <w:spacing w:val="0"/>
-        </w:rPr>
-        <w:t xml:space="preserve">VoidIDE, AstralWorkspace, AstralEngineKit, BrainManager</w:t>
-      </w:r>
-      <w:r>
-        <w:rPr>
-          <w:rFonts w:ascii="Helvetica Neue" w:hAnsi="Helvetica Neue" w:cs="Helvetica Neue"/>
-          <w:sz w:val="22"/>
-          <w:sz-cs w:val="22"/>
-          <w:spacing w:val="0"/>
-        </w:rPr>
-        <w:t xml:space="preserve"/>
-      </w:r>
-    </w:p>
-    <w:p>
-      <w:pPr/>
-      <w:r>
-        <w:rPr>
-          <w:rFonts w:ascii="Helvetica Neue" w:hAnsi="Helvetica Neue" w:cs="Helvetica Neue"/>
-          <w:sz w:val="22"/>
-          <w:sz-cs w:val="22"/>
-          <w:spacing w:val="0"/>
-        </w:rPr>
-        <w:t xml:space="preserve">Swift</w:t>
-      </w:r>
-      <w:r>
-        <w:rPr>
-          <w:rFonts w:ascii="Helvetica Neue" w:hAnsi="Helvetica Neue" w:cs="Helvetica Neue"/>
-          <w:sz w:val="22"/>
-          <w:sz-cs w:val="22"/>
-          <w:spacing w:val="0"/>
-        </w:rPr>
-        <w:t xml:space="preserve"/>
-      </w:r>
-    </w:p>
-    <w:p>
-      <w:pPr/>
-      <w:r>
-        <w:rPr>
-          <w:rFonts w:ascii="Helvetica Neue" w:hAnsi="Helvetica Neue" w:cs="Helvetica Neue"/>
-          <w:sz w:val="22"/>
-          <w:sz-cs w:val="22"/>
-          <w:spacing w:val="0"/>
-        </w:rPr>
-        <w:t xml:space="preserve">private, available on request</w:t>
-      </w:r>
-      <w:r>
-        <w:rPr>
-          <w:rFonts w:ascii="Helvetica Neue" w:hAnsi="Helvetica Neue" w:cs="Helvetica Neue"/>
-          <w:sz w:val="22"/>
-          <w:sz-cs w:val="22"/>
-          <w:spacing w:val="0"/>
-        </w:rPr>
-        <w:t xml:space="preserve"/>
-      </w:r>
-    </w:p>
-    <w:p>
-      <w:pPr/>
-      <w:r>
-        <w:rPr>
-          <w:rFonts w:ascii="Helvetica Neue" w:hAnsi="Helvetica Neue" w:cs="Helvetica Neue"/>
-          <w:sz w:val="22"/>
-          <w:sz-cs w:val="22"/>
-          <w:spacing w:val="0"/>
-        </w:rPr>
-        <w:t xml:space="preserve">The macOS applications around the engine.</w:t>
-      </w:r>
-      <w:r>
-        <w:rPr>
-          <w:rFonts w:ascii="Helvetica Neue" w:hAnsi="Helvetica Neue" w:cs="Helvetica Neue"/>
-          <w:sz w:val="22"/>
-          <w:sz-cs w:val="22"/>
+          <w:sz w:val="20"/>
+          <w:sz-cs w:val="20"/>
           <w:spacing w:val="0"/>
         </w:rPr>
         <w:t xml:space="preserve"/>
@@ -9402,7 +9753,7 @@
           <w:sz-cs w:val="23"/>
           <w:spacing w:val="0"/>
         </w:rPr>
-        <w:t xml:space="preserve"> I build local-first, with no cloud in the path unless I choose to put it there, and I ship tools other people use. Slate is the clearest case: the same Julia lane serves my comprehension research on a workstation and answers arithmetic on a Raspberry Pi.</w:t>
+        <w:t xml:space="preserve"> I build local first, with no cloud in the path unless I choose to put it there, and I ship tools other people use. Counts above are commit counts, and repositories I forked from other authors are left out on purpose.</w:t>
       </w:r>
     </w:p>
     <w:p>

</xml_diff>